<commit_message>
docs: panduan pengguna menyesuaikan unggah foto destinasi
Panduan masih menyuruh pengelola menempel URL gambar — tabel kolom Destinasi
di bagian 6.5 dan 7.2 diperbarui, ditambah cara mengunggah (ganti vs tambah,
syarat gambar dan batas 10 MB, dan bahwa mengunggah saja belum menyimpan).

Bagian pemecahan masalah dapat subbab baru untuk pengelola dan admin. Yang
paling berguna di situ adalah membedakan "berkasku ditolak" dari "semua foto
ditolak" — yang kedua bukan masalah berkasnya, dan pengelola perlu tahu bahwa
itu harus dilaporkan ke admin, bukan dicoba-coba sendiri.

Kedua berkas .docx dibuat ulang dari Markdown-nya. Resep pandoc di manual
teknis digeneralisir supaya menutup dua dokumen sekaligus, beserta cara
memeriksa hasilnya: jumlah gaya paragraf boleh berubah, daftar nama gayanya
tidak — kalau ada yang hilang atau muncul baru, acuan gayanya tidak terpakai.
</commit_message>
<xml_diff>
--- a/docs/Manual-Teknis-Nusa.docx
+++ b/docs/Manual-Teknis-Nusa.docx
@@ -20395,13 +20395,13 @@
         <w:pStyle w:val="FirstParagraph"/>
       </w:pPr>
       <w:r>
-        <w:t xml:space="preserve">Versi Word dokumen ini dihasilkan dari berkas Markdown-nya dengan Pandoc,</w:t>
-      </w:r>
-      <w:r>
-        <w:t xml:space="preserve"> </w:t>
-      </w:r>
-      <w:r>
-        <w:t xml:space="preserve">memakai</w:t>
+        <w:t xml:space="preserve">Versi Word dari dokumen ini dan dari Panduan Pengguna dihasilkan dari berkas</w:t>
+      </w:r>
+      <w:r>
+        <w:t xml:space="preserve"> </w:t>
+      </w:r>
+      <w:r>
+        <w:t xml:space="preserve">Markdown-nya dengan Pandoc, memakai</w:t>
       </w:r>
       <w:r>
         <w:t xml:space="preserve"> </w:t>
@@ -20416,19 +20416,25 @@
         <w:t xml:space="preserve"> </w:t>
       </w:r>
       <w:r>
-        <w:t xml:space="preserve">yang sudah ada sebagai acuan gaya — di situlah huruf, warna,</w:t>
-      </w:r>
-      <w:r>
-        <w:t xml:space="preserve"> </w:t>
-      </w:r>
-      <w:r>
-        <w:t xml:space="preserve">dan nomor halaman di footer tersimpan. Judul dan daftar isi diambil dari</w:t>
-      </w:r>
-      <w:r>
-        <w:t xml:space="preserve"> </w:t>
-      </w:r>
-      <w:r>
-        <w:t xml:space="preserve">metadata, jadi keduanya dibuang dulu dari salinan sementara berkas Markdown-nya:</w:t>
+        <w:t xml:space="preserve">yang sudah ada sebagai acuan gaya —</w:t>
+      </w:r>
+      <w:r>
+        <w:t xml:space="preserve"> </w:t>
+      </w:r>
+      <w:r>
+        <w:t xml:space="preserve">di situlah huruf, warna, tema, dan nomor halaman di footer tersimpan. Judul dan</w:t>
+      </w:r>
+      <w:r>
+        <w:t xml:space="preserve"> </w:t>
+      </w:r>
+      <w:r>
+        <w:t xml:space="preserve">daftar isi diambil dari metadata, jadi keduanya dibuang dulu dari salinan</w:t>
+      </w:r>
+      <w:r>
+        <w:t xml:space="preserve"> </w:t>
+      </w:r>
+      <w:r>
+        <w:t xml:space="preserve">sementara berkas Markdown-nya.</w:t>
       </w:r>
     </w:p>
     <w:p>
@@ -20439,13 +20445,70 @@
         <w:rPr>
           <w:rStyle w:val="CommentTok"/>
         </w:rPr>
-        <w:t xml:space="preserve"># Buang judul H1 dan blok "Daftar Isi" (Word memakai field TOC yang bisa disegarkan)</w:t>
+        <w:t xml:space="preserve"># 1. Buang judul H1 dan blok "Daftar Isi"</w:t>
       </w:r>
       <w:r>
         <w:br/>
       </w:r>
       <w:r>
         <w:rPr>
+          <w:rStyle w:val="CommentTok"/>
+        </w:rPr>
+        <w:t xml:space="preserve">#    (Word memakai field TOC-nya sendiri yang bisa disegarkan)</w:t>
+      </w:r>
+      <w:r>
+        <w:br/>
+      </w:r>
+      <w:r>
+        <w:rPr>
+          <w:rStyle w:val="VariableTok"/>
+        </w:rPr>
+        <w:t xml:space="preserve">DOK</w:t>
+      </w:r>
+      <w:r>
+        <w:rPr>
+          <w:rStyle w:val="OperatorTok"/>
+        </w:rPr>
+        <w:t xml:space="preserve">=</w:t>
+      </w:r>
+      <w:r>
+        <w:rPr>
+          <w:rStyle w:val="NormalTok"/>
+        </w:rPr>
+        <w:t xml:space="preserve">manual-teknis          </w:t>
+      </w:r>
+      <w:r>
+        <w:rPr>
+          <w:rStyle w:val="CommentTok"/>
+        </w:rPr>
+        <w:t xml:space="preserve"># atau: panduan-pengguna</w:t>
+      </w:r>
+      <w:r>
+        <w:br/>
+      </w:r>
+      <w:r>
+        <w:rPr>
+          <w:rStyle w:val="VariableTok"/>
+        </w:rPr>
+        <w:t xml:space="preserve">JUDUL</w:t>
+      </w:r>
+      <w:r>
+        <w:rPr>
+          <w:rStyle w:val="OperatorTok"/>
+        </w:rPr>
+        <w:t xml:space="preserve">=</w:t>
+      </w:r>
+      <w:r>
+        <w:rPr>
+          <w:rStyle w:val="StringTok"/>
+        </w:rPr>
+        <w:t xml:space="preserve">"Manual Teknis — Nusa"</w:t>
+      </w:r>
+      <w:r>
+        <w:br/>
+      </w:r>
+      <w:r>
+        <w:rPr>
           <w:rStyle w:val="ExtensionTok"/>
         </w:rPr>
         <w:t xml:space="preserve">python3</w:t>
@@ -20470,6 +20533,54 @@
       </w:r>
       <w:r>
         <w:rPr>
+          <w:rStyle w:val="StringTok"/>
+        </w:rPr>
+        <w:t xml:space="preserve">"</w:t>
+      </w:r>
+      <w:r>
+        <w:rPr>
+          <w:rStyle w:val="VariableTok"/>
+        </w:rPr>
+        <w:t xml:space="preserve">$DOK</w:t>
+      </w:r>
+      <w:r>
+        <w:rPr>
+          <w:rStyle w:val="StringTok"/>
+        </w:rPr>
+        <w:t xml:space="preserve">"</w:t>
+      </w:r>
+      <w:r>
+        <w:rPr>
+          <w:rStyle w:val="NormalTok"/>
+        </w:rPr>
+        <w:t xml:space="preserve"> </w:t>
+      </w:r>
+      <w:r>
+        <w:rPr>
+          <w:rStyle w:val="StringTok"/>
+        </w:rPr>
+        <w:t xml:space="preserve">"</w:t>
+      </w:r>
+      <w:r>
+        <w:rPr>
+          <w:rStyle w:val="VariableTok"/>
+        </w:rPr>
+        <w:t xml:space="preserve">$JUDUL</w:t>
+      </w:r>
+      <w:r>
+        <w:rPr>
+          <w:rStyle w:val="StringTok"/>
+        </w:rPr>
+        <w:t xml:space="preserve">"</w:t>
+      </w:r>
+      <w:r>
+        <w:rPr>
+          <w:rStyle w:val="NormalTok"/>
+        </w:rPr>
+        <w:t xml:space="preserve"> </w:t>
+      </w:r>
+      <w:r>
+        <w:rPr>
           <w:rStyle w:val="OperatorTok"/>
         </w:rPr>
         <w:t xml:space="preserve">&lt;&lt;'EOF'</w:t>
@@ -20481,7 +20592,7 @@
         <w:rPr>
           <w:rStyle w:val="StringTok"/>
         </w:rPr>
-        <w:t xml:space="preserve">import re</w:t>
+        <w:t xml:space="preserve">import re, sys</w:t>
       </w:r>
       <w:r>
         <w:br/>
@@ -20490,7 +20601,7 @@
         <w:rPr>
           <w:rStyle w:val="StringTok"/>
         </w:rPr>
-        <w:t xml:space="preserve">s = open('docs/manual-teknis.md').read()</w:t>
+        <w:t xml:space="preserve">dok, judul = sys.argv[1], sys.argv[2]</w:t>
       </w:r>
       <w:r>
         <w:br/>
@@ -20499,7 +20610,7 @@
         <w:rPr>
           <w:rStyle w:val="StringTok"/>
         </w:rPr>
-        <w:t xml:space="preserve">s = re.sub(r'\A# Manual Teknis — Nusa\n+', '', s, count=1)</w:t>
+        <w:t xml:space="preserve">s = open(f'docs/{dok}.md').read()</w:t>
       </w:r>
       <w:r>
         <w:br/>
@@ -20508,6 +20619,15 @@
         <w:rPr>
           <w:rStyle w:val="StringTok"/>
         </w:rPr>
+        <w:t xml:space="preserve">s = re.sub(rf'\A# {re.escape(judul)}\n+', '', s, count=1)</w:t>
+      </w:r>
+      <w:r>
+        <w:br/>
+      </w:r>
+      <w:r>
+        <w:rPr>
+          <w:rStyle w:val="StringTok"/>
+        </w:rPr>
         <w:t xml:space="preserve">s = re.sub(r'## Daftar Isi\n.*?\n---\n\n', '', s, count=1, flags=re.S)</w:t>
       </w:r>
       <w:r>
@@ -20517,7 +20637,7 @@
         <w:rPr>
           <w:rStyle w:val="StringTok"/>
         </w:rPr>
-        <w:t xml:space="preserve">open('/tmp/manual-untuk-docx.md', 'w').write(s)</w:t>
+        <w:t xml:space="preserve">open(f'/tmp/{dok}-untuk-docx.md', 'w').write(s)</w:t>
       </w:r>
       <w:r>
         <w:br/>
@@ -20536,6 +20656,15 @@
       </w:r>
       <w:r>
         <w:rPr>
+          <w:rStyle w:val="CommentTok"/>
+        </w:rPr>
+        <w:t xml:space="preserve"># 2. Salin .docx lama sebagai acuan gaya, lalu tulis ulang di tempatnya</w:t>
+      </w:r>
+      <w:r>
+        <w:br/>
+      </w:r>
+      <w:r>
+        <w:rPr>
           <w:rStyle w:val="FunctionTok"/>
         </w:rPr>
         <w:t xml:space="preserve">cp</w:t>
@@ -20559,7 +20688,7 @@
         <w:rPr>
           <w:rStyle w:val="NormalTok"/>
         </w:rPr>
-        <w:t xml:space="preserve"> /tmp/manual-untuk-docx.md </w:t>
+        <w:t xml:space="preserve"> /tmp/manual-teknis-untuk-docx.md </w:t>
       </w:r>
       <w:r>
         <w:rPr>
@@ -20799,6 +20928,50 @@
     <w:p>
       <w:pPr>
         <w:pStyle w:val="FirstParagraph"/>
+      </w:pPr>
+      <w:r>
+        <w:t xml:space="preserve">Panduan Pengguna memakai perintah yang sama dengan tiga nilai berbeda:</w:t>
+      </w:r>
+      <w:r>
+        <w:t xml:space="preserve"> </w:t>
+      </w:r>
+      <w:r>
+        <w:rPr>
+          <w:rStyle w:val="VerbatimChar"/>
+        </w:rPr>
+        <w:t xml:space="preserve">--toc-depth=3</w:t>
+      </w:r>
+      <w:r>
+        <w:t xml:space="preserve">,</w:t>
+      </w:r>
+      <w:r>
+        <w:t xml:space="preserve"> </w:t>
+      </w:r>
+      <w:r>
+        <w:rPr>
+          <w:rStyle w:val="VerbatimChar"/>
+        </w:rPr>
+        <w:t xml:space="preserve">title="Panduan Pengguna — Nusa"</w:t>
+      </w:r>
+      <w:r>
+        <w:t xml:space="preserve">, dan</w:t>
+      </w:r>
+      <w:r>
+        <w:t xml:space="preserve"> </w:t>
+      </w:r>
+      <w:r>
+        <w:rPr>
+          <w:rStyle w:val="VerbatimChar"/>
+        </w:rPr>
+        <w:t xml:space="preserve">subtitle="Guide Book · Sistem OTA Nusa"</w:t>
+      </w:r>
+      <w:r>
+        <w:t xml:space="preserve">.</w:t>
+      </w:r>
+    </w:p>
+    <w:p>
+      <w:pPr>
+        <w:pStyle w:val="BodyText"/>
       </w:pPr>
       <w:r>
         <w:t xml:space="preserve">Daftar isinya berupa</w:t>
@@ -20830,6 +21003,386 @@
       </w:r>
       <w:r>
         <w:t xml:space="preserve">nomor halamannya kosong.</w:t>
+      </w:r>
+    </w:p>
+    <w:p>
+      <w:pPr>
+        <w:pStyle w:val="BodyText"/>
+      </w:pPr>
+      <w:r>
+        <w:t xml:space="preserve">Setelah membuat ulang, bandingkan gaya paragraf yang dipakai berkas lama dan</w:t>
+      </w:r>
+      <w:r>
+        <w:t xml:space="preserve"> </w:t>
+      </w:r>
+      <w:r>
+        <w:t xml:space="preserve">baru; jumlahnya boleh berubah, tetapi</w:t>
+      </w:r>
+      <w:r>
+        <w:t xml:space="preserve"> </w:t>
+      </w:r>
+      <w:r>
+        <w:rPr>
+          <w:b/>
+          <w:bCs/>
+        </w:rPr>
+        <w:t xml:space="preserve">daftar nama gayanya tidak boleh</w:t>
+      </w:r>
+      <w:r>
+        <w:t xml:space="preserve">.</w:t>
+      </w:r>
+      <w:r>
+        <w:t xml:space="preserve"> </w:t>
+      </w:r>
+      <w:r>
+        <w:t xml:space="preserve">Nama gaya yang hilang atau muncul baru berarti acuannya tidak terpakai.</w:t>
+      </w:r>
+    </w:p>
+    <w:p>
+      <w:pPr>
+        <w:pStyle w:val="SourceCode"/>
+      </w:pPr>
+      <w:r>
+        <w:rPr>
+          <w:rStyle w:val="ControlFlowTok"/>
+        </w:rPr>
+        <w:t xml:space="preserve">for</w:t>
+      </w:r>
+      <w:r>
+        <w:rPr>
+          <w:rStyle w:val="NormalTok"/>
+        </w:rPr>
+        <w:t xml:space="preserve"> f </w:t>
+      </w:r>
+      <w:r>
+        <w:rPr>
+          <w:rStyle w:val="KeywordTok"/>
+        </w:rPr>
+        <w:t xml:space="preserve">in</w:t>
+      </w:r>
+      <w:r>
+        <w:rPr>
+          <w:rStyle w:val="NormalTok"/>
+        </w:rPr>
+        <w:t xml:space="preserve"> lama baru</w:t>
+      </w:r>
+      <w:r>
+        <w:rPr>
+          <w:rStyle w:val="KeywordTok"/>
+        </w:rPr>
+        <w:t xml:space="preserve">;</w:t>
+      </w:r>
+      <w:r>
+        <w:rPr>
+          <w:rStyle w:val="NormalTok"/>
+        </w:rPr>
+        <w:t xml:space="preserve"> </w:t>
+      </w:r>
+      <w:r>
+        <w:rPr>
+          <w:rStyle w:val="ControlFlowTok"/>
+        </w:rPr>
+        <w:t xml:space="preserve">do</w:t>
+      </w:r>
+      <w:r>
+        <w:br/>
+      </w:r>
+      <w:r>
+        <w:rPr>
+          <w:rStyle w:val="NormalTok"/>
+        </w:rPr>
+        <w:t xml:space="preserve">  </w:t>
+      </w:r>
+      <w:r>
+        <w:rPr>
+          <w:rStyle w:val="FunctionTok"/>
+        </w:rPr>
+        <w:t xml:space="preserve">unzip</w:t>
+      </w:r>
+      <w:r>
+        <w:rPr>
+          <w:rStyle w:val="NormalTok"/>
+        </w:rPr>
+        <w:t xml:space="preserve"> </w:t>
+      </w:r>
+      <w:r>
+        <w:rPr>
+          <w:rStyle w:val="AttributeTok"/>
+        </w:rPr>
+        <w:t xml:space="preserve">-qo</w:t>
+      </w:r>
+      <w:r>
+        <w:rPr>
+          <w:rStyle w:val="NormalTok"/>
+        </w:rPr>
+        <w:t xml:space="preserve"> </w:t>
+      </w:r>
+      <w:r>
+        <w:rPr>
+          <w:rStyle w:val="StringTok"/>
+        </w:rPr>
+        <w:t xml:space="preserve">"</w:t>
+      </w:r>
+      <w:r>
+        <w:rPr>
+          <w:rStyle w:val="VariableTok"/>
+        </w:rPr>
+        <w:t xml:space="preserve">$f</w:t>
+      </w:r>
+      <w:r>
+        <w:rPr>
+          <w:rStyle w:val="StringTok"/>
+        </w:rPr>
+        <w:t xml:space="preserve">.docx"</w:t>
+      </w:r>
+      <w:r>
+        <w:rPr>
+          <w:rStyle w:val="NormalTok"/>
+        </w:rPr>
+        <w:t xml:space="preserve"> </w:t>
+      </w:r>
+      <w:r>
+        <w:rPr>
+          <w:rStyle w:val="AttributeTok"/>
+        </w:rPr>
+        <w:t xml:space="preserve">-d</w:t>
+      </w:r>
+      <w:r>
+        <w:rPr>
+          <w:rStyle w:val="NormalTok"/>
+        </w:rPr>
+        <w:t xml:space="preserve"> </w:t>
+      </w:r>
+      <w:r>
+        <w:rPr>
+          <w:rStyle w:val="StringTok"/>
+        </w:rPr>
+        <w:t xml:space="preserve">"/tmp/</w:t>
+      </w:r>
+      <w:r>
+        <w:rPr>
+          <w:rStyle w:val="VariableTok"/>
+        </w:rPr>
+        <w:t xml:space="preserve">$f</w:t>
+      </w:r>
+      <w:r>
+        <w:rPr>
+          <w:rStyle w:val="StringTok"/>
+        </w:rPr>
+        <w:t xml:space="preserve">"</w:t>
+      </w:r>
+      <w:r>
+        <w:br/>
+      </w:r>
+      <w:r>
+        <w:rPr>
+          <w:rStyle w:val="NormalTok"/>
+        </w:rPr>
+        <w:t xml:space="preserve">  </w:t>
+      </w:r>
+      <w:r>
+        <w:rPr>
+          <w:rStyle w:val="BuiltInTok"/>
+        </w:rPr>
+        <w:t xml:space="preserve">echo</w:t>
+      </w:r>
+      <w:r>
+        <w:rPr>
+          <w:rStyle w:val="NormalTok"/>
+        </w:rPr>
+        <w:t xml:space="preserve"> </w:t>
+      </w:r>
+      <w:r>
+        <w:rPr>
+          <w:rStyle w:val="AttributeTok"/>
+        </w:rPr>
+        <w:t xml:space="preserve">-n</w:t>
+      </w:r>
+      <w:r>
+        <w:rPr>
+          <w:rStyle w:val="NormalTok"/>
+        </w:rPr>
+        <w:t xml:space="preserve"> </w:t>
+      </w:r>
+      <w:r>
+        <w:rPr>
+          <w:rStyle w:val="StringTok"/>
+        </w:rPr>
+        <w:t xml:space="preserve">"</w:t>
+      </w:r>
+      <w:r>
+        <w:rPr>
+          <w:rStyle w:val="VariableTok"/>
+        </w:rPr>
+        <w:t xml:space="preserve">$f</w:t>
+      </w:r>
+      <w:r>
+        <w:rPr>
+          <w:rStyle w:val="StringTok"/>
+        </w:rPr>
+        <w:t xml:space="preserve">: "</w:t>
+      </w:r>
+      <w:r>
+        <w:rPr>
+          <w:rStyle w:val="KeywordTok"/>
+        </w:rPr>
+        <w:t xml:space="preserve">;</w:t>
+      </w:r>
+      <w:r>
+        <w:rPr>
+          <w:rStyle w:val="NormalTok"/>
+        </w:rPr>
+        <w:t xml:space="preserve"> </w:t>
+      </w:r>
+      <w:r>
+        <w:rPr>
+          <w:rStyle w:val="FunctionTok"/>
+        </w:rPr>
+        <w:t xml:space="preserve">grep</w:t>
+      </w:r>
+      <w:r>
+        <w:rPr>
+          <w:rStyle w:val="NormalTok"/>
+        </w:rPr>
+        <w:t xml:space="preserve"> </w:t>
+      </w:r>
+      <w:r>
+        <w:rPr>
+          <w:rStyle w:val="AttributeTok"/>
+        </w:rPr>
+        <w:t xml:space="preserve">-o</w:t>
+      </w:r>
+      <w:r>
+        <w:rPr>
+          <w:rStyle w:val="NormalTok"/>
+        </w:rPr>
+        <w:t xml:space="preserve"> </w:t>
+      </w:r>
+      <w:r>
+        <w:rPr>
+          <w:rStyle w:val="StringTok"/>
+        </w:rPr>
+        <w:t xml:space="preserve">'w:pStyle w:val="[^"]*"'</w:t>
+      </w:r>
+      <w:r>
+        <w:rPr>
+          <w:rStyle w:val="NormalTok"/>
+        </w:rPr>
+        <w:t xml:space="preserve"> </w:t>
+      </w:r>
+      <w:r>
+        <w:rPr>
+          <w:rStyle w:val="StringTok"/>
+        </w:rPr>
+        <w:t xml:space="preserve">"/tmp/</w:t>
+      </w:r>
+      <w:r>
+        <w:rPr>
+          <w:rStyle w:val="VariableTok"/>
+        </w:rPr>
+        <w:t xml:space="preserve">$f</w:t>
+      </w:r>
+      <w:r>
+        <w:rPr>
+          <w:rStyle w:val="StringTok"/>
+        </w:rPr>
+        <w:t xml:space="preserve">/word/document.xml"</w:t>
+      </w:r>
+      <w:r>
+        <w:rPr>
+          <w:rStyle w:val="NormalTok"/>
+        </w:rPr>
+        <w:t xml:space="preserve"> </w:t>
+      </w:r>
+      <w:r>
+        <w:rPr>
+          <w:rStyle w:val="DataTypeTok"/>
+        </w:rPr>
+        <w:t xml:space="preserve">\</w:t>
+      </w:r>
+      <w:r>
+        <w:br/>
+      </w:r>
+      <w:r>
+        <w:rPr>
+          <w:rStyle w:val="NormalTok"/>
+        </w:rPr>
+        <w:t xml:space="preserve">    </w:t>
+      </w:r>
+      <w:r>
+        <w:rPr>
+          <w:rStyle w:val="KeywordTok"/>
+        </w:rPr>
+        <w:t xml:space="preserve">|</w:t>
+      </w:r>
+      <w:r>
+        <w:rPr>
+          <w:rStyle w:val="NormalTok"/>
+        </w:rPr>
+        <w:t xml:space="preserve"> </w:t>
+      </w:r>
+      <w:r>
+        <w:rPr>
+          <w:rStyle w:val="FunctionTok"/>
+        </w:rPr>
+        <w:t xml:space="preserve">sort</w:t>
+      </w:r>
+      <w:r>
+        <w:rPr>
+          <w:rStyle w:val="NormalTok"/>
+        </w:rPr>
+        <w:t xml:space="preserve"> </w:t>
+      </w:r>
+      <w:r>
+        <w:rPr>
+          <w:rStyle w:val="AttributeTok"/>
+        </w:rPr>
+        <w:t xml:space="preserve">-u</w:t>
+      </w:r>
+      <w:r>
+        <w:rPr>
+          <w:rStyle w:val="NormalTok"/>
+        </w:rPr>
+        <w:t xml:space="preserve"> </w:t>
+      </w:r>
+      <w:r>
+        <w:rPr>
+          <w:rStyle w:val="KeywordTok"/>
+        </w:rPr>
+        <w:t xml:space="preserve">|</w:t>
+      </w:r>
+      <w:r>
+        <w:rPr>
+          <w:rStyle w:val="NormalTok"/>
+        </w:rPr>
+        <w:t xml:space="preserve"> </w:t>
+      </w:r>
+      <w:r>
+        <w:rPr>
+          <w:rStyle w:val="FunctionTok"/>
+        </w:rPr>
+        <w:t xml:space="preserve">wc</w:t>
+      </w:r>
+      <w:r>
+        <w:rPr>
+          <w:rStyle w:val="NormalTok"/>
+        </w:rPr>
+        <w:t xml:space="preserve"> </w:t>
+      </w:r>
+      <w:r>
+        <w:rPr>
+          <w:rStyle w:val="AttributeTok"/>
+        </w:rPr>
+        <w:t xml:space="preserve">-l</w:t>
+      </w:r>
+      <w:r>
+        <w:br/>
+      </w:r>
+      <w:r>
+        <w:rPr>
+          <w:rStyle w:val="ControlFlowTok"/>
+        </w:rPr>
+        <w:t xml:space="preserve">done</w:t>
       </w:r>
     </w:p>
     <w:p>

</xml_diff>

<commit_message>
docs: dua entri docs/ yang terlewat dilengkapi di pohon direktori
panduan-semhas.md dan superpowers/ sama-sama terlacak git tetapi tidak muncul
di pohon direktori bagian 6, jadi daftarnya kurang dua dari isi sebenarnya.
superpowers/ memuat tujuh rencana implementasi dan delapan spesifikasi desain
per fitur, Juni sampai Agustus 2026.
</commit_message>
<xml_diff>
--- a/docs/Manual-Teknis-Nusa.docx
+++ b/docs/Manual-Teknis-Nusa.docx
@@ -7,7 +7,7 @@
         <w:pStyle w:val="Title"/>
       </w:pPr>
       <w:r>
-        <w:t>Manual Teknis</w:t>
+        <w:t>Manual Teknis — Nusa</w:t>
       </w:r>
     </w:p>
     <w:p>
@@ -15,7 +15,7 @@
         <w:pStyle w:val="Subtitle"/>
       </w:pPr>
       <w:r>
-        <w:t>Manual Book · Sistem OTA</w:t>
+        <w:t>Manual Book · Sistem OTA Nusa</w:t>
       </w:r>
     </w:p>
     <w:sdt>
@@ -26,7 +26,7 @@
           <w:sz w:val="24"/>
           <w:szCs w:val="24"/>
         </w:rPr>
-        <w:id w:val="-2001491941"/>
+        <w:id w:val="1473101051"/>
         <w:docPartObj>
           <w:docPartGallery w:val="Table of Contents"/>
           <w:docPartUnique/>
@@ -64,7 +64,7 @@
           <w:r>
             <w:fldChar w:fldCharType="separate"/>
           </w:r>
-          <w:hyperlink w:anchor="_Toc239211926" w:history="1">
+          <w:hyperlink w:anchor="_Toc239212830" w:history="1">
             <w:r>
               <w:rPr>
                 <w:rStyle w:val="Hyperlink"/>
@@ -91,7 +91,7 @@
                 <w:noProof/>
                 <w:webHidden/>
               </w:rPr>
-              <w:instrText xml:space="preserve"> PAGEREF _Toc239211926 \h </w:instrText>
+              <w:instrText xml:space="preserve"> PAGEREF _Toc239212830 \h </w:instrText>
             </w:r>
             <w:r>
               <w:rPr>
@@ -135,7 +135,7 @@
               <w14:ligatures w14:val="standardContextual"/>
             </w:rPr>
           </w:pPr>
-          <w:hyperlink w:anchor="_Toc239211927" w:history="1">
+          <w:hyperlink w:anchor="_Toc239212831" w:history="1">
             <w:r>
               <w:rPr>
                 <w:rStyle w:val="Hyperlink"/>
@@ -162,7 +162,7 @@
                 <w:noProof/>
                 <w:webHidden/>
               </w:rPr>
-              <w:instrText xml:space="preserve"> PAGEREF _Toc239211927 \h </w:instrText>
+              <w:instrText xml:space="preserve"> PAGEREF _Toc239212831 \h </w:instrText>
             </w:r>
             <w:r>
               <w:rPr>
@@ -206,7 +206,7 @@
               <w14:ligatures w14:val="standardContextual"/>
             </w:rPr>
           </w:pPr>
-          <w:hyperlink w:anchor="_Toc239211928" w:history="1">
+          <w:hyperlink w:anchor="_Toc239212832" w:history="1">
             <w:r>
               <w:rPr>
                 <w:rStyle w:val="Hyperlink"/>
@@ -233,7 +233,7 @@
                 <w:noProof/>
                 <w:webHidden/>
               </w:rPr>
-              <w:instrText xml:space="preserve"> PAGEREF _Toc239211928 \h </w:instrText>
+              <w:instrText xml:space="preserve"> PAGEREF _Toc239212832 \h </w:instrText>
             </w:r>
             <w:r>
               <w:rPr>
@@ -277,7 +277,7 @@
               <w14:ligatures w14:val="standardContextual"/>
             </w:rPr>
           </w:pPr>
-          <w:hyperlink w:anchor="_Toc239211929" w:history="1">
+          <w:hyperlink w:anchor="_Toc239212833" w:history="1">
             <w:r>
               <w:rPr>
                 <w:rStyle w:val="Hyperlink"/>
@@ -304,7 +304,7 @@
                 <w:noProof/>
                 <w:webHidden/>
               </w:rPr>
-              <w:instrText xml:space="preserve"> PAGEREF _Toc239211929 \h </w:instrText>
+              <w:instrText xml:space="preserve"> PAGEREF _Toc239212833 \h </w:instrText>
             </w:r>
             <w:r>
               <w:rPr>
@@ -348,7 +348,7 @@
               <w14:ligatures w14:val="standardContextual"/>
             </w:rPr>
           </w:pPr>
-          <w:hyperlink w:anchor="_Toc239211930" w:history="1">
+          <w:hyperlink w:anchor="_Toc239212834" w:history="1">
             <w:r>
               <w:rPr>
                 <w:rStyle w:val="Hyperlink"/>
@@ -375,7 +375,7 @@
                 <w:noProof/>
                 <w:webHidden/>
               </w:rPr>
-              <w:instrText xml:space="preserve"> PAGEREF _Toc239211930 \h </w:instrText>
+              <w:instrText xml:space="preserve"> PAGEREF _Toc239212834 \h </w:instrText>
             </w:r>
             <w:r>
               <w:rPr>
@@ -419,7 +419,7 @@
               <w14:ligatures w14:val="standardContextual"/>
             </w:rPr>
           </w:pPr>
-          <w:hyperlink w:anchor="_Toc239211931" w:history="1">
+          <w:hyperlink w:anchor="_Toc239212835" w:history="1">
             <w:r>
               <w:rPr>
                 <w:rStyle w:val="Hyperlink"/>
@@ -446,7 +446,7 @@
                 <w:noProof/>
                 <w:webHidden/>
               </w:rPr>
-              <w:instrText xml:space="preserve"> PAGEREF _Toc239211931 \h </w:instrText>
+              <w:instrText xml:space="preserve"> PAGEREF _Toc239212835 \h </w:instrText>
             </w:r>
             <w:r>
               <w:rPr>
@@ -490,7 +490,7 @@
               <w14:ligatures w14:val="standardContextual"/>
             </w:rPr>
           </w:pPr>
-          <w:hyperlink w:anchor="_Toc239211932" w:history="1">
+          <w:hyperlink w:anchor="_Toc239212836" w:history="1">
             <w:r>
               <w:rPr>
                 <w:rStyle w:val="Hyperlink"/>
@@ -517,7 +517,7 @@
                 <w:noProof/>
                 <w:webHidden/>
               </w:rPr>
-              <w:instrText xml:space="preserve"> PAGEREF _Toc239211932 \h </w:instrText>
+              <w:instrText xml:space="preserve"> PAGEREF _Toc239212836 \h </w:instrText>
             </w:r>
             <w:r>
               <w:rPr>
@@ -561,7 +561,7 @@
               <w14:ligatures w14:val="standardContextual"/>
             </w:rPr>
           </w:pPr>
-          <w:hyperlink w:anchor="_Toc239211933" w:history="1">
+          <w:hyperlink w:anchor="_Toc239212837" w:history="1">
             <w:r>
               <w:rPr>
                 <w:rStyle w:val="Hyperlink"/>
@@ -588,7 +588,7 @@
                 <w:noProof/>
                 <w:webHidden/>
               </w:rPr>
-              <w:instrText xml:space="preserve"> PAGEREF _Toc239211933 \h </w:instrText>
+              <w:instrText xml:space="preserve"> PAGEREF _Toc239212837 \h </w:instrText>
             </w:r>
             <w:r>
               <w:rPr>
@@ -632,7 +632,7 @@
               <w14:ligatures w14:val="standardContextual"/>
             </w:rPr>
           </w:pPr>
-          <w:hyperlink w:anchor="_Toc239211934" w:history="1">
+          <w:hyperlink w:anchor="_Toc239212838" w:history="1">
             <w:r>
               <w:rPr>
                 <w:rStyle w:val="Hyperlink"/>
@@ -659,7 +659,7 @@
                 <w:noProof/>
                 <w:webHidden/>
               </w:rPr>
-              <w:instrText xml:space="preserve"> PAGEREF _Toc239211934 \h </w:instrText>
+              <w:instrText xml:space="preserve"> PAGEREF _Toc239212838 \h </w:instrText>
             </w:r>
             <w:r>
               <w:rPr>
@@ -703,7 +703,7 @@
               <w14:ligatures w14:val="standardContextual"/>
             </w:rPr>
           </w:pPr>
-          <w:hyperlink w:anchor="_Toc239211935" w:history="1">
+          <w:hyperlink w:anchor="_Toc239212839" w:history="1">
             <w:r>
               <w:rPr>
                 <w:rStyle w:val="Hyperlink"/>
@@ -730,7 +730,7 @@
                 <w:noProof/>
                 <w:webHidden/>
               </w:rPr>
-              <w:instrText xml:space="preserve"> PAGEREF _Toc239211935 \h </w:instrText>
+              <w:instrText xml:space="preserve"> PAGEREF _Toc239212839 \h </w:instrText>
             </w:r>
             <w:r>
               <w:rPr>
@@ -774,7 +774,7 @@
               <w14:ligatures w14:val="standardContextual"/>
             </w:rPr>
           </w:pPr>
-          <w:hyperlink w:anchor="_Toc239211936" w:history="1">
+          <w:hyperlink w:anchor="_Toc239212840" w:history="1">
             <w:r>
               <w:rPr>
                 <w:rStyle w:val="Hyperlink"/>
@@ -801,7 +801,7 @@
                 <w:noProof/>
                 <w:webHidden/>
               </w:rPr>
-              <w:instrText xml:space="preserve"> PAGEREF _Toc239211936 \h </w:instrText>
+              <w:instrText xml:space="preserve"> PAGEREF _Toc239212840 \h </w:instrText>
             </w:r>
             <w:r>
               <w:rPr>
@@ -845,7 +845,7 @@
               <w14:ligatures w14:val="standardContextual"/>
             </w:rPr>
           </w:pPr>
-          <w:hyperlink w:anchor="_Toc239211937" w:history="1">
+          <w:hyperlink w:anchor="_Toc239212841" w:history="1">
             <w:r>
               <w:rPr>
                 <w:rStyle w:val="Hyperlink"/>
@@ -872,7 +872,7 @@
                 <w:noProof/>
                 <w:webHidden/>
               </w:rPr>
-              <w:instrText xml:space="preserve"> PAGEREF _Toc239211937 \h </w:instrText>
+              <w:instrText xml:space="preserve"> PAGEREF _Toc239212841 \h </w:instrText>
             </w:r>
             <w:r>
               <w:rPr>
@@ -892,7 +892,7 @@
                 <w:noProof/>
                 <w:webHidden/>
               </w:rPr>
-              <w:t>21</w:t>
+              <w:t>22</w:t>
             </w:r>
             <w:r>
               <w:rPr>
@@ -916,7 +916,7 @@
               <w14:ligatures w14:val="standardContextual"/>
             </w:rPr>
           </w:pPr>
-          <w:hyperlink w:anchor="_Toc239211938" w:history="1">
+          <w:hyperlink w:anchor="_Toc239212842" w:history="1">
             <w:r>
               <w:rPr>
                 <w:rStyle w:val="Hyperlink"/>
@@ -943,7 +943,7 @@
                 <w:noProof/>
                 <w:webHidden/>
               </w:rPr>
-              <w:instrText xml:space="preserve"> PAGEREF _Toc239211938 \h </w:instrText>
+              <w:instrText xml:space="preserve"> PAGEREF _Toc239212842 \h </w:instrText>
             </w:r>
             <w:r>
               <w:rPr>
@@ -987,7 +987,7 @@
               <w14:ligatures w14:val="standardContextual"/>
             </w:rPr>
           </w:pPr>
-          <w:hyperlink w:anchor="_Toc239211939" w:history="1">
+          <w:hyperlink w:anchor="_Toc239212843" w:history="1">
             <w:r>
               <w:rPr>
                 <w:rStyle w:val="Hyperlink"/>
@@ -1014,7 +1014,7 @@
                 <w:noProof/>
                 <w:webHidden/>
               </w:rPr>
-              <w:instrText xml:space="preserve"> PAGEREF _Toc239211939 \h </w:instrText>
+              <w:instrText xml:space="preserve"> PAGEREF _Toc239212843 \h </w:instrText>
             </w:r>
             <w:r>
               <w:rPr>
@@ -1034,7 +1034,7 @@
                 <w:noProof/>
                 <w:webHidden/>
               </w:rPr>
-              <w:t>22</w:t>
+              <w:t>23</w:t>
             </w:r>
             <w:r>
               <w:rPr>
@@ -1058,7 +1058,7 @@
               <w14:ligatures w14:val="standardContextual"/>
             </w:rPr>
           </w:pPr>
-          <w:hyperlink w:anchor="_Toc239211940" w:history="1">
+          <w:hyperlink w:anchor="_Toc239212844" w:history="1">
             <w:r>
               <w:rPr>
                 <w:rStyle w:val="Hyperlink"/>
@@ -1085,7 +1085,7 @@
                 <w:noProof/>
                 <w:webHidden/>
               </w:rPr>
-              <w:instrText xml:space="preserve"> PAGEREF _Toc239211940 \h </w:instrText>
+              <w:instrText xml:space="preserve"> PAGEREF _Toc239212844 \h </w:instrText>
             </w:r>
             <w:r>
               <w:rPr>
@@ -1129,7 +1129,7 @@
               <w14:ligatures w14:val="standardContextual"/>
             </w:rPr>
           </w:pPr>
-          <w:hyperlink w:anchor="_Toc239211941" w:history="1">
+          <w:hyperlink w:anchor="_Toc239212845" w:history="1">
             <w:r>
               <w:rPr>
                 <w:rStyle w:val="Hyperlink"/>
@@ -1156,7 +1156,7 @@
                 <w:noProof/>
                 <w:webHidden/>
               </w:rPr>
-              <w:instrText xml:space="preserve"> PAGEREF _Toc239211941 \h </w:instrText>
+              <w:instrText xml:space="preserve"> PAGEREF _Toc239212845 \h </w:instrText>
             </w:r>
             <w:r>
               <w:rPr>
@@ -1200,7 +1200,7 @@
               <w14:ligatures w14:val="standardContextual"/>
             </w:rPr>
           </w:pPr>
-          <w:hyperlink w:anchor="_Toc239211942" w:history="1">
+          <w:hyperlink w:anchor="_Toc239212846" w:history="1">
             <w:r>
               <w:rPr>
                 <w:rStyle w:val="Hyperlink"/>
@@ -1227,7 +1227,7 @@
                 <w:noProof/>
                 <w:webHidden/>
               </w:rPr>
-              <w:instrText xml:space="preserve"> PAGEREF _Toc239211942 \h </w:instrText>
+              <w:instrText xml:space="preserve"> PAGEREF _Toc239212846 \h </w:instrText>
             </w:r>
             <w:r>
               <w:rPr>
@@ -1271,7 +1271,7 @@
               <w14:ligatures w14:val="standardContextual"/>
             </w:rPr>
           </w:pPr>
-          <w:hyperlink w:anchor="_Toc239211943" w:history="1">
+          <w:hyperlink w:anchor="_Toc239212847" w:history="1">
             <w:r>
               <w:rPr>
                 <w:rStyle w:val="Hyperlink"/>
@@ -1298,7 +1298,7 @@
                 <w:noProof/>
                 <w:webHidden/>
               </w:rPr>
-              <w:instrText xml:space="preserve"> PAGEREF _Toc239211943 \h </w:instrText>
+              <w:instrText xml:space="preserve"> PAGEREF _Toc239212847 \h </w:instrText>
             </w:r>
             <w:r>
               <w:rPr>
@@ -1318,7 +1318,7 @@
                 <w:noProof/>
                 <w:webHidden/>
               </w:rPr>
-              <w:t>26</w:t>
+              <w:t>27</w:t>
             </w:r>
             <w:r>
               <w:rPr>
@@ -1342,7 +1342,7 @@
               <w14:ligatures w14:val="standardContextual"/>
             </w:rPr>
           </w:pPr>
-          <w:hyperlink w:anchor="_Toc239211944" w:history="1">
+          <w:hyperlink w:anchor="_Toc239212848" w:history="1">
             <w:r>
               <w:rPr>
                 <w:rStyle w:val="Hyperlink"/>
@@ -1369,7 +1369,7 @@
                 <w:noProof/>
                 <w:webHidden/>
               </w:rPr>
-              <w:instrText xml:space="preserve"> PAGEREF _Toc239211944 \h </w:instrText>
+              <w:instrText xml:space="preserve"> PAGEREF _Toc239212848 \h </w:instrText>
             </w:r>
             <w:r>
               <w:rPr>
@@ -1413,7 +1413,7 @@
               <w14:ligatures w14:val="standardContextual"/>
             </w:rPr>
           </w:pPr>
-          <w:hyperlink w:anchor="_Toc239211945" w:history="1">
+          <w:hyperlink w:anchor="_Toc239212849" w:history="1">
             <w:r>
               <w:rPr>
                 <w:rStyle w:val="Hyperlink"/>
@@ -1440,7 +1440,7 @@
                 <w:noProof/>
                 <w:webHidden/>
               </w:rPr>
-              <w:instrText xml:space="preserve"> PAGEREF _Toc239211945 \h </w:instrText>
+              <w:instrText xml:space="preserve"> PAGEREF _Toc239212849 \h </w:instrText>
             </w:r>
             <w:r>
               <w:rPr>
@@ -1551,8 +1551,13 @@
     </w:p>
     <w:p>
       <w:r>
-        <w:pict w14:anchorId="084D4600">
-          <v:rect id="Horizontal Line 1" o:spid="_x0000_s1045" alt="" style="width:451.3pt;height:1.1pt;visibility:visible;mso-wrap-style:square;mso-width-percent:0;mso-height-percent:0;mso-left-percent:-10001;mso-top-percent:-10001;mso-position-horizontal:absolute;mso-position-horizontal-relative:char;mso-position-vertical:absolute;mso-position-vertical-relative:line;mso-width-percent:0;mso-height-percent:0;mso-left-percent:-10001;mso-top-percent:-10001;v-text-anchor:top" filled="f">
+        <w:rPr>
+          <w:noProof/>
+        </w:rPr>
+      </w:r>
+      <w:r>
+        <w:pict>
+          <v:rect id="Horizontal Line 1" o:spid="_x0000_s1045" style="width:451.3pt;height:1.1pt;visibility:visible;mso-wrap-style:square;mso-left-percent:-10001;mso-top-percent:-10001;mso-position-horizontal:absolute;mso-position-horizontal-relative:char;mso-position-vertical:absolute;mso-position-vertical-relative:line;mso-left-percent:-10001;mso-top-percent:-10001;v-text-anchor:top" o:gfxdata="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" filled="f">
             <o:lock v:ext="edit" rotation="t" aspectratio="t" verticies="t" text="t" shapetype="t"/>
             <w10:anchorlock/>
           </v:rect>
@@ -1564,7 +1569,7 @@
         <w:pStyle w:val="Heading2"/>
       </w:pPr>
       <w:bookmarkStart w:id="0" w:name="ringkasan-arsitektur"/>
-      <w:bookmarkStart w:id="1" w:name="_Toc239211926"/>
+      <w:bookmarkStart w:id="1" w:name="_Toc239212830"/>
       <w:r>
         <w:t>1. Ringkasan Arsitektur</w:t>
       </w:r>
@@ -2069,7 +2074,10 @@
         <w:pStyle w:val="BodyText"/>
       </w:pPr>
       <w:r>
-        <w:t xml:space="preserve">Satu stasiun menulis tiap 5 detik — sekitar 17.280 tulisan per hari. Firestore menagih per dokumen yang ditulis; RTDB menagih per bandwidth, dan muatannya hanya ± 200 byte. ESP32 juga tidak punya SDK Firestore yang ringan, sedangkan RTDB bisa diakses dengan </w:t>
+        <w:t xml:space="preserve">Satu stasiun menulis tiap 5 detik — sekitar 17.280 tulisan per hari. Firestore menagih per dokumen yang ditulis; RTDB menagih per bandwidth, dan muatannya </w:t>
+      </w:r>
+      <w:r>
+        <w:t xml:space="preserve">hanya ± 200 byte. ESP32 juga tidak punya SDK Firestore yang ringan, sedangkan RTDB bisa diakses dengan </w:t>
       </w:r>
       <w:r>
         <w:rPr>
@@ -2083,8 +2091,13 @@
     </w:p>
     <w:p>
       <w:r>
-        <w:pict w14:anchorId="3B51F673">
-          <v:rect id="Horizontal Line 2" o:spid="_x0000_s1044" alt="" style="width:451.3pt;height:1.1pt;visibility:visible;mso-wrap-style:square;mso-width-percent:0;mso-height-percent:0;mso-left-percent:-10001;mso-top-percent:-10001;mso-position-horizontal:absolute;mso-position-horizontal-relative:char;mso-position-vertical:absolute;mso-position-vertical-relative:line;mso-width-percent:0;mso-height-percent:0;mso-left-percent:-10001;mso-top-percent:-10001;v-text-anchor:top" filled="f">
+        <w:rPr>
+          <w:noProof/>
+        </w:rPr>
+      </w:r>
+      <w:r>
+        <w:pict>
+          <v:rect id="Horizontal Line 2" o:spid="_x0000_s1044" style="width:451.3pt;height:1.1pt;visibility:visible;mso-wrap-style:square;mso-left-percent:-10001;mso-top-percent:-10001;mso-position-horizontal:absolute;mso-position-horizontal-relative:char;mso-position-vertical:absolute;mso-position-vertical-relative:line;mso-left-percent:-10001;mso-top-percent:-10001;v-text-anchor:top" o:gfxdata="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" filled="f">
             <o:lock v:ext="edit" rotation="t" aspectratio="t" verticies="t" text="t" shapetype="t"/>
             <w10:anchorlock/>
           </v:rect>
@@ -2096,7 +2109,7 @@
         <w:pStyle w:val="Heading2"/>
       </w:pPr>
       <w:bookmarkStart w:id="3" w:name="tumpukan-teknologi"/>
-      <w:bookmarkStart w:id="4" w:name="_Toc239211927"/>
+      <w:bookmarkStart w:id="4" w:name="_Toc239212831"/>
       <w:bookmarkEnd w:id="0"/>
       <w:bookmarkEnd w:id="2"/>
       <w:r>
@@ -3037,8 +3050,13 @@
     </w:p>
     <w:p>
       <w:r>
-        <w:pict w14:anchorId="7CB91F84">
-          <v:rect id="Horizontal Line 3" o:spid="_x0000_s1043" alt="" style="width:451.3pt;height:1.1pt;visibility:visible;mso-wrap-style:square;mso-width-percent:0;mso-height-percent:0;mso-left-percent:-10001;mso-top-percent:-10001;mso-position-horizontal:absolute;mso-position-horizontal-relative:char;mso-position-vertical:absolute;mso-position-vertical-relative:line;mso-width-percent:0;mso-height-percent:0;mso-left-percent:-10001;mso-top-percent:-10001;v-text-anchor:top" filled="f">
+        <w:rPr>
+          <w:noProof/>
+        </w:rPr>
+      </w:r>
+      <w:r>
+        <w:pict>
+          <v:rect id="Horizontal Line 3" o:spid="_x0000_s1043" style="width:451.3pt;height:1.1pt;visibility:visible;mso-wrap-style:square;mso-left-percent:-10001;mso-top-percent:-10001;mso-position-horizontal:absolute;mso-position-horizontal-relative:char;mso-position-vertical:absolute;mso-position-vertical-relative:line;mso-left-percent:-10001;mso-top-percent:-10001;v-text-anchor:top" o:gfxdata="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" filled="f">
             <o:lock v:ext="edit" rotation="t" aspectratio="t" verticies="t" text="t" shapetype="t"/>
             <w10:anchorlock/>
           </v:rect>
@@ -3050,7 +3068,7 @@
         <w:pStyle w:val="Heading2"/>
       </w:pPr>
       <w:bookmarkStart w:id="5" w:name="prasyarat"/>
-      <w:bookmarkStart w:id="6" w:name="_Toc239211928"/>
+      <w:bookmarkStart w:id="6" w:name="_Toc239212832"/>
       <w:bookmarkEnd w:id="3"/>
       <w:r>
         <w:t>3. Prasyarat</w:t>
@@ -3699,8 +3717,13 @@
     </w:tbl>
     <w:p>
       <w:r>
-        <w:pict w14:anchorId="39647E53">
-          <v:rect id="Horizontal Line 4" o:spid="_x0000_s1042" alt="" style="width:451.3pt;height:1.1pt;visibility:visible;mso-wrap-style:square;mso-width-percent:0;mso-height-percent:0;mso-left-percent:-10001;mso-top-percent:-10001;mso-position-horizontal:absolute;mso-position-horizontal-relative:char;mso-position-vertical:absolute;mso-position-vertical-relative:line;mso-width-percent:0;mso-height-percent:0;mso-left-percent:-10001;mso-top-percent:-10001;v-text-anchor:top" filled="f">
+        <w:rPr>
+          <w:noProof/>
+        </w:rPr>
+      </w:r>
+      <w:r>
+        <w:pict>
+          <v:rect id="Horizontal Line 4" o:spid="_x0000_s1042" style="width:451.3pt;height:1.1pt;visibility:visible;mso-wrap-style:square;mso-left-percent:-10001;mso-top-percent:-10001;mso-position-horizontal:absolute;mso-position-horizontal-relative:char;mso-position-vertical:absolute;mso-position-vertical-relative:line;mso-left-percent:-10001;mso-top-percent:-10001;v-text-anchor:top" o:gfxdata="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" filled="f">
             <o:lock v:ext="edit" rotation="t" aspectratio="t" verticies="t" text="t" shapetype="t"/>
             <w10:anchorlock/>
           </v:rect>
@@ -3712,7 +3735,7 @@
         <w:pStyle w:val="Heading2"/>
       </w:pPr>
       <w:bookmarkStart w:id="9" w:name="pemasangan-lokal"/>
-      <w:bookmarkStart w:id="10" w:name="_Toc239211929"/>
+      <w:bookmarkStart w:id="10" w:name="_Toc239212833"/>
       <w:bookmarkEnd w:id="5"/>
       <w:bookmarkEnd w:id="8"/>
       <w:r>
@@ -4123,7 +4146,10 @@
         <w:t>FIREBASE_ADMIN_SA_B64</w:t>
       </w:r>
       <w:r>
-        <w:t xml:space="preserve"> — isinya berkas </w:t>
+        <w:t xml:space="preserve"> </w:t>
+      </w:r>
+      <w:r>
+        <w:t xml:space="preserve">— isinya berkas </w:t>
       </w:r>
       <w:r>
         <w:rPr>
@@ -4451,13 +4477,21 @@
         <w:t>semua</w:t>
       </w:r>
       <w:r>
-        <w:t xml:space="preserve"> pengunggah termasuk admin. Gejalanya tidak bisa dibedakan dari “belum masuk”. Lihat bagian 19.</w:t>
-      </w:r>
-    </w:p>
-    <w:p>
-      <w:r>
-        <w:pict w14:anchorId="607C3902">
-          <v:rect id="Horizontal Line 5" o:spid="_x0000_s1041" alt="" style="width:451.3pt;height:1.1pt;visibility:visible;mso-wrap-style:square;mso-width-percent:0;mso-height-percent:0;mso-left-percent:-10001;mso-top-percent:-10001;mso-position-horizontal:absolute;mso-position-horizontal-relative:char;mso-position-vertical:absolute;mso-position-vertical-relative:line;mso-width-percent:0;mso-height-percent:0;mso-left-percent:-10001;mso-top-percent:-10001;v-text-anchor:top" filled="f">
+        <w:t xml:space="preserve"> </w:t>
+      </w:r>
+      <w:r>
+        <w:t>pengunggah termasuk admin. Gejalanya tidak bisa dibedakan dari “belum masuk”. Lihat bagian 19.</w:t>
+      </w:r>
+    </w:p>
+    <w:p>
+      <w:r>
+        <w:rPr>
+          <w:noProof/>
+        </w:rPr>
+      </w:r>
+      <w:r>
+        <w:pict>
+          <v:rect id="Horizontal Line 5" o:spid="_x0000_s1041" style="width:451.3pt;height:1.1pt;visibility:visible;mso-wrap-style:square;mso-left-percent:-10001;mso-top-percent:-10001;mso-position-horizontal:absolute;mso-position-horizontal-relative:char;mso-position-vertical:absolute;mso-position-vertical-relative:line;mso-left-percent:-10001;mso-top-percent:-10001;v-text-anchor:top" o:gfxdata="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" filled="f">
             <o:lock v:ext="edit" rotation="t" aspectratio="t" verticies="t" text="t" shapetype="t"/>
             <w10:anchorlock/>
           </v:rect>
@@ -4469,7 +4503,7 @@
         <w:pStyle w:val="Heading2"/>
       </w:pPr>
       <w:bookmarkStart w:id="14" w:name="variabel-lingkungan"/>
-      <w:bookmarkStart w:id="15" w:name="_Toc239211930"/>
+      <w:bookmarkStart w:id="15" w:name="_Toc239212834"/>
       <w:bookmarkEnd w:id="9"/>
       <w:bookmarkEnd w:id="13"/>
       <w:r>
@@ -5851,8 +5885,13 @@
     </w:tbl>
     <w:p>
       <w:r>
-        <w:pict w14:anchorId="08B595CF">
-          <v:rect id="Horizontal Line 6" o:spid="_x0000_s1040" alt="" style="width:451.3pt;height:1.1pt;visibility:visible;mso-wrap-style:square;mso-width-percent:0;mso-height-percent:0;mso-left-percent:-10001;mso-top-percent:-10001;mso-position-horizontal:absolute;mso-position-horizontal-relative:char;mso-position-vertical:absolute;mso-position-vertical-relative:line;mso-width-percent:0;mso-height-percent:0;mso-left-percent:-10001;mso-top-percent:-10001;v-text-anchor:top" filled="f">
+        <w:rPr>
+          <w:noProof/>
+        </w:rPr>
+      </w:r>
+      <w:r>
+        <w:pict>
+          <v:rect id="Horizontal Line 6" o:spid="_x0000_s1040" style="width:451.3pt;height:1.1pt;visibility:visible;mso-wrap-style:square;mso-left-percent:-10001;mso-top-percent:-10001;mso-position-horizontal:absolute;mso-position-horizontal-relative:char;mso-position-vertical:absolute;mso-position-vertical-relative:line;mso-left-percent:-10001;mso-top-percent:-10001;v-text-anchor:top" o:gfxdata="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" filled="f">
             <o:lock v:ext="edit" rotation="t" aspectratio="t" verticies="t" text="t" shapetype="t"/>
             <w10:anchorlock/>
           </v:rect>
@@ -5864,7 +5903,7 @@
         <w:pStyle w:val="Heading2"/>
       </w:pPr>
       <w:bookmarkStart w:id="23" w:name="struktur-direktori"/>
-      <w:bookmarkStart w:id="24" w:name="_Toc239211931"/>
+      <w:bookmarkStart w:id="24" w:name="_Toc239212835"/>
       <w:bookmarkEnd w:id="14"/>
       <w:bookmarkEnd w:id="22"/>
       <w:r>
@@ -6456,6 +6495,15 @@
         <w:rPr>
           <w:rStyle w:val="VerbatimChar"/>
         </w:rPr>
+        <w:t>│   ├── panduan-semhas.md         Bahan seminar hasil (ditulis 7 Agustus 2026)</w:t>
+      </w:r>
+      <w:r>
+        <w:br/>
+      </w:r>
+      <w:r>
+        <w:rPr>
+          <w:rStyle w:val="VerbatimChar"/>
+        </w:rPr>
         <w:t>│   ├── audit-keamanan-*.md       Laporan audit keamanan</w:t>
       </w:r>
       <w:r>
@@ -6492,7 +6540,7 @@
         <w:rPr>
           <w:rStyle w:val="VerbatimChar"/>
         </w:rPr>
-        <w:t>│   └── Sistem-Kamera-*.pdf       Spesifikasi kamera Ezviz/DeepNorth</w:t>
+        <w:t>│   ├── Sistem-Kamera-*.pdf       Spesifikasi kamera Ezviz/DeepNorth</w:t>
       </w:r>
       <w:r>
         <w:br/>
@@ -6501,6 +6549,15 @@
         <w:rPr>
           <w:rStyle w:val="VerbatimChar"/>
         </w:rPr>
+        <w:t>│   └── superpowers/              Rencana &amp; spesifikasi desain tiap fitur</w:t>
+      </w:r>
+      <w:r>
+        <w:br/>
+      </w:r>
+      <w:r>
+        <w:rPr>
+          <w:rStyle w:val="VerbatimChar"/>
+        </w:rPr>
         <w:t>│</w:t>
       </w:r>
       <w:r>
@@ -6776,8 +6833,13 @@
     </w:p>
     <w:p>
       <w:r>
-        <w:pict w14:anchorId="5DFABF53">
-          <v:rect id="Horizontal Line 7" o:spid="_x0000_s1039" alt="" style="width:451.3pt;height:1.1pt;visibility:visible;mso-wrap-style:square;mso-width-percent:0;mso-height-percent:0;mso-left-percent:-10001;mso-top-percent:-10001;mso-position-horizontal:absolute;mso-position-horizontal-relative:char;mso-position-vertical:absolute;mso-position-vertical-relative:line;mso-width-percent:0;mso-height-percent:0;mso-left-percent:-10001;mso-top-percent:-10001;v-text-anchor:top" filled="f">
+        <w:rPr>
+          <w:noProof/>
+        </w:rPr>
+      </w:r>
+      <w:r>
+        <w:pict>
+          <v:rect id="Horizontal Line 7" o:spid="_x0000_s1039" style="width:451.3pt;height:1.1pt;visibility:visible;mso-wrap-style:square;mso-left-percent:-10001;mso-top-percent:-10001;mso-position-horizontal:absolute;mso-position-horizontal-relative:char;mso-position-vertical:absolute;mso-position-vertical-relative:line;mso-left-percent:-10001;mso-top-percent:-10001;v-text-anchor:top" o:gfxdata="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" filled="f">
             <o:lock v:ext="edit" rotation="t" aspectratio="t" verticies="t" text="t" shapetype="t"/>
             <w10:anchorlock/>
           </v:rect>
@@ -6789,7 +6851,7 @@
         <w:pStyle w:val="Heading2"/>
       </w:pPr>
       <w:bookmarkStart w:id="25" w:name="pola-arsitektur"/>
-      <w:bookmarkStart w:id="26" w:name="_Toc239211932"/>
+      <w:bookmarkStart w:id="26" w:name="_Toc239212836"/>
       <w:bookmarkEnd w:id="23"/>
       <w:r>
         <w:t>7. Pola Arsitektur</w:t>
@@ -7002,7 +7064,14 @@
           <w:b/>
           <w:bCs/>
         </w:rPr>
-        <w:t>layar boleh menolak lebih dulu demi kenyamanan, tetapi keputusannya selalu diulang di server.</w:t>
+        <w:t xml:space="preserve">layar boleh menolak lebih dulu demi </w:t>
+      </w:r>
+      <w:r>
+        <w:rPr>
+          <w:b/>
+          <w:bCs/>
+        </w:rPr>
+        <w:t>kenyamanan, tetapi keputusannya selalu diulang di server.</w:t>
       </w:r>
     </w:p>
     <w:p>
@@ -7687,7 +7756,10 @@
         <w:t>proksi gambar terbuka</w:t>
       </w:r>
       <w:r>
-        <w:t>: siapa pun boleh menyuruhnya mengunduh dan mengecilkan gambar dari host mana saja, atas biaya dan atas nama domain kita.</w:t>
+        <w:t xml:space="preserve">: </w:t>
+      </w:r>
+      <w:r>
+        <w:t>siapa pun boleh menyuruhnya mengunduh dan mengecilkan gambar dari host mana saja, atas biaya dan atas nama domain kita.</w:t>
       </w:r>
     </w:p>
     <w:p>
@@ -7756,8 +7828,13 @@
     </w:p>
     <w:p>
       <w:r>
-        <w:pict w14:anchorId="3ECDB2F4">
-          <v:rect id="Horizontal Line 8" o:spid="_x0000_s1038" alt="" style="width:451.3pt;height:1.1pt;visibility:visible;mso-wrap-style:square;mso-width-percent:0;mso-height-percent:0;mso-left-percent:-10001;mso-top-percent:-10001;mso-position-horizontal:absolute;mso-position-horizontal-relative:char;mso-position-vertical:absolute;mso-position-vertical-relative:line;mso-width-percent:0;mso-height-percent:0;mso-left-percent:-10001;mso-top-percent:-10001;v-text-anchor:top" filled="f">
+        <w:rPr>
+          <w:noProof/>
+        </w:rPr>
+      </w:r>
+      <w:r>
+        <w:pict>
+          <v:rect id="Horizontal Line 8" o:spid="_x0000_s1038" style="width:451.3pt;height:1.1pt;visibility:visible;mso-wrap-style:square;mso-left-percent:-10001;mso-top-percent:-10001;mso-position-horizontal:absolute;mso-position-horizontal-relative:char;mso-position-vertical:absolute;mso-position-vertical-relative:line;mso-left-percent:-10001;mso-top-percent:-10001;v-text-anchor:top" o:gfxdata="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" filled="f">
             <o:lock v:ext="edit" rotation="t" aspectratio="t" verticies="t" text="t" shapetype="t"/>
             <w10:anchorlock/>
           </v:rect>
@@ -7769,7 +7846,7 @@
         <w:pStyle w:val="Heading2"/>
       </w:pPr>
       <w:bookmarkStart w:id="30" w:name="model-data"/>
-      <w:bookmarkStart w:id="31" w:name="_Toc239211933"/>
+      <w:bookmarkStart w:id="31" w:name="_Toc239212837"/>
       <w:bookmarkEnd w:id="25"/>
       <w:bookmarkEnd w:id="29"/>
       <w:r>
@@ -8326,7 +8403,10 @@
         <w:t>secara struktural</w:t>
       </w:r>
       <w:r>
-        <w:t xml:space="preserve"> tidak mungkin punya dua ulasan untuk destinasi yang sama. Ini bukan validasi yang bisa dilewati, melainkan konsekuensi dari desain kunci. Rules menegakkan hal yang sama di sisi server.</w:t>
+        <w:t xml:space="preserve"> </w:t>
+      </w:r>
+      <w:r>
+        <w:t>tidak mungkin punya dua ulasan untuk destinasi yang sama. Ini bukan validasi yang bisa dilewati, melainkan konsekuensi dari desain kunci. Rules menegakkan hal yang sama di sisi server.</w:t>
       </w:r>
     </w:p>
     <w:p>
@@ -8614,6 +8694,78 @@
     </w:p>
     <w:p>
       <w:pPr>
+        <w:pStyle w:val="BodyText"/>
+      </w:pPr>
+      <w:r>
+        <w:t xml:space="preserve">Lencana status di layar tidak memetakan </w:t>
+      </w:r>
+      <w:r>
+        <w:rPr>
+          <w:rStyle w:val="VerbatimChar"/>
+        </w:rPr>
+        <w:t>status</w:t>
+      </w:r>
+      <w:r>
+        <w:t xml:space="preserve"> satu lawan satu. Nilainya diturunkan </w:t>
+      </w:r>
+      <w:r>
+        <w:rPr>
+          <w:rStyle w:val="VerbatimChar"/>
+        </w:rPr>
+        <w:t>kunciStatusBooking()</w:t>
+      </w:r>
+      <w:r>
+        <w:t xml:space="preserve"> (</w:t>
+      </w:r>
+      <w:r>
+        <w:rPr>
+          <w:rStyle w:val="VerbatimChar"/>
+        </w:rPr>
+        <w:t>lib/format.ts</w:t>
+      </w:r>
+      <w:r>
+        <w:t xml:space="preserve">) dari kombinasi </w:t>
+      </w:r>
+      <w:r>
+        <w:rPr>
+          <w:rStyle w:val="VerbatimChar"/>
+        </w:rPr>
+        <w:t>status</w:t>
+      </w:r>
+      <w:r>
+        <w:t xml:space="preserve">, </w:t>
+      </w:r>
+      <w:r>
+        <w:rPr>
+          <w:rStyle w:val="VerbatimChar"/>
+        </w:rPr>
+        <w:t>paymentStatus</w:t>
+      </w:r>
+      <w:r>
+        <w:t xml:space="preserve">, dan tanggal — termasuk </w:t>
+      </w:r>
+      <w:r>
+        <w:rPr>
+          <w:b/>
+          <w:bCs/>
+        </w:rPr>
+        <w:t>Kedaluwarsa</w:t>
+      </w:r>
+      <w:r>
+        <w:t xml:space="preserve"> untuk booking yang tanggalnya sudah lewat tanpa pernah lunas. Tidak ada nilai </w:t>
+      </w:r>
+      <w:r>
+        <w:rPr>
+          <w:rStyle w:val="VerbatimChar"/>
+        </w:rPr>
+        <w:t>expired</w:t>
+      </w:r>
+      <w:r>
+        <w:t xml:space="preserve"> yang tersimpan di Firestore; label itu murni turunan.</w:t>
+      </w:r>
+    </w:p>
+    <w:p>
+      <w:pPr>
         <w:pStyle w:val="Heading3"/>
       </w:pPr>
       <w:bookmarkStart w:id="34" w:name="realtime-database"/>
@@ -8947,8 +9099,13 @@
     </w:p>
     <w:p>
       <w:r>
-        <w:pict w14:anchorId="5CADF935">
-          <v:rect id="Horizontal Line 9" o:spid="_x0000_s1037" alt="" style="width:451.3pt;height:1.1pt;visibility:visible;mso-wrap-style:square;mso-width-percent:0;mso-height-percent:0;mso-left-percent:-10001;mso-top-percent:-10001;mso-position-horizontal:absolute;mso-position-horizontal-relative:char;mso-position-vertical:absolute;mso-position-vertical-relative:line;mso-width-percent:0;mso-height-percent:0;mso-left-percent:-10001;mso-top-percent:-10001;v-text-anchor:top" filled="f">
+        <w:rPr>
+          <w:noProof/>
+        </w:rPr>
+      </w:r>
+      <w:r>
+        <w:pict>
+          <v:rect id="Horizontal Line 9" o:spid="_x0000_s1037" style="width:451.3pt;height:1.1pt;visibility:visible;mso-wrap-style:square;mso-left-percent:-10001;mso-top-percent:-10001;mso-position-horizontal:absolute;mso-position-horizontal-relative:char;mso-position-vertical:absolute;mso-position-vertical-relative:line;mso-left-percent:-10001;mso-top-percent:-10001;v-text-anchor:top" o:gfxdata="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" filled="f">
             <o:lock v:ext="edit" rotation="t" aspectratio="t" verticies="t" text="t" shapetype="t"/>
             <w10:anchorlock/>
           </v:rect>
@@ -8960,7 +9117,7 @@
         <w:pStyle w:val="Heading2"/>
       </w:pPr>
       <w:bookmarkStart w:id="36" w:name="keamanan"/>
-      <w:bookmarkStart w:id="37" w:name="_Toc239211934"/>
+      <w:bookmarkStart w:id="37" w:name="_Toc239212838"/>
       <w:bookmarkEnd w:id="30"/>
       <w:bookmarkEnd w:id="35"/>
       <w:r>
@@ -9258,7 +9415,10 @@
         <w:t>monitoring</w:t>
       </w:r>
       <w:r>
-        <w:t xml:space="preserve"> terbuka — angka sensor memang tayang untuk pengunjung anonim di hero beranda dan halaman destinasi.</w:t>
+        <w:t xml:space="preserve"> terbuka — angka sensor memang tayang untuk pengunjung </w:t>
+      </w:r>
+      <w:r>
+        <w:t>anonim di hero beranda dan halaman destinasi.</w:t>
       </w:r>
     </w:p>
     <w:p>
@@ -9342,7 +9502,10 @@
         <w:t>.validate</w:t>
       </w:r>
       <w:r>
-        <w:t xml:space="preserve"> untuk membatasi kewajaran nilai sudah disiapkan dalam bentuk komentar di berkas yang sama, tinggal dihidupkan setelah bentuk tulisan firmware dipastikan.</w:t>
+        <w:t xml:space="preserve"> untuk membatasi kewajaran nilai sudah disiapkan dalam bentuk </w:t>
+      </w:r>
+      <w:r>
+        <w:t>komentar di berkas yang sama, tinggal dihidupkan setelah bentuk tulisan firmware dipastikan.</w:t>
       </w:r>
     </w:p>
     <w:p>
@@ -10209,7 +10372,10 @@
         <w:t>lib/format.ts</w:t>
       </w:r>
       <w:r>
-        <w:t xml:space="preserve">). Path Firestore bersegmen — tanpa penyaringan, masukan seperti </w:t>
+        <w:t xml:space="preserve">). Path Firestore bersegmen — tanpa penyaringan, </w:t>
+      </w:r>
+      <w:r>
+        <w:t xml:space="preserve">masukan seperti </w:t>
       </w:r>
       <w:r>
         <w:rPr>
@@ -10376,7 +10542,10 @@
         <w:t>.ino</w:t>
       </w:r>
       <w:r>
-        <w:t xml:space="preserve"> sendiri tidak masuk repositori publik — lihat </w:t>
+        <w:t xml:space="preserve"> </w:t>
+      </w:r>
+      <w:r>
+        <w:t xml:space="preserve">sendiri tidak masuk repositori publik — lihat </w:t>
       </w:r>
       <w:r>
         <w:rPr>
@@ -10390,8 +10559,13 @@
     </w:p>
     <w:p>
       <w:r>
-        <w:pict w14:anchorId="548F08B1">
-          <v:rect id="Horizontal Line 10" o:spid="_x0000_s1036" alt="" style="width:451.3pt;height:1.1pt;visibility:visible;mso-wrap-style:square;mso-width-percent:0;mso-height-percent:0;mso-left-percent:-10001;mso-top-percent:-10001;mso-position-horizontal:absolute;mso-position-horizontal-relative:char;mso-position-vertical:absolute;mso-position-vertical-relative:line;mso-width-percent:0;mso-height-percent:0;mso-left-percent:-10001;mso-top-percent:-10001;v-text-anchor:top" filled="f">
+        <w:rPr>
+          <w:noProof/>
+        </w:rPr>
+      </w:r>
+      <w:r>
+        <w:pict>
+          <v:rect id="Horizontal Line 10" o:spid="_x0000_s1036" style="width:451.3pt;height:1.1pt;visibility:visible;mso-wrap-style:square;mso-left-percent:-10001;mso-top-percent:-10001;mso-position-horizontal:absolute;mso-position-horizontal-relative:char;mso-position-vertical:absolute;mso-position-vertical-relative:line;mso-left-percent:-10001;mso-top-percent:-10001;v-text-anchor:top" o:gfxdata="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" filled="f">
             <o:lock v:ext="edit" rotation="t" aspectratio="t" verticies="t" text="t" shapetype="t"/>
             <w10:anchorlock/>
           </v:rect>
@@ -10403,7 +10577,7 @@
         <w:pStyle w:val="Heading2"/>
       </w:pPr>
       <w:bookmarkStart w:id="43" w:name="referensi-api"/>
-      <w:bookmarkStart w:id="44" w:name="_Toc239211935"/>
+      <w:bookmarkStart w:id="44" w:name="_Toc239212839"/>
       <w:bookmarkEnd w:id="36"/>
       <w:bookmarkEnd w:id="42"/>
       <w:r>
@@ -11865,7 +12039,10 @@
         <w:t>ok: true</w:t>
       </w:r>
       <w:r>
-        <w:t xml:space="preserve"> untuk email berformat benar — terdaftar maupun belum. Kalau endpoint ini membedakan keduanya, siapa pun bisa memakainya untuk mengecek email mana yang punya akun.</w:t>
+        <w:t xml:space="preserve"> untuk email berformat benar — terdaftar maupun belum. Kalau endpoint ini membedakan keduanya, siapa pun bisa memakainya untuk </w:t>
+      </w:r>
+      <w:r>
+        <w:t>mengecek email mana yang punya akun.</w:t>
       </w:r>
     </w:p>
     <w:p>
@@ -12019,7 +12196,10 @@
         <w:t>400 locked</w:t>
       </w:r>
       <w:r>
-        <w:t xml:space="preserve"> (jatah tebakan habis), </w:t>
+        <w:t xml:space="preserve"> </w:t>
+      </w:r>
+      <w:r>
+        <w:t xml:space="preserve">(jatah tebakan habis), </w:t>
       </w:r>
       <w:r>
         <w:rPr>
@@ -12405,7 +12585,10 @@
         <w:t>validateRoleRequest</w:t>
       </w:r>
       <w:r>
-        <w:t>), sehingga server tidak pernah menerima apa yang layar tolak, maupun sebaliknya.</w:t>
+        <w:t>), sehingga server tidak pernah menerima apa yang layar</w:t>
+      </w:r>
+      <w:r>
+        <w:t xml:space="preserve"> tolak, maupun sebaliknya.</w:t>
       </w:r>
     </w:p>
     <w:p>
@@ -12684,7 +12867,10 @@
         <w:pStyle w:val="BodyText"/>
       </w:pPr>
       <w:r>
-        <w:t>Menghapus lewat Firebase Console hanya menghapus data di Auth dan meninggalkan dokumen Firestore yang menumpuk di daftar pengguna. Route ini sekaligus membersihkan sisa akun yang terlanjur dihapus dari Console.</w:t>
+        <w:t xml:space="preserve">Menghapus lewat Firebase Console hanya menghapus data di Auth dan meninggalkan dokumen Firestore yang menumpuk di daftar pengguna. Route ini sekaligus </w:t>
+      </w:r>
+      <w:r>
+        <w:t>membersihkan sisa akun yang terlanjur dihapus dari Console.</w:t>
       </w:r>
     </w:p>
     <w:p>
@@ -12951,8 +13137,13 @@
     </w:p>
     <w:p>
       <w:r>
-        <w:pict w14:anchorId="2ADFD23A">
-          <v:rect id="Horizontal Line 11" o:spid="_x0000_s1035" alt="" style="width:451.3pt;height:1.1pt;visibility:visible;mso-wrap-style:square;mso-width-percent:0;mso-height-percent:0;mso-left-percent:-10001;mso-top-percent:-10001;mso-position-horizontal:absolute;mso-position-horizontal-relative:char;mso-position-vertical:absolute;mso-position-vertical-relative:line;mso-width-percent:0;mso-height-percent:0;mso-left-percent:-10001;mso-top-percent:-10001;v-text-anchor:top" filled="f">
+        <w:rPr>
+          <w:noProof/>
+        </w:rPr>
+      </w:r>
+      <w:r>
+        <w:pict>
+          <v:rect id="Horizontal Line 11" o:spid="_x0000_s1035" style="width:451.3pt;height:1.1pt;visibility:visible;mso-wrap-style:square;mso-left-percent:-10001;mso-top-percent:-10001;mso-position-horizontal:absolute;mso-position-horizontal-relative:char;mso-position-vertical:absolute;mso-position-vertical-relative:line;mso-left-percent:-10001;mso-top-percent:-10001;v-text-anchor:top" o:gfxdata="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" filled="f">
             <o:lock v:ext="edit" rotation="t" aspectratio="t" verticies="t" text="t" shapetype="t"/>
             <w10:anchorlock/>
           </v:rect>
@@ -12964,7 +13155,7 @@
         <w:pStyle w:val="Heading2"/>
       </w:pPr>
       <w:bookmarkStart w:id="55" w:name="alur-pembayaran-midtrans"/>
-      <w:bookmarkStart w:id="56" w:name="_Toc239211936"/>
+      <w:bookmarkStart w:id="56" w:name="_Toc239212840"/>
       <w:bookmarkEnd w:id="43"/>
       <w:bookmarkEnd w:id="54"/>
       <w:r>
@@ -13343,7 +13534,10 @@
         <w:t>onSnapshot</w:t>
       </w:r>
       <w:r>
-        <w:t xml:space="preserve"> di langkah 8. Pemanggilannya diletakkan di </w:t>
+        <w:t xml:space="preserve"> </w:t>
+      </w:r>
+      <w:r>
+        <w:t xml:space="preserve">di langkah 8. Pemanggilannya diletakkan di </w:t>
       </w:r>
       <w:r>
         <w:rPr>
@@ -13465,7 +13659,10 @@
         <w:t>jumlah-beda</w:t>
       </w:r>
       <w:r>
-        <w:t xml:space="preserve">) sama-sama berarti uang sudah diterima untuk sesuatu yang tidak bisa dipetakan ke tiket. Keduanya tidak boleh diam-diam jadi tiket, dan tidak boleh diam-diam hilang — jadi ditulis ke </w:t>
+        <w:t xml:space="preserve">) sama-sama berarti uang sudah diterima untuk sesuatu </w:t>
+      </w:r>
+      <w:r>
+        <w:t xml:space="preserve">yang tidak bisa dipetakan ke tiket. Keduanya tidak boleh diam-diam jadi tiket, dan tidak boleh diam-diam hilang — jadi ditulis ke </w:t>
       </w:r>
       <w:r>
         <w:rPr>
@@ -13501,79 +13698,44 @@
           <w:b/>
           <w:bCs/>
         </w:rPr>
-        <w:t>Layar “Lunas” ditentukan dokumen booking, bukan callback Snap.</w:t>
-      </w:r>
-      <w:r>
-        <w:t xml:space="preserve"> Callback </w:t>
-      </w:r>
-      <w:r>
-        <w:rPr>
-          <w:rStyle w:val="VerbatimChar"/>
-        </w:rPr>
-        <w:t>onSuccess</w:t>
-      </w:r>
-      <w:r>
-        <w:t xml:space="preserve"> berjalan di browser pembeli dan bisa dipanggil siapa saja dari konsol. Yang menulis </w:t>
-      </w:r>
-      <w:r>
-        <w:rPr>
-          <w:rStyle w:val="VerbatimChar"/>
-        </w:rPr>
-        <w:t>paid</w:t>
-      </w:r>
-      <w:r>
-        <w:t xml:space="preserve"> hanya webhook, jadi di situlah kabarnya ditunggu — lewat </w:t>
-      </w:r>
-      <w:r>
-        <w:rPr>
-          <w:rStyle w:val="VerbatimChar"/>
-        </w:rPr>
-        <w:t>onSnapshot</w:t>
-      </w:r>
-      <w:r>
-        <w:t>, tanpa polling sama sekali.</w:t>
-      </w:r>
-    </w:p>
-    <w:p>
-      <w:pPr>
-        <w:pStyle w:val="BodyText"/>
-      </w:pPr>
+        <w:t xml:space="preserve">Layar “Lunas” </w:t>
+      </w:r>
       <w:r>
         <w:rPr>
           <w:b/>
           <w:bCs/>
         </w:rPr>
-        <w:t>Penahanan kursi 15 menit</w:t>
-      </w:r>
-      <w:r>
-        <w:t xml:space="preserve"> (</w:t>
-      </w:r>
-      <w:r>
-        <w:rPr>
-          <w:rStyle w:val="VerbatimChar"/>
-        </w:rPr>
-        <w:t>HOLD_MENIT</w:t>
-      </w:r>
-      <w:r>
-        <w:t xml:space="preserve">). Selama jendela itu, booking dihitung sebagai pemakai stok meski belum lunas — uang bisa diambil sebelum webhook memberi tahu kita. Kalau pembayaran gagal atau kedaluwarsa, </w:t>
-      </w:r>
-      <w:r>
-        <w:rPr>
-          <w:rStyle w:val="VerbatimChar"/>
-        </w:rPr>
-        <w:t>paymentStatus</w:t>
-      </w:r>
-      <w:r>
-        <w:t xml:space="preserve"> kembali ke </w:t>
-      </w:r>
-      <w:r>
-        <w:rPr>
-          <w:rStyle w:val="VerbatimChar"/>
-        </w:rPr>
-        <w:t>unpaid</w:t>
-      </w:r>
-      <w:r>
-        <w:t xml:space="preserve"> dan penahanannya lepas.</w:t>
+        <w:t>ditentukan dokumen booking, bukan callback Snap.</w:t>
+      </w:r>
+      <w:r>
+        <w:t xml:space="preserve"> Callback </w:t>
+      </w:r>
+      <w:r>
+        <w:rPr>
+          <w:rStyle w:val="VerbatimChar"/>
+        </w:rPr>
+        <w:t>onSuccess</w:t>
+      </w:r>
+      <w:r>
+        <w:t xml:space="preserve"> berjalan di browser pembeli dan bisa dipanggil siapa saja dari konsol. Yang menulis </w:t>
+      </w:r>
+      <w:r>
+        <w:rPr>
+          <w:rStyle w:val="VerbatimChar"/>
+        </w:rPr>
+        <w:t>paid</w:t>
+      </w:r>
+      <w:r>
+        <w:t xml:space="preserve"> hanya webhook, jadi di situlah kabarnya ditunggu — lewat </w:t>
+      </w:r>
+      <w:r>
+        <w:rPr>
+          <w:rStyle w:val="VerbatimChar"/>
+        </w:rPr>
+        <w:t>onSnapshot</w:t>
+      </w:r>
+      <w:r>
+        <w:t>, tanpa polling sama sekali.</w:t>
       </w:r>
     </w:p>
     <w:p>
@@ -13585,6 +13747,51 @@
           <w:b/>
           <w:bCs/>
         </w:rPr>
+        <w:t>Penahanan kursi 15 menit</w:t>
+      </w:r>
+      <w:r>
+        <w:t xml:space="preserve"> (</w:t>
+      </w:r>
+      <w:r>
+        <w:rPr>
+          <w:rStyle w:val="VerbatimChar"/>
+        </w:rPr>
+        <w:t>HOLD_MENIT</w:t>
+      </w:r>
+      <w:r>
+        <w:t xml:space="preserve">). Selama jendela itu, booking dihitung sebagai pemakai stok meski belum lunas — uang bisa diambil sebelum webhook memberi tahu kita. Kalau pembayaran gagal atau kedaluwarsa, </w:t>
+      </w:r>
+      <w:r>
+        <w:rPr>
+          <w:rStyle w:val="VerbatimChar"/>
+        </w:rPr>
+        <w:t>paymentStatus</w:t>
+      </w:r>
+      <w:r>
+        <w:t xml:space="preserve"> kembali ke </w:t>
+      </w:r>
+      <w:r>
+        <w:rPr>
+          <w:rStyle w:val="VerbatimChar"/>
+        </w:rPr>
+        <w:t>unpaid</w:t>
+      </w:r>
+      <w:r>
+        <w:t xml:space="preserve"> </w:t>
+      </w:r>
+      <w:r>
+        <w:t>dan penahanannya lepas.</w:t>
+      </w:r>
+    </w:p>
+    <w:p>
+      <w:pPr>
+        <w:pStyle w:val="BodyText"/>
+      </w:pPr>
+      <w:r>
+        <w:rPr>
+          <w:b/>
+          <w:bCs/>
+        </w:rPr>
         <w:t>Menekan bayar dua kali mengembalikan token yang sama.</w:t>
       </w:r>
       <w:r>
@@ -13665,7 +13872,10 @@
         <w:t>MIDTRANS_NOTIFICATION_URL</w:t>
       </w:r>
       <w:r>
-        <w:t xml:space="preserve"> ke alamat itu.</w:t>
+        <w:t xml:space="preserve"> </w:t>
+      </w:r>
+      <w:r>
+        <w:t>ke alamat itu.</w:t>
       </w:r>
     </w:p>
     <w:p>
@@ -13792,8 +14002,13 @@
     </w:p>
     <w:p>
       <w:r>
-        <w:pict w14:anchorId="6CAC0EED">
-          <v:rect id="Horizontal Line 12" o:spid="_x0000_s1034" alt="" style="width:451.3pt;height:1.1pt;visibility:visible;mso-wrap-style:square;mso-width-percent:0;mso-height-percent:0;mso-left-percent:-10001;mso-top-percent:-10001;mso-position-horizontal:absolute;mso-position-horizontal-relative:char;mso-position-vertical:absolute;mso-position-vertical-relative:line;mso-width-percent:0;mso-height-percent:0;mso-left-percent:-10001;mso-top-percent:-10001;v-text-anchor:top" filled="f">
+        <w:rPr>
+          <w:noProof/>
+        </w:rPr>
+      </w:r>
+      <w:r>
+        <w:pict>
+          <v:rect id="Horizontal Line 12" o:spid="_x0000_s1034" style="width:451.3pt;height:1.1pt;visibility:visible;mso-wrap-style:square;mso-left-percent:-10001;mso-top-percent:-10001;mso-position-horizontal:absolute;mso-position-horizontal-relative:char;mso-position-vertical:absolute;mso-position-vertical-relative:line;mso-left-percent:-10001;mso-top-percent:-10001;v-text-anchor:top" o:gfxdata="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" filled="f">
             <o:lock v:ext="edit" rotation="t" aspectratio="t" verticies="t" text="t" shapetype="t"/>
             <w10:anchorlock/>
           </v:rect>
@@ -13805,7 +14020,7 @@
         <w:pStyle w:val="Heading2"/>
       </w:pPr>
       <w:bookmarkStart w:id="62" w:name="dua-bahasa-i18n"/>
-      <w:bookmarkStart w:id="63" w:name="_Toc239211937"/>
+      <w:bookmarkStart w:id="63" w:name="_Toc239212841"/>
       <w:bookmarkEnd w:id="55"/>
       <w:bookmarkEnd w:id="61"/>
       <w:r>
@@ -14185,8 +14400,13 @@
     </w:p>
     <w:p>
       <w:r>
-        <w:pict w14:anchorId="2D9F40CE">
-          <v:rect id="Horizontal Line 13" o:spid="_x0000_s1033" alt="" style="width:451.3pt;height:1.1pt;visibility:visible;mso-wrap-style:square;mso-width-percent:0;mso-height-percent:0;mso-left-percent:-10001;mso-top-percent:-10001;mso-position-horizontal:absolute;mso-position-horizontal-relative:char;mso-position-vertical:absolute;mso-position-vertical-relative:line;mso-width-percent:0;mso-height-percent:0;mso-left-percent:-10001;mso-top-percent:-10001;v-text-anchor:top" filled="f">
+        <w:rPr>
+          <w:noProof/>
+        </w:rPr>
+      </w:r>
+      <w:r>
+        <w:pict>
+          <v:rect id="Horizontal Line 13" o:spid="_x0000_s1033" style="width:451.3pt;height:1.1pt;visibility:visible;mso-wrap-style:square;mso-left-percent:-10001;mso-top-percent:-10001;mso-position-horizontal:absolute;mso-position-horizontal-relative:char;mso-position-vertical:absolute;mso-position-vertical-relative:line;mso-left-percent:-10001;mso-top-percent:-10001;v-text-anchor:top" o:gfxdata="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" filled="f">
             <o:lock v:ext="edit" rotation="t" aspectratio="t" verticies="t" text="t" shapetype="t"/>
             <w10:anchorlock/>
           </v:rect>
@@ -14198,7 +14418,7 @@
         <w:pStyle w:val="Heading2"/>
       </w:pPr>
       <w:bookmarkStart w:id="64" w:name="tema-dan-token-desain"/>
-      <w:bookmarkStart w:id="65" w:name="_Toc239211938"/>
+      <w:bookmarkStart w:id="65" w:name="_Toc239212842"/>
       <w:bookmarkEnd w:id="62"/>
       <w:r>
         <w:t>13. Tema dan Token Desain</w:t>
@@ -14242,7 +14462,10 @@
         <w:t>tailwind.config.ts</w:t>
       </w:r>
       <w:r>
-        <w:t xml:space="preserve"> — memetakan token itu ke kelas Tailwind (</w:t>
+        <w:t xml:space="preserve"> </w:t>
+      </w:r>
+      <w:r>
+        <w:t>— memetakan token itu ke kelas Tailwind (</w:t>
       </w:r>
       <w:r>
         <w:rPr>
@@ -14366,7 +14589,10 @@
         <w:t>Font:</w:t>
       </w:r>
       <w:r>
-        <w:t xml:space="preserve"> Figtree (sans) dan Cormorant (serif), dimuat lewat </w:t>
+        <w:t xml:space="preserve"> </w:t>
+      </w:r>
+      <w:r>
+        <w:t xml:space="preserve">Figtree (sans) dan Cormorant (serif), dimuat lewat </w:t>
       </w:r>
       <w:r>
         <w:rPr>
@@ -14398,8 +14624,13 @@
     </w:p>
     <w:p>
       <w:r>
-        <w:pict w14:anchorId="0CCFA32D">
-          <v:rect id="Horizontal Line 14" o:spid="_x0000_s1032" alt="" style="width:451.3pt;height:1.1pt;visibility:visible;mso-wrap-style:square;mso-width-percent:0;mso-height-percent:0;mso-left-percent:-10001;mso-top-percent:-10001;mso-position-horizontal:absolute;mso-position-horizontal-relative:char;mso-position-vertical:absolute;mso-position-vertical-relative:line;mso-width-percent:0;mso-height-percent:0;mso-left-percent:-10001;mso-top-percent:-10001;v-text-anchor:top" filled="f">
+        <w:rPr>
+          <w:noProof/>
+        </w:rPr>
+      </w:r>
+      <w:r>
+        <w:pict>
+          <v:rect id="Horizontal Line 14" o:spid="_x0000_s1032" style="width:451.3pt;height:1.1pt;visibility:visible;mso-wrap-style:square;mso-left-percent:-10001;mso-top-percent:-10001;mso-position-horizontal:absolute;mso-position-horizontal-relative:char;mso-position-vertical:absolute;mso-position-vertical-relative:line;mso-left-percent:-10001;mso-top-percent:-10001;v-text-anchor:top" o:gfxdata="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" filled="f">
             <o:lock v:ext="edit" rotation="t" aspectratio="t" verticies="t" text="t" shapetype="t"/>
             <w10:anchorlock/>
           </v:rect>
@@ -14411,7 +14642,7 @@
         <w:pStyle w:val="Heading2"/>
       </w:pPr>
       <w:bookmarkStart w:id="66" w:name="pwa-dan-service-worker"/>
-      <w:bookmarkStart w:id="67" w:name="_Toc239211939"/>
+      <w:bookmarkStart w:id="67" w:name="_Toc239212843"/>
       <w:bookmarkEnd w:id="64"/>
       <w:r>
         <w:t>14. PWA dan Service Worker</w:t>
@@ -14534,7 +14765,10 @@
         <w:t>NODE_ENV === 'production'</w:t>
       </w:r>
       <w:r>
-        <w:t xml:space="preserve">). Di lingkungan pengembangan, shell yang ter-cache akan menutupi hasil edit dan membuat </w:t>
+        <w:t xml:space="preserve">). </w:t>
+      </w:r>
+      <w:r>
+        <w:t xml:space="preserve">Di lingkungan pengembangan, shell yang ter-cache akan menutupi hasil edit dan membuat </w:t>
       </w:r>
       <w:r>
         <w:rPr>
@@ -14549,8 +14783,13 @@
     </w:p>
     <w:p>
       <w:r>
-        <w:pict w14:anchorId="696BE39D">
-          <v:rect id="Horizontal Line 15" o:spid="_x0000_s1031" alt="" style="width:451.3pt;height:1.1pt;visibility:visible;mso-wrap-style:square;mso-width-percent:0;mso-height-percent:0;mso-left-percent:-10001;mso-top-percent:-10001;mso-position-horizontal:absolute;mso-position-horizontal-relative:char;mso-position-vertical:absolute;mso-position-vertical-relative:line;mso-width-percent:0;mso-height-percent:0;mso-left-percent:-10001;mso-top-percent:-10001;v-text-anchor:top" filled="f">
+        <w:rPr>
+          <w:noProof/>
+        </w:rPr>
+      </w:r>
+      <w:r>
+        <w:pict>
+          <v:rect id="Horizontal Line 15" o:spid="_x0000_s1031" style="width:451.3pt;height:1.1pt;visibility:visible;mso-wrap-style:square;mso-left-percent:-10001;mso-top-percent:-10001;mso-position-horizontal:absolute;mso-position-horizontal-relative:char;mso-position-vertical:absolute;mso-position-vertical-relative:line;mso-left-percent:-10001;mso-top-percent:-10001;v-text-anchor:top" o:gfxdata="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" filled="f">
             <o:lock v:ext="edit" rotation="t" aspectratio="t" verticies="t" text="t" shapetype="t"/>
             <w10:anchorlock/>
           </v:rect>
@@ -14562,7 +14801,7 @@
         <w:pStyle w:val="Heading2"/>
       </w:pPr>
       <w:bookmarkStart w:id="68" w:name="server-kamera-dan-deteksi-karang"/>
-      <w:bookmarkStart w:id="69" w:name="_Toc239211940"/>
+      <w:bookmarkStart w:id="69" w:name="_Toc239212844"/>
       <w:bookmarkEnd w:id="66"/>
       <w:r>
         <w:t>15. Server Kamera dan Deteksi Karang</w:t>
@@ -15064,7 +15303,10 @@
         <w:t>hanya berjalan saat kamera sedang ditonton</w:t>
       </w:r>
       <w:r>
-        <w:t>. Model YOLO dimuat per kamera saat penonton pertama datang, dan dilepas kira-kira 30 detik setelah penonton terakhir pergi. Statistik dan riwayat terkumpul selama sesi menonton.</w:t>
+        <w:t xml:space="preserve">. Model YOLO dimuat per kamera saat penonton pertama datang, dan dilepas kira-kira 30 detik setelah </w:t>
+      </w:r>
+      <w:r>
+        <w:t>penonton terakhir pergi. Statistik dan riwayat terkumpul selama sesi menonton.</w:t>
       </w:r>
     </w:p>
     <w:p>
@@ -15343,8 +15585,13 @@
     </w:tbl>
     <w:p>
       <w:r>
-        <w:pict w14:anchorId="40B58A64">
-          <v:rect id="Horizontal Line 16" o:spid="_x0000_s1030" alt="" style="width:451.3pt;height:1.1pt;visibility:visible;mso-wrap-style:square;mso-width-percent:0;mso-height-percent:0;mso-left-percent:-10001;mso-top-percent:-10001;mso-position-horizontal:absolute;mso-position-horizontal-relative:char;mso-position-vertical:absolute;mso-position-vertical-relative:line;mso-width-percent:0;mso-height-percent:0;mso-left-percent:-10001;mso-top-percent:-10001;v-text-anchor:top" filled="f">
+        <w:rPr>
+          <w:noProof/>
+        </w:rPr>
+      </w:r>
+      <w:r>
+        <w:pict>
+          <v:rect id="Horizontal Line 16" o:spid="_x0000_s1030" style="width:451.3pt;height:1.1pt;visibility:visible;mso-wrap-style:square;mso-left-percent:-10001;mso-top-percent:-10001;mso-position-horizontal:absolute;mso-position-horizontal-relative:char;mso-position-vertical:absolute;mso-position-vertical-relative:line;mso-left-percent:-10001;mso-top-percent:-10001;v-text-anchor:top" o:gfxdata="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" filled="f">
             <o:lock v:ext="edit" rotation="t" aspectratio="t" verticies="t" text="t" shapetype="t"/>
             <w10:anchorlock/>
           </v:rect>
@@ -15356,7 +15603,7 @@
         <w:pStyle w:val="Heading2"/>
       </w:pPr>
       <w:bookmarkStart w:id="75" w:name="firmware-stasiun-sensor"/>
-      <w:bookmarkStart w:id="76" w:name="_Toc239211941"/>
+      <w:bookmarkStart w:id="76" w:name="_Toc239212845"/>
       <w:bookmarkEnd w:id="68"/>
       <w:bookmarkEnd w:id="74"/>
       <w:r>
@@ -16333,8 +16580,13 @@
     </w:p>
     <w:p>
       <w:r>
-        <w:pict w14:anchorId="1FFEEE58">
-          <v:rect id="Horizontal Line 17" o:spid="_x0000_s1029" alt="" style="width:451.3pt;height:1.1pt;visibility:visible;mso-wrap-style:square;mso-width-percent:0;mso-height-percent:0;mso-left-percent:-10001;mso-top-percent:-10001;mso-position-horizontal:absolute;mso-position-horizontal-relative:char;mso-position-vertical:absolute;mso-position-vertical-relative:line;mso-width-percent:0;mso-height-percent:0;mso-left-percent:-10001;mso-top-percent:-10001;v-text-anchor:top" filled="f">
+        <w:rPr>
+          <w:noProof/>
+        </w:rPr>
+      </w:r>
+      <w:r>
+        <w:pict>
+          <v:rect id="Horizontal Line 17" o:spid="_x0000_s1029" style="width:451.3pt;height:1.1pt;visibility:visible;mso-wrap-style:square;mso-left-percent:-10001;mso-top-percent:-10001;mso-position-horizontal:absolute;mso-position-horizontal-relative:char;mso-position-vertical:absolute;mso-position-vertical-relative:line;mso-left-percent:-10001;mso-top-percent:-10001;v-text-anchor:top" o:gfxdata="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" filled="f">
             <o:lock v:ext="edit" rotation="t" aspectratio="t" verticies="t" text="t" shapetype="t"/>
             <w10:anchorlock/>
           </v:rect>
@@ -16346,7 +16598,7 @@
         <w:pStyle w:val="Heading2"/>
       </w:pPr>
       <w:bookmarkStart w:id="83" w:name="penerapan-deployment"/>
-      <w:bookmarkStart w:id="84" w:name="_Toc239211942"/>
+      <w:bookmarkStart w:id="84" w:name="_Toc239212846"/>
       <w:bookmarkEnd w:id="75"/>
       <w:bookmarkEnd w:id="82"/>
       <w:r>
@@ -16487,7 +16739,10 @@
         <w:t>.vercelignore</w:t>
       </w:r>
       <w:r>
-        <w:t xml:space="preserve">. Deploy lewat integrasi Git memakai isi repositori sehingga </w:t>
+        <w:t xml:space="preserve">. Deploy </w:t>
+      </w:r>
+      <w:r>
+        <w:t xml:space="preserve">lewat integrasi Git memakai isi repositori sehingga </w:t>
       </w:r>
       <w:r>
         <w:rPr>
@@ -16918,8 +17173,13 @@
     </w:p>
     <w:p>
       <w:r>
-        <w:pict w14:anchorId="1C9BF88E">
-          <v:rect id="Horizontal Line 18" o:spid="_x0000_s1028" alt="" style="width:451.3pt;height:1.1pt;visibility:visible;mso-wrap-style:square;mso-width-percent:0;mso-height-percent:0;mso-left-percent:-10001;mso-top-percent:-10001;mso-position-horizontal:absolute;mso-position-horizontal-relative:char;mso-position-vertical:absolute;mso-position-vertical-relative:line;mso-width-percent:0;mso-height-percent:0;mso-left-percent:-10001;mso-top-percent:-10001;v-text-anchor:top" filled="f">
+        <w:rPr>
+          <w:noProof/>
+        </w:rPr>
+      </w:r>
+      <w:r>
+        <w:pict>
+          <v:rect id="Horizontal Line 18" o:spid="_x0000_s1028" style="width:451.3pt;height:1.1pt;visibility:visible;mso-wrap-style:square;mso-left-percent:-10001;mso-top-percent:-10001;mso-position-horizontal:absolute;mso-position-horizontal-relative:char;mso-position-vertical:absolute;mso-position-vertical-relative:line;mso-left-percent:-10001;mso-top-percent:-10001;v-text-anchor:top" o:gfxdata="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" filled="f">
             <o:lock v:ext="edit" rotation="t" aspectratio="t" verticies="t" text="t" shapetype="t"/>
             <w10:anchorlock/>
           </v:rect>
@@ -16931,7 +17191,7 @@
         <w:pStyle w:val="Heading2"/>
       </w:pPr>
       <w:bookmarkStart w:id="90" w:name="pengujian"/>
-      <w:bookmarkStart w:id="91" w:name="_Toc239211943"/>
+      <w:bookmarkStart w:id="91" w:name="_Toc239212847"/>
       <w:bookmarkEnd w:id="83"/>
       <w:bookmarkEnd w:id="89"/>
       <w:r>
@@ -17475,7 +17735,10 @@
         <w:t>.</w:t>
       </w:r>
       <w:r>
-        <w:t xml:space="preserve"> ESM Node menuntut akhiran yang eksplisit, sedangkan bundler Next.js menerima bentuk tanpa akhiran. Modul yang punya berkas uji dan meng-</w:t>
+        <w:t xml:space="preserve"> ESM Node menuntut akhiran yang eksplisit, sedangkan bundler Next.js menerima bentuk tanpa akhiran. </w:t>
+      </w:r>
+      <w:r>
+        <w:t>Modul yang punya berkas uji dan meng-</w:t>
       </w:r>
       <w:r>
         <w:rPr>
@@ -17612,7 +17875,10 @@
         <w:t>sebagai pengguna asli</w:t>
       </w:r>
       <w:r>
-        <w:t xml:space="preserve">, lewat Web SDK dan ID token sungguhan — bukan lewat Admin SDK yang melewati semua pemeriksaan. Keduanya membaca </w:t>
+        <w:t xml:space="preserve">, lewat Web </w:t>
+      </w:r>
+      <w:r>
+        <w:t xml:space="preserve">SDK dan ID token sungguhan — bukan lewat Admin SDK yang melewati semua pemeriksaan. Keduanya membaca </w:t>
       </w:r>
       <w:r>
         <w:rPr>
@@ -17745,7 +18011,10 @@
         <w:t>bookings.probe.mjs</w:t>
       </w:r>
       <w:r>
-        <w:t xml:space="preserve"> membuktikan bahwa harga tidak bisa dikarang klien, status dan pembayaran tidak bisa ditulis sendiri, satu QR hanya bisa dipakai sekali, dan tiket yang belum dibayar ditolak di gerbang check-in.</w:t>
+        <w:t xml:space="preserve"> </w:t>
+      </w:r>
+      <w:r>
+        <w:t>membuktikan bahwa harga tidak bisa dikarang klien, status dan pembayaran tidak bisa ditulis sendiri, satu QR hanya bisa dipakai sekali, dan tiket yang belum dibayar ditolak di gerbang check-in.</w:t>
       </w:r>
     </w:p>
     <w:p>
@@ -17786,7 +18055,10 @@
         <w:t>destinasi/</w:t>
       </w:r>
       <w:r>
-        <w:t>, penelusuran isi bucket, dan penghapusan dari klien. Karena aturannya butuh waktu menyebar, skrip ini berjalan dua putaran berjarak; hasil yang sama dua kali baru bisa dipercaya.</w:t>
+        <w:t xml:space="preserve">, penelusuran isi bucket, dan penghapusan dari klien. </w:t>
+      </w:r>
+      <w:r>
+        <w:t>Karena aturannya butuh waktu menyebar, skrip ini berjalan dua putaran berjarak; hasil yang sama dua kali baru bisa dipercaya.</w:t>
       </w:r>
     </w:p>
     <w:p>
@@ -17924,8 +18196,13 @@
     </w:p>
     <w:p>
       <w:r>
-        <w:pict w14:anchorId="354478B7">
-          <v:rect id="Horizontal Line 19" o:spid="_x0000_s1027" alt="" style="width:451.3pt;height:1.1pt;visibility:visible;mso-wrap-style:square;mso-width-percent:0;mso-height-percent:0;mso-left-percent:-10001;mso-top-percent:-10001;mso-position-horizontal:absolute;mso-position-horizontal-relative:char;mso-position-vertical:absolute;mso-position-vertical-relative:line;mso-width-percent:0;mso-height-percent:0;mso-left-percent:-10001;mso-top-percent:-10001;v-text-anchor:top" filled="f">
+        <w:rPr>
+          <w:noProof/>
+        </w:rPr>
+      </w:r>
+      <w:r>
+        <w:pict>
+          <v:rect id="Horizontal Line 19" o:spid="_x0000_s1027" style="width:451.3pt;height:1.1pt;visibility:visible;mso-wrap-style:square;mso-left-percent:-10001;mso-top-percent:-10001;mso-position-horizontal:absolute;mso-position-horizontal-relative:char;mso-position-vertical:absolute;mso-position-vertical-relative:line;mso-left-percent:-10001;mso-top-percent:-10001;v-text-anchor:top" o:gfxdata="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" filled="f">
             <o:lock v:ext="edit" rotation="t" aspectratio="t" verticies="t" text="t" shapetype="t"/>
             <w10:anchorlock/>
           </v:rect>
@@ -17937,7 +18214,7 @@
         <w:pStyle w:val="Heading2"/>
       </w:pPr>
       <w:bookmarkStart w:id="96" w:name="pemeliharaan-dan-pemecahan-masalah"/>
-      <w:bookmarkStart w:id="97" w:name="_Toc239211944"/>
+      <w:bookmarkStart w:id="97" w:name="_Toc239212848"/>
       <w:bookmarkEnd w:id="90"/>
       <w:bookmarkEnd w:id="95"/>
       <w:r>
@@ -18351,7 +18628,10 @@
         <w:t>stationId</w:t>
       </w:r>
       <w:r>
-        <w:t xml:space="preserve"> di dokumen destinasi </w:t>
+        <w:t xml:space="preserve"> </w:t>
+      </w:r>
+      <w:r>
+        <w:t xml:space="preserve">di dokumen destinasi </w:t>
       </w:r>
       <w:r>
         <w:rPr>
@@ -18461,7 +18741,10 @@
         <w:t>try/catch</w:t>
       </w:r>
       <w:r>
-        <w:t xml:space="preserve"> sinkron. Jangan menyederhanakannya kembali menjadi rantai promise.</w:t>
+        <w:t xml:space="preserve"> </w:t>
+      </w:r>
+      <w:r>
+        <w:t>sinkron. Jangan menyederhanakannya kembali menjadi rantai promise.</w:t>
       </w:r>
     </w:p>
     <w:p>
@@ -18614,7 +18897,10 @@
         <w:t>storage.rules</w:t>
       </w:r>
       <w:r>
-        <w:t xml:space="preserve"> gagal untuk </w:t>
+        <w:t xml:space="preserve"> </w:t>
+      </w:r>
+      <w:r>
+        <w:t xml:space="preserve">gagal untuk </w:t>
       </w:r>
       <w:r>
         <w:rPr>
@@ -18745,7 +19031,10 @@
         <w:t>Yes</w:t>
       </w:r>
       <w:r>
-        <w:t xml:space="preserve">. Kalau pertanyaannya tidak muncul, berikan manual lewat Google Cloud Console › IAM: centang </w:t>
+        <w:t xml:space="preserve">. Kalau </w:t>
+      </w:r>
+      <w:r>
+        <w:t xml:space="preserve">pertanyaannya tidak muncul, berikan manual lewat Google Cloud Console › IAM: centang </w:t>
       </w:r>
       <w:r>
         <w:rPr>
@@ -19051,8 +19340,13 @@
     </w:tbl>
     <w:p>
       <w:r>
-        <w:pict w14:anchorId="70172E7A">
-          <v:rect id="Horizontal Line 20" o:spid="_x0000_s1026" alt="" style="width:451.3pt;height:1.1pt;visibility:visible;mso-wrap-style:square;mso-width-percent:0;mso-height-percent:0;mso-left-percent:-10001;mso-top-percent:-10001;mso-position-horizontal:absolute;mso-position-horizontal-relative:char;mso-position-vertical:absolute;mso-position-vertical-relative:line;mso-width-percent:0;mso-height-percent:0;mso-left-percent:-10001;mso-top-percent:-10001;v-text-anchor:top" filled="f">
+        <w:rPr>
+          <w:noProof/>
+        </w:rPr>
+      </w:r>
+      <w:r>
+        <w:pict>
+          <v:rect id="Horizontal Line 20" o:spid="_x0000_s1026" style="width:451.3pt;height:1.1pt;visibility:visible;mso-wrap-style:square;mso-left-percent:-10001;mso-top-percent:-10001;mso-position-horizontal:absolute;mso-position-horizontal-relative:char;mso-position-vertical:absolute;mso-position-vertical-relative:line;mso-left-percent:-10001;mso-top-percent:-10001;v-text-anchor:top" o:gfxdata="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" filled="f">
             <o:lock v:ext="edit" rotation="t" aspectratio="t" verticies="t" text="t" shapetype="t"/>
             <w10:anchorlock/>
           </v:rect>
@@ -19064,7 +19358,7 @@
         <w:pStyle w:val="Heading2"/>
       </w:pPr>
       <w:bookmarkStart w:id="106" w:name="dokumen-terkait"/>
-      <w:bookmarkStart w:id="107" w:name="_Toc239211945"/>
+      <w:bookmarkStart w:id="107" w:name="_Toc239212849"/>
       <w:bookmarkEnd w:id="96"/>
       <w:bookmarkEnd w:id="105"/>
       <w:r>
@@ -19744,22 +20038,22 @@
       </w:pPr>
     </w:lvl>
   </w:abstractNum>
-  <w:num w:numId="1" w16cid:durableId="97138765">
+  <w:num w:numId="1" w16cid:durableId="1720088409">
     <w:abstractNumId w:val="0"/>
   </w:num>
-  <w:num w:numId="2" w16cid:durableId="27071685">
+  <w:num w:numId="2" w16cid:durableId="1269972978">
     <w:abstractNumId w:val="1"/>
   </w:num>
-  <w:num w:numId="3" w16cid:durableId="1803690256">
+  <w:num w:numId="3" w16cid:durableId="1536504341">
     <w:abstractNumId w:val="1"/>
   </w:num>
-  <w:num w:numId="4" w16cid:durableId="164978453">
+  <w:num w:numId="4" w16cid:durableId="1572304152">
     <w:abstractNumId w:val="1"/>
   </w:num>
-  <w:num w:numId="5" w16cid:durableId="909847363">
+  <w:num w:numId="5" w16cid:durableId="175465437">
     <w:abstractNumId w:val="1"/>
   </w:num>
-  <w:num w:numId="6" w16cid:durableId="274681891">
+  <w:num w:numId="6" w16cid:durableId="1368064300">
     <w:abstractNumId w:val="3"/>
     <w:lvlOverride w:ilvl="0">
       <w:startOverride w:val="1"/>
@@ -19789,19 +20083,19 @@
       <w:startOverride w:val="1"/>
     </w:lvlOverride>
   </w:num>
-  <w:num w:numId="7" w16cid:durableId="743837602">
+  <w:num w:numId="7" w16cid:durableId="5988143">
     <w:abstractNumId w:val="1"/>
   </w:num>
-  <w:num w:numId="8" w16cid:durableId="135073531">
+  <w:num w:numId="8" w16cid:durableId="525217283">
     <w:abstractNumId w:val="1"/>
   </w:num>
-  <w:num w:numId="9" w16cid:durableId="976111405">
+  <w:num w:numId="9" w16cid:durableId="1581207406">
     <w:abstractNumId w:val="1"/>
   </w:num>
-  <w:num w:numId="10" w16cid:durableId="102723728">
+  <w:num w:numId="10" w16cid:durableId="160316465">
     <w:abstractNumId w:val="1"/>
   </w:num>
-  <w:num w:numId="11" w16cid:durableId="11882342">
+  <w:num w:numId="11" w16cid:durableId="591427018">
     <w:abstractNumId w:val="3"/>
     <w:lvlOverride w:ilvl="0">
       <w:startOverride w:val="1"/>
@@ -19831,7 +20125,7 @@
       <w:startOverride w:val="1"/>
     </w:lvlOverride>
   </w:num>
-  <w:num w:numId="12" w16cid:durableId="347416196">
+  <w:num w:numId="12" w16cid:durableId="1378317542">
     <w:abstractNumId w:val="3"/>
     <w:lvlOverride w:ilvl="0">
       <w:startOverride w:val="1"/>
@@ -19861,13 +20155,13 @@
       <w:startOverride w:val="1"/>
     </w:lvlOverride>
   </w:num>
-  <w:num w:numId="13" w16cid:durableId="1089733876">
+  <w:num w:numId="13" w16cid:durableId="491720200">
     <w:abstractNumId w:val="1"/>
   </w:num>
-  <w:num w:numId="14" w16cid:durableId="89088867">
+  <w:num w:numId="14" w16cid:durableId="715548578">
     <w:abstractNumId w:val="1"/>
   </w:num>
-  <w:num w:numId="15" w16cid:durableId="1074670443">
+  <w:num w:numId="15" w16cid:durableId="159001945">
     <w:abstractNumId w:val="3"/>
     <w:lvlOverride w:ilvl="0">
       <w:startOverride w:val="1"/>
@@ -19897,7 +20191,7 @@
       <w:startOverride w:val="1"/>
     </w:lvlOverride>
   </w:num>
-  <w:num w:numId="16" w16cid:durableId="1517503460">
+  <w:num w:numId="16" w16cid:durableId="912357609">
     <w:abstractNumId w:val="3"/>
     <w:lvlOverride w:ilvl="0">
       <w:startOverride w:val="1"/>
@@ -19927,7 +20221,7 @@
       <w:startOverride w:val="1"/>
     </w:lvlOverride>
   </w:num>
-  <w:num w:numId="17" w16cid:durableId="323515175">
+  <w:num w:numId="17" w16cid:durableId="904877426">
     <w:abstractNumId w:val="3"/>
     <w:lvlOverride w:ilvl="0">
       <w:startOverride w:val="1"/>
@@ -19957,25 +20251,25 @@
       <w:startOverride w:val="1"/>
     </w:lvlOverride>
   </w:num>
-  <w:num w:numId="18" w16cid:durableId="1478106565">
+  <w:num w:numId="18" w16cid:durableId="259802480">
     <w:abstractNumId w:val="2"/>
   </w:num>
-  <w:num w:numId="19" w16cid:durableId="1902131465">
+  <w:num w:numId="19" w16cid:durableId="557397422">
     <w:abstractNumId w:val="2"/>
   </w:num>
-  <w:num w:numId="20" w16cid:durableId="473259416">
+  <w:num w:numId="20" w16cid:durableId="875234063">
     <w:abstractNumId w:val="2"/>
   </w:num>
-  <w:num w:numId="21" w16cid:durableId="1042630185">
+  <w:num w:numId="21" w16cid:durableId="1053506893">
     <w:abstractNumId w:val="2"/>
   </w:num>
-  <w:num w:numId="22" w16cid:durableId="1316955273">
+  <w:num w:numId="22" w16cid:durableId="1047992037">
     <w:abstractNumId w:val="2"/>
   </w:num>
-  <w:num w:numId="23" w16cid:durableId="550921454">
+  <w:num w:numId="23" w16cid:durableId="1606116307">
     <w:abstractNumId w:val="2"/>
   </w:num>
-  <w:num w:numId="24" w16cid:durableId="2068256587">
+  <w:num w:numId="24" w16cid:durableId="1948582039">
     <w:abstractNumId w:val="3"/>
     <w:lvlOverride w:ilvl="0">
       <w:startOverride w:val="1"/>
@@ -20005,7 +20299,7 @@
       <w:startOverride w:val="1"/>
     </w:lvlOverride>
   </w:num>
-  <w:num w:numId="25" w16cid:durableId="1488008934">
+  <w:num w:numId="25" w16cid:durableId="222563780">
     <w:abstractNumId w:val="3"/>
     <w:lvlOverride w:ilvl="0">
       <w:startOverride w:val="1"/>
@@ -20035,7 +20329,7 @@
       <w:startOverride w:val="1"/>
     </w:lvlOverride>
   </w:num>
-  <w:num w:numId="26" w16cid:durableId="1169057049">
+  <w:num w:numId="26" w16cid:durableId="1546287494">
     <w:abstractNumId w:val="3"/>
     <w:lvlOverride w:ilvl="0">
       <w:startOverride w:val="1"/>
@@ -20065,7 +20359,7 @@
       <w:startOverride w:val="1"/>
     </w:lvlOverride>
   </w:num>
-  <w:num w:numId="27" w16cid:durableId="1878857358">
+  <w:num w:numId="27" w16cid:durableId="567762488">
     <w:abstractNumId w:val="3"/>
     <w:lvlOverride w:ilvl="0">
       <w:startOverride w:val="1"/>
@@ -20095,7 +20389,7 @@
       <w:startOverride w:val="1"/>
     </w:lvlOverride>
   </w:num>
-  <w:num w:numId="28" w16cid:durableId="1785614343">
+  <w:num w:numId="28" w16cid:durableId="1171066572">
     <w:abstractNumId w:val="3"/>
     <w:lvlOverride w:ilvl="0">
       <w:startOverride w:val="1"/>
@@ -20125,7 +20419,7 @@
       <w:startOverride w:val="1"/>
     </w:lvlOverride>
   </w:num>
-  <w:num w:numId="29" w16cid:durableId="991449738">
+  <w:num w:numId="29" w16cid:durableId="1588072034">
     <w:abstractNumId w:val="3"/>
     <w:lvlOverride w:ilvl="0">
       <w:startOverride w:val="1"/>

</xml_diff>

<commit_message>
docs: label sensor dan langkah uji bayar di manual teknis diperbaiki
- §19 masih memakai label lama "—" dan "tidak live" untuk stasiun yang
  tidak mengirim data. LiveMonitorPanel.tsx sebenarnya menampilkan "--"
  dan "Offline". Kekeliruan yang sama sudah diperbaiki di panduan
  pengguna; ini salinan terakhirnya.
- Langkah pascadeploy "bayar dengan nominal kecil" tidak menyebut bahwa
  transaksi masih Sandbox selama MIDTRANS_IS_PRODUCTION belum dinyalakan.
- .vercelignore menahan .serena/ seperti direktori perkakas lainnya.

Claude-Session: https://claude.ai/code/session_01PYMt6hsthcQuhzPcgW4eZk
</commit_message>
<xml_diff>
--- a/docs/Manual-Teknis-Nusa.docx
+++ b/docs/Manual-Teknis-Nusa.docx
@@ -17882,7 +17882,34 @@
         </w:numPr>
       </w:pPr>
       <w:r>
-        <w:t xml:space="preserve">Buat satu booking uji dan bayar dengan nominal kecil.</w:t>
+        <w:t xml:space="preserve">Buat satu booking uji dan selesaikan pembayarannya. Selama</w:t>
+      </w:r>
+      <w:r>
+        <w:t xml:space="preserve"> </w:t>
+      </w:r>
+      <w:r>
+        <w:rPr>
+          <w:rStyle w:val="VerbatimChar"/>
+        </w:rPr>
+        <w:t xml:space="preserve">MIDTRANS_IS_PRODUCTION</w:t>
+      </w:r>
+      <w:r>
+        <w:t xml:space="preserve"> </w:t>
+      </w:r>
+      <w:r>
+        <w:t xml:space="preserve">belum dinyalakan, transaksinya memakai Sandbox</w:t>
+      </w:r>
+      <w:r>
+        <w:t xml:space="preserve"> </w:t>
+      </w:r>
+      <w:r>
+        <w:t xml:space="preserve">dan tidak memindahkan uang; setelah beralih ke produksi, ulangi dengan</w:t>
+      </w:r>
+      <w:r>
+        <w:t xml:space="preserve"> </w:t>
+      </w:r>
+      <w:r>
+        <w:t xml:space="preserve">nominal kecil sungguhan.</w:t>
       </w:r>
     </w:p>
     <w:p>
@@ -19997,13 +20024,13 @@
       </w:r>
     </w:p>
     <w:bookmarkEnd w:id="992"/>
-    <w:bookmarkStart w:id="993" w:name="sensor-menampilkan--atau-tidak-live"/>
+    <w:bookmarkStart w:id="993" w:name="Xbc2d8ec0820bc45f28e1abd4c11c8326c3a15a9"/>
     <w:p>
       <w:pPr>
         <w:pStyle w:val="Heading3"/>
       </w:pPr>
       <w:r>
-        <w:t xml:space="preserve">Sensor menampilkan "—" atau "tidak live"</w:t>
+        <w:t xml:space="preserve">Sensor menampilkan "--" atau berlabel "Offline"</w:t>
       </w:r>
     </w:p>
     <w:p>

</xml_diff>

<commit_message>
build: kedua buku .docx dibangun ulang
Menyusul penggantian simbol pada sumber .md. Daftar isi disegarkan lagi
lewat scripts/refresh-toc.applescript — manual 89 entri, panduan 44 entri.

Claude-Session: https://claude.ai/code/session_013oqRf8Gz9nLGeVMue6eVEd
</commit_message>
<xml_diff>
--- a/docs/Manual-Teknis-Nusa.docx
+++ b/docs/Manual-Teknis-Nusa.docx
@@ -10,7 +10,7 @@
           <w:sz w:val="24"/>
           <w:szCs w:val="24"/>
         </w:rPr>
-        <w:id w:val="174013061"/>
+        <w:id w:val="-1501800840"/>
         <w:docPartObj>
           <w:docPartGallery w:val="Table of Contents"/>
           <w:docPartUnique/>
@@ -49,7 +49,7 @@
           <w:r>
             <w:fldChar w:fldCharType="separate"/>
           </w:r>
-          <w:hyperlink w:anchor="_Toc239342171" w:history="1">
+          <w:hyperlink w:anchor="_Toc239344065" w:history="1">
             <w:r>
               <w:rPr>
                 <w:rStyle w:val="Hyperlink"/>
@@ -76,7 +76,7 @@
                 <w:noProof/>
                 <w:webHidden/>
               </w:rPr>
-              <w:instrText xml:space="preserve"> PAGEREF _Toc239342171 \h </w:instrText>
+              <w:instrText xml:space="preserve"> PAGEREF _Toc239344065 \h </w:instrText>
             </w:r>
             <w:r>
               <w:rPr>
@@ -121,7 +121,7 @@
               <w14:ligatures w14:val="standardContextual"/>
             </w:rPr>
           </w:pPr>
-          <w:hyperlink w:anchor="_Toc239342172" w:history="1">
+          <w:hyperlink w:anchor="_Toc239344066" w:history="1">
             <w:r>
               <w:rPr>
                 <w:rStyle w:val="Hyperlink"/>
@@ -148,7 +148,7 @@
                 <w:noProof/>
                 <w:webHidden/>
               </w:rPr>
-              <w:instrText xml:space="preserve"> PAGEREF _Toc239342172 \h </w:instrText>
+              <w:instrText xml:space="preserve"> PAGEREF _Toc239344066 \h </w:instrText>
             </w:r>
             <w:r>
               <w:rPr>
@@ -193,7 +193,7 @@
               <w14:ligatures w14:val="standardContextual"/>
             </w:rPr>
           </w:pPr>
-          <w:hyperlink w:anchor="_Toc239342173" w:history="1">
+          <w:hyperlink w:anchor="_Toc239344067" w:history="1">
             <w:r>
               <w:rPr>
                 <w:rStyle w:val="Hyperlink"/>
@@ -220,7 +220,7 @@
                 <w:noProof/>
                 <w:webHidden/>
               </w:rPr>
-              <w:instrText xml:space="preserve"> PAGEREF _Toc239342173 \h </w:instrText>
+              <w:instrText xml:space="preserve"> PAGEREF _Toc239344067 \h </w:instrText>
             </w:r>
             <w:r>
               <w:rPr>
@@ -265,7 +265,7 @@
               <w14:ligatures w14:val="standardContextual"/>
             </w:rPr>
           </w:pPr>
-          <w:hyperlink w:anchor="_Toc239342174" w:history="1">
+          <w:hyperlink w:anchor="_Toc239344068" w:history="1">
             <w:r>
               <w:rPr>
                 <w:rStyle w:val="Hyperlink"/>
@@ -292,7 +292,7 @@
                 <w:noProof/>
                 <w:webHidden/>
               </w:rPr>
-              <w:instrText xml:space="preserve"> PAGEREF _Toc239342174 \h </w:instrText>
+              <w:instrText xml:space="preserve"> PAGEREF _Toc239344068 \h </w:instrText>
             </w:r>
             <w:r>
               <w:rPr>
@@ -337,7 +337,7 @@
               <w14:ligatures w14:val="standardContextual"/>
             </w:rPr>
           </w:pPr>
-          <w:hyperlink w:anchor="_Toc239342175" w:history="1">
+          <w:hyperlink w:anchor="_Toc239344069" w:history="1">
             <w:r>
               <w:rPr>
                 <w:rStyle w:val="Hyperlink"/>
@@ -364,7 +364,7 @@
                 <w:noProof/>
                 <w:webHidden/>
               </w:rPr>
-              <w:instrText xml:space="preserve"> PAGEREF _Toc239342175 \h </w:instrText>
+              <w:instrText xml:space="preserve"> PAGEREF _Toc239344069 \h </w:instrText>
             </w:r>
             <w:r>
               <w:rPr>
@@ -409,7 +409,7 @@
               <w14:ligatures w14:val="standardContextual"/>
             </w:rPr>
           </w:pPr>
-          <w:hyperlink w:anchor="_Toc239342176" w:history="1">
+          <w:hyperlink w:anchor="_Toc239344070" w:history="1">
             <w:r>
               <w:rPr>
                 <w:rStyle w:val="Hyperlink"/>
@@ -436,7 +436,7 @@
                 <w:noProof/>
                 <w:webHidden/>
               </w:rPr>
-              <w:instrText xml:space="preserve"> PAGEREF _Toc239342176 \h </w:instrText>
+              <w:instrText xml:space="preserve"> PAGEREF _Toc239344070 \h </w:instrText>
             </w:r>
             <w:r>
               <w:rPr>
@@ -481,7 +481,7 @@
               <w14:ligatures w14:val="standardContextual"/>
             </w:rPr>
           </w:pPr>
-          <w:hyperlink w:anchor="_Toc239342177" w:history="1">
+          <w:hyperlink w:anchor="_Toc239344071" w:history="1">
             <w:r>
               <w:rPr>
                 <w:rStyle w:val="Hyperlink"/>
@@ -508,7 +508,7 @@
                 <w:noProof/>
                 <w:webHidden/>
               </w:rPr>
-              <w:instrText xml:space="preserve"> PAGEREF _Toc239342177 \h </w:instrText>
+              <w:instrText xml:space="preserve"> PAGEREF _Toc239344071 \h </w:instrText>
             </w:r>
             <w:r>
               <w:rPr>
@@ -553,7 +553,7 @@
               <w14:ligatures w14:val="standardContextual"/>
             </w:rPr>
           </w:pPr>
-          <w:hyperlink w:anchor="_Toc239342178" w:history="1">
+          <w:hyperlink w:anchor="_Toc239344072" w:history="1">
             <w:r>
               <w:rPr>
                 <w:rStyle w:val="Hyperlink"/>
@@ -580,7 +580,7 @@
                 <w:noProof/>
                 <w:webHidden/>
               </w:rPr>
-              <w:instrText xml:space="preserve"> PAGEREF _Toc239342178 \h </w:instrText>
+              <w:instrText xml:space="preserve"> PAGEREF _Toc239344072 \h </w:instrText>
             </w:r>
             <w:r>
               <w:rPr>
@@ -625,7 +625,7 @@
               <w14:ligatures w14:val="standardContextual"/>
             </w:rPr>
           </w:pPr>
-          <w:hyperlink w:anchor="_Toc239342179" w:history="1">
+          <w:hyperlink w:anchor="_Toc239344073" w:history="1">
             <w:r>
               <w:rPr>
                 <w:rStyle w:val="Hyperlink"/>
@@ -652,7 +652,7 @@
                 <w:noProof/>
                 <w:webHidden/>
               </w:rPr>
-              <w:instrText xml:space="preserve"> PAGEREF _Toc239342179 \h </w:instrText>
+              <w:instrText xml:space="preserve"> PAGEREF _Toc239344073 \h </w:instrText>
             </w:r>
             <w:r>
               <w:rPr>
@@ -697,7 +697,7 @@
               <w14:ligatures w14:val="standardContextual"/>
             </w:rPr>
           </w:pPr>
-          <w:hyperlink w:anchor="_Toc239342180" w:history="1">
+          <w:hyperlink w:anchor="_Toc239344074" w:history="1">
             <w:r>
               <w:rPr>
                 <w:rStyle w:val="Hyperlink"/>
@@ -724,7 +724,7 @@
                 <w:noProof/>
                 <w:webHidden/>
               </w:rPr>
-              <w:instrText xml:space="preserve"> PAGEREF _Toc239342180 \h </w:instrText>
+              <w:instrText xml:space="preserve"> PAGEREF _Toc239344074 \h </w:instrText>
             </w:r>
             <w:r>
               <w:rPr>
@@ -769,7 +769,7 @@
               <w14:ligatures w14:val="standardContextual"/>
             </w:rPr>
           </w:pPr>
-          <w:hyperlink w:anchor="_Toc239342181" w:history="1">
+          <w:hyperlink w:anchor="_Toc239344075" w:history="1">
             <w:r>
               <w:rPr>
                 <w:rStyle w:val="Hyperlink"/>
@@ -796,7 +796,7 @@
                 <w:noProof/>
                 <w:webHidden/>
               </w:rPr>
-              <w:instrText xml:space="preserve"> PAGEREF _Toc239342181 \h </w:instrText>
+              <w:instrText xml:space="preserve"> PAGEREF _Toc239344075 \h </w:instrText>
             </w:r>
             <w:r>
               <w:rPr>
@@ -841,7 +841,7 @@
               <w14:ligatures w14:val="standardContextual"/>
             </w:rPr>
           </w:pPr>
-          <w:hyperlink w:anchor="_Toc239342182" w:history="1">
+          <w:hyperlink w:anchor="_Toc239344076" w:history="1">
             <w:r>
               <w:rPr>
                 <w:rStyle w:val="Hyperlink"/>
@@ -868,7 +868,7 @@
                 <w:noProof/>
                 <w:webHidden/>
               </w:rPr>
-              <w:instrText xml:space="preserve"> PAGEREF _Toc239342182 \h </w:instrText>
+              <w:instrText xml:space="preserve"> PAGEREF _Toc239344076 \h </w:instrText>
             </w:r>
             <w:r>
               <w:rPr>
@@ -913,7 +913,7 @@
               <w14:ligatures w14:val="standardContextual"/>
             </w:rPr>
           </w:pPr>
-          <w:hyperlink w:anchor="_Toc239342183" w:history="1">
+          <w:hyperlink w:anchor="_Toc239344077" w:history="1">
             <w:r>
               <w:rPr>
                 <w:rStyle w:val="Hyperlink"/>
@@ -940,7 +940,7 @@
                 <w:noProof/>
                 <w:webHidden/>
               </w:rPr>
-              <w:instrText xml:space="preserve"> PAGEREF _Toc239342183 \h </w:instrText>
+              <w:instrText xml:space="preserve"> PAGEREF _Toc239344077 \h </w:instrText>
             </w:r>
             <w:r>
               <w:rPr>
@@ -985,7 +985,7 @@
               <w14:ligatures w14:val="standardContextual"/>
             </w:rPr>
           </w:pPr>
-          <w:hyperlink w:anchor="_Toc239342184" w:history="1">
+          <w:hyperlink w:anchor="_Toc239344078" w:history="1">
             <w:r>
               <w:rPr>
                 <w:rStyle w:val="Hyperlink"/>
@@ -1012,7 +1012,7 @@
                 <w:noProof/>
                 <w:webHidden/>
               </w:rPr>
-              <w:instrText xml:space="preserve"> PAGEREF _Toc239342184 \h </w:instrText>
+              <w:instrText xml:space="preserve"> PAGEREF _Toc239344078 \h </w:instrText>
             </w:r>
             <w:r>
               <w:rPr>
@@ -1057,7 +1057,7 @@
               <w14:ligatures w14:val="standardContextual"/>
             </w:rPr>
           </w:pPr>
-          <w:hyperlink w:anchor="_Toc239342185" w:history="1">
+          <w:hyperlink w:anchor="_Toc239344079" w:history="1">
             <w:r>
               <w:rPr>
                 <w:rStyle w:val="Hyperlink"/>
@@ -1084,7 +1084,7 @@
                 <w:noProof/>
                 <w:webHidden/>
               </w:rPr>
-              <w:instrText xml:space="preserve"> PAGEREF _Toc239342185 \h </w:instrText>
+              <w:instrText xml:space="preserve"> PAGEREF _Toc239344079 \h </w:instrText>
             </w:r>
             <w:r>
               <w:rPr>
@@ -1129,7 +1129,7 @@
               <w14:ligatures w14:val="standardContextual"/>
             </w:rPr>
           </w:pPr>
-          <w:hyperlink w:anchor="_Toc239342186" w:history="1">
+          <w:hyperlink w:anchor="_Toc239344080" w:history="1">
             <w:r>
               <w:rPr>
                 <w:rStyle w:val="Hyperlink"/>
@@ -1156,7 +1156,7 @@
                 <w:noProof/>
                 <w:webHidden/>
               </w:rPr>
-              <w:instrText xml:space="preserve"> PAGEREF _Toc239342186 \h </w:instrText>
+              <w:instrText xml:space="preserve"> PAGEREF _Toc239344080 \h </w:instrText>
             </w:r>
             <w:r>
               <w:rPr>
@@ -1201,7 +1201,7 @@
               <w14:ligatures w14:val="standardContextual"/>
             </w:rPr>
           </w:pPr>
-          <w:hyperlink w:anchor="_Toc239342187" w:history="1">
+          <w:hyperlink w:anchor="_Toc239344081" w:history="1">
             <w:r>
               <w:rPr>
                 <w:rStyle w:val="Hyperlink"/>
@@ -1228,7 +1228,7 @@
                 <w:noProof/>
                 <w:webHidden/>
               </w:rPr>
-              <w:instrText xml:space="preserve"> PAGEREF _Toc239342187 \h </w:instrText>
+              <w:instrText xml:space="preserve"> PAGEREF _Toc239344081 \h </w:instrText>
             </w:r>
             <w:r>
               <w:rPr>
@@ -1273,7 +1273,7 @@
               <w14:ligatures w14:val="standardContextual"/>
             </w:rPr>
           </w:pPr>
-          <w:hyperlink w:anchor="_Toc239342188" w:history="1">
+          <w:hyperlink w:anchor="_Toc239344082" w:history="1">
             <w:r>
               <w:rPr>
                 <w:rStyle w:val="Hyperlink"/>
@@ -1300,7 +1300,7 @@
                 <w:noProof/>
                 <w:webHidden/>
               </w:rPr>
-              <w:instrText xml:space="preserve"> PAGEREF _Toc239342188 \h </w:instrText>
+              <w:instrText xml:space="preserve"> PAGEREF _Toc239344082 \h </w:instrText>
             </w:r>
             <w:r>
               <w:rPr>
@@ -1345,7 +1345,7 @@
               <w14:ligatures w14:val="standardContextual"/>
             </w:rPr>
           </w:pPr>
-          <w:hyperlink w:anchor="_Toc239342189" w:history="1">
+          <w:hyperlink w:anchor="_Toc239344083" w:history="1">
             <w:r>
               <w:rPr>
                 <w:rStyle w:val="Hyperlink"/>
@@ -1372,7 +1372,7 @@
                 <w:noProof/>
                 <w:webHidden/>
               </w:rPr>
-              <w:instrText xml:space="preserve"> PAGEREF _Toc239342189 \h </w:instrText>
+              <w:instrText xml:space="preserve"> PAGEREF _Toc239344083 \h </w:instrText>
             </w:r>
             <w:r>
               <w:rPr>
@@ -1417,7 +1417,7 @@
               <w14:ligatures w14:val="standardContextual"/>
             </w:rPr>
           </w:pPr>
-          <w:hyperlink w:anchor="_Toc239342190" w:history="1">
+          <w:hyperlink w:anchor="_Toc239344084" w:history="1">
             <w:r>
               <w:rPr>
                 <w:rStyle w:val="Hyperlink"/>
@@ -1444,7 +1444,7 @@
                 <w:noProof/>
                 <w:webHidden/>
               </w:rPr>
-              <w:instrText xml:space="preserve"> PAGEREF _Toc239342190 \h </w:instrText>
+              <w:instrText xml:space="preserve"> PAGEREF _Toc239344084 \h </w:instrText>
             </w:r>
             <w:r>
               <w:rPr>
@@ -1489,7 +1489,7 @@
               <w14:ligatures w14:val="standardContextual"/>
             </w:rPr>
           </w:pPr>
-          <w:hyperlink w:anchor="_Toc239342191" w:history="1">
+          <w:hyperlink w:anchor="_Toc239344085" w:history="1">
             <w:r>
               <w:rPr>
                 <w:rStyle w:val="Hyperlink"/>
@@ -1516,7 +1516,7 @@
                 <w:noProof/>
                 <w:webHidden/>
               </w:rPr>
-              <w:instrText xml:space="preserve"> PAGEREF _Toc239342191 \h </w:instrText>
+              <w:instrText xml:space="preserve"> PAGEREF _Toc239344085 \h </w:instrText>
             </w:r>
             <w:r>
               <w:rPr>
@@ -1561,7 +1561,7 @@
               <w14:ligatures w14:val="standardContextual"/>
             </w:rPr>
           </w:pPr>
-          <w:hyperlink w:anchor="_Toc239342192" w:history="1">
+          <w:hyperlink w:anchor="_Toc239344086" w:history="1">
             <w:r>
               <w:rPr>
                 <w:rStyle w:val="Hyperlink"/>
@@ -1588,7 +1588,7 @@
                 <w:noProof/>
                 <w:webHidden/>
               </w:rPr>
-              <w:instrText xml:space="preserve"> PAGEREF _Toc239342192 \h </w:instrText>
+              <w:instrText xml:space="preserve"> PAGEREF _Toc239344086 \h </w:instrText>
             </w:r>
             <w:r>
               <w:rPr>
@@ -1633,7 +1633,7 @@
               <w14:ligatures w14:val="standardContextual"/>
             </w:rPr>
           </w:pPr>
-          <w:hyperlink w:anchor="_Toc239342193" w:history="1">
+          <w:hyperlink w:anchor="_Toc239344087" w:history="1">
             <w:r>
               <w:rPr>
                 <w:rStyle w:val="Hyperlink"/>
@@ -1660,7 +1660,7 @@
                 <w:noProof/>
                 <w:webHidden/>
               </w:rPr>
-              <w:instrText xml:space="preserve"> PAGEREF _Toc239342193 \h </w:instrText>
+              <w:instrText xml:space="preserve"> PAGEREF _Toc239344087 \h </w:instrText>
             </w:r>
             <w:r>
               <w:rPr>
@@ -1705,7 +1705,7 @@
               <w14:ligatures w14:val="standardContextual"/>
             </w:rPr>
           </w:pPr>
-          <w:hyperlink w:anchor="_Toc239342194" w:history="1">
+          <w:hyperlink w:anchor="_Toc239344088" w:history="1">
             <w:r>
               <w:rPr>
                 <w:rStyle w:val="Hyperlink"/>
@@ -1740,7 +1740,7 @@
                 <w:noProof/>
                 <w:webHidden/>
               </w:rPr>
-              <w:instrText xml:space="preserve"> PAGEREF _Toc239342194 \h </w:instrText>
+              <w:instrText xml:space="preserve"> PAGEREF _Toc239344088 \h </w:instrText>
             </w:r>
             <w:r>
               <w:rPr>
@@ -1785,7 +1785,7 @@
               <w14:ligatures w14:val="standardContextual"/>
             </w:rPr>
           </w:pPr>
-          <w:hyperlink w:anchor="_Toc239342195" w:history="1">
+          <w:hyperlink w:anchor="_Toc239344089" w:history="1">
             <w:r>
               <w:rPr>
                 <w:rStyle w:val="Hyperlink"/>
@@ -1812,7 +1812,7 @@
                 <w:noProof/>
                 <w:webHidden/>
               </w:rPr>
-              <w:instrText xml:space="preserve"> PAGEREF _Toc239342195 \h </w:instrText>
+              <w:instrText xml:space="preserve"> PAGEREF _Toc239344089 \h </w:instrText>
             </w:r>
             <w:r>
               <w:rPr>
@@ -1857,7 +1857,7 @@
               <w14:ligatures w14:val="standardContextual"/>
             </w:rPr>
           </w:pPr>
-          <w:hyperlink w:anchor="_Toc239342196" w:history="1">
+          <w:hyperlink w:anchor="_Toc239344090" w:history="1">
             <w:r>
               <w:rPr>
                 <w:rStyle w:val="Hyperlink"/>
@@ -1884,7 +1884,7 @@
                 <w:noProof/>
                 <w:webHidden/>
               </w:rPr>
-              <w:instrText xml:space="preserve"> PAGEREF _Toc239342196 \h </w:instrText>
+              <w:instrText xml:space="preserve"> PAGEREF _Toc239344090 \h </w:instrText>
             </w:r>
             <w:r>
               <w:rPr>
@@ -1929,7 +1929,7 @@
               <w14:ligatures w14:val="standardContextual"/>
             </w:rPr>
           </w:pPr>
-          <w:hyperlink w:anchor="_Toc239342197" w:history="1">
+          <w:hyperlink w:anchor="_Toc239344091" w:history="1">
             <w:r>
               <w:rPr>
                 <w:rStyle w:val="Hyperlink"/>
@@ -1956,7 +1956,7 @@
                 <w:noProof/>
                 <w:webHidden/>
               </w:rPr>
-              <w:instrText xml:space="preserve"> PAGEREF _Toc239342197 \h </w:instrText>
+              <w:instrText xml:space="preserve"> PAGEREF _Toc239344091 \h </w:instrText>
             </w:r>
             <w:r>
               <w:rPr>
@@ -2001,7 +2001,7 @@
               <w14:ligatures w14:val="standardContextual"/>
             </w:rPr>
           </w:pPr>
-          <w:hyperlink w:anchor="_Toc239342198" w:history="1">
+          <w:hyperlink w:anchor="_Toc239344092" w:history="1">
             <w:r>
               <w:rPr>
                 <w:rStyle w:val="Hyperlink"/>
@@ -2028,7 +2028,7 @@
                 <w:noProof/>
                 <w:webHidden/>
               </w:rPr>
-              <w:instrText xml:space="preserve"> PAGEREF _Toc239342198 \h </w:instrText>
+              <w:instrText xml:space="preserve"> PAGEREF _Toc239344092 \h </w:instrText>
             </w:r>
             <w:r>
               <w:rPr>
@@ -2073,7 +2073,7 @@
               <w14:ligatures w14:val="standardContextual"/>
             </w:rPr>
           </w:pPr>
-          <w:hyperlink w:anchor="_Toc239342199" w:history="1">
+          <w:hyperlink w:anchor="_Toc239344093" w:history="1">
             <w:r>
               <w:rPr>
                 <w:rStyle w:val="Hyperlink"/>
@@ -2100,7 +2100,7 @@
                 <w:noProof/>
                 <w:webHidden/>
               </w:rPr>
-              <w:instrText xml:space="preserve"> PAGEREF _Toc239342199 \h </w:instrText>
+              <w:instrText xml:space="preserve"> PAGEREF _Toc239344093 \h </w:instrText>
             </w:r>
             <w:r>
               <w:rPr>
@@ -2145,7 +2145,7 @@
               <w14:ligatures w14:val="standardContextual"/>
             </w:rPr>
           </w:pPr>
-          <w:hyperlink w:anchor="_Toc239342200" w:history="1">
+          <w:hyperlink w:anchor="_Toc239344094" w:history="1">
             <w:r>
               <w:rPr>
                 <w:rStyle w:val="Hyperlink"/>
@@ -2172,7 +2172,7 @@
                 <w:noProof/>
                 <w:webHidden/>
               </w:rPr>
-              <w:instrText xml:space="preserve"> PAGEREF _Toc239342200 \h </w:instrText>
+              <w:instrText xml:space="preserve"> PAGEREF _Toc239344094 \h </w:instrText>
             </w:r>
             <w:r>
               <w:rPr>
@@ -2217,7 +2217,7 @@
               <w14:ligatures w14:val="standardContextual"/>
             </w:rPr>
           </w:pPr>
-          <w:hyperlink w:anchor="_Toc239342201" w:history="1">
+          <w:hyperlink w:anchor="_Toc239344095" w:history="1">
             <w:r>
               <w:rPr>
                 <w:rStyle w:val="Hyperlink"/>
@@ -2244,7 +2244,7 @@
                 <w:noProof/>
                 <w:webHidden/>
               </w:rPr>
-              <w:instrText xml:space="preserve"> PAGEREF _Toc239342201 \h </w:instrText>
+              <w:instrText xml:space="preserve"> PAGEREF _Toc239344095 \h </w:instrText>
             </w:r>
             <w:r>
               <w:rPr>
@@ -2289,7 +2289,7 @@
               <w14:ligatures w14:val="standardContextual"/>
             </w:rPr>
           </w:pPr>
-          <w:hyperlink w:anchor="_Toc239342202" w:history="1">
+          <w:hyperlink w:anchor="_Toc239344096" w:history="1">
             <w:r>
               <w:rPr>
                 <w:rStyle w:val="Hyperlink"/>
@@ -2316,7 +2316,7 @@
                 <w:noProof/>
                 <w:webHidden/>
               </w:rPr>
-              <w:instrText xml:space="preserve"> PAGEREF _Toc239342202 \h </w:instrText>
+              <w:instrText xml:space="preserve"> PAGEREF _Toc239344096 \h </w:instrText>
             </w:r>
             <w:r>
               <w:rPr>
@@ -2361,7 +2361,7 @@
               <w14:ligatures w14:val="standardContextual"/>
             </w:rPr>
           </w:pPr>
-          <w:hyperlink w:anchor="_Toc239342203" w:history="1">
+          <w:hyperlink w:anchor="_Toc239344097" w:history="1">
             <w:r>
               <w:rPr>
                 <w:rStyle w:val="Hyperlink"/>
@@ -2388,7 +2388,7 @@
                 <w:noProof/>
                 <w:webHidden/>
               </w:rPr>
-              <w:instrText xml:space="preserve"> PAGEREF _Toc239342203 \h </w:instrText>
+              <w:instrText xml:space="preserve"> PAGEREF _Toc239344097 \h </w:instrText>
             </w:r>
             <w:r>
               <w:rPr>
@@ -2433,7 +2433,7 @@
               <w14:ligatures w14:val="standardContextual"/>
             </w:rPr>
           </w:pPr>
-          <w:hyperlink w:anchor="_Toc239342204" w:history="1">
+          <w:hyperlink w:anchor="_Toc239344098" w:history="1">
             <w:r>
               <w:rPr>
                 <w:rStyle w:val="Hyperlink"/>
@@ -2460,7 +2460,7 @@
                 <w:noProof/>
                 <w:webHidden/>
               </w:rPr>
-              <w:instrText xml:space="preserve"> PAGEREF _Toc239342204 \h </w:instrText>
+              <w:instrText xml:space="preserve"> PAGEREF _Toc239344098 \h </w:instrText>
             </w:r>
             <w:r>
               <w:rPr>
@@ -2505,7 +2505,7 @@
               <w14:ligatures w14:val="standardContextual"/>
             </w:rPr>
           </w:pPr>
-          <w:hyperlink w:anchor="_Toc239342205" w:history="1">
+          <w:hyperlink w:anchor="_Toc239344099" w:history="1">
             <w:r>
               <w:rPr>
                 <w:rStyle w:val="Hyperlink"/>
@@ -2532,7 +2532,7 @@
                 <w:noProof/>
                 <w:webHidden/>
               </w:rPr>
-              <w:instrText xml:space="preserve"> PAGEREF _Toc239342205 \h </w:instrText>
+              <w:instrText xml:space="preserve"> PAGEREF _Toc239344099 \h </w:instrText>
             </w:r>
             <w:r>
               <w:rPr>
@@ -2577,7 +2577,7 @@
               <w14:ligatures w14:val="standardContextual"/>
             </w:rPr>
           </w:pPr>
-          <w:hyperlink w:anchor="_Toc239342206" w:history="1">
+          <w:hyperlink w:anchor="_Toc239344100" w:history="1">
             <w:r>
               <w:rPr>
                 <w:rStyle w:val="Hyperlink"/>
@@ -2604,7 +2604,7 @@
                 <w:noProof/>
                 <w:webHidden/>
               </w:rPr>
-              <w:instrText xml:space="preserve"> PAGEREF _Toc239342206 \h </w:instrText>
+              <w:instrText xml:space="preserve"> PAGEREF _Toc239344100 \h </w:instrText>
             </w:r>
             <w:r>
               <w:rPr>
@@ -2649,7 +2649,7 @@
               <w14:ligatures w14:val="standardContextual"/>
             </w:rPr>
           </w:pPr>
-          <w:hyperlink w:anchor="_Toc239342207" w:history="1">
+          <w:hyperlink w:anchor="_Toc239344101" w:history="1">
             <w:r>
               <w:rPr>
                 <w:rStyle w:val="Hyperlink"/>
@@ -2677,7 +2677,7 @@
                 <w:noProof/>
                 <w:webHidden/>
               </w:rPr>
-              <w:instrText xml:space="preserve"> PAGEREF _Toc239342207 \h </w:instrText>
+              <w:instrText xml:space="preserve"> PAGEREF _Toc239344101 \h </w:instrText>
             </w:r>
             <w:r>
               <w:rPr>
@@ -2722,7 +2722,7 @@
               <w14:ligatures w14:val="standardContextual"/>
             </w:rPr>
           </w:pPr>
-          <w:hyperlink w:anchor="_Toc239342208" w:history="1">
+          <w:hyperlink w:anchor="_Toc239344102" w:history="1">
             <w:r>
               <w:rPr>
                 <w:rStyle w:val="Hyperlink"/>
@@ -2750,7 +2750,7 @@
                 <w:noProof/>
                 <w:webHidden/>
               </w:rPr>
-              <w:instrText xml:space="preserve"> PAGEREF _Toc239342208 \h </w:instrText>
+              <w:instrText xml:space="preserve"> PAGEREF _Toc239344102 \h </w:instrText>
             </w:r>
             <w:r>
               <w:rPr>
@@ -2795,7 +2795,7 @@
               <w14:ligatures w14:val="standardContextual"/>
             </w:rPr>
           </w:pPr>
-          <w:hyperlink w:anchor="_Toc239342209" w:history="1">
+          <w:hyperlink w:anchor="_Toc239344103" w:history="1">
             <w:r>
               <w:rPr>
                 <w:rStyle w:val="Hyperlink"/>
@@ -2823,7 +2823,7 @@
                 <w:noProof/>
                 <w:webHidden/>
               </w:rPr>
-              <w:instrText xml:space="preserve"> PAGEREF _Toc239342209 \h </w:instrText>
+              <w:instrText xml:space="preserve"> PAGEREF _Toc239344103 \h </w:instrText>
             </w:r>
             <w:r>
               <w:rPr>
@@ -2868,7 +2868,7 @@
               <w14:ligatures w14:val="standardContextual"/>
             </w:rPr>
           </w:pPr>
-          <w:hyperlink w:anchor="_Toc239342210" w:history="1">
+          <w:hyperlink w:anchor="_Toc239344104" w:history="1">
             <w:r>
               <w:rPr>
                 <w:rStyle w:val="Hyperlink"/>
@@ -2896,7 +2896,7 @@
                 <w:noProof/>
                 <w:webHidden/>
               </w:rPr>
-              <w:instrText xml:space="preserve"> PAGEREF _Toc239342210 \h </w:instrText>
+              <w:instrText xml:space="preserve"> PAGEREF _Toc239344104 \h </w:instrText>
             </w:r>
             <w:r>
               <w:rPr>
@@ -2941,7 +2941,7 @@
               <w14:ligatures w14:val="standardContextual"/>
             </w:rPr>
           </w:pPr>
-          <w:hyperlink w:anchor="_Toc239342211" w:history="1">
+          <w:hyperlink w:anchor="_Toc239344105" w:history="1">
             <w:r>
               <w:rPr>
                 <w:rStyle w:val="Hyperlink"/>
@@ -2969,7 +2969,7 @@
                 <w:noProof/>
                 <w:webHidden/>
               </w:rPr>
-              <w:instrText xml:space="preserve"> PAGEREF _Toc239342211 \h </w:instrText>
+              <w:instrText xml:space="preserve"> PAGEREF _Toc239344105 \h </w:instrText>
             </w:r>
             <w:r>
               <w:rPr>
@@ -3014,7 +3014,7 @@
               <w14:ligatures w14:val="standardContextual"/>
             </w:rPr>
           </w:pPr>
-          <w:hyperlink w:anchor="_Toc239342212" w:history="1">
+          <w:hyperlink w:anchor="_Toc239344106" w:history="1">
             <w:r>
               <w:rPr>
                 <w:rStyle w:val="Hyperlink"/>
@@ -3042,7 +3042,7 @@
                 <w:noProof/>
                 <w:webHidden/>
               </w:rPr>
-              <w:instrText xml:space="preserve"> PAGEREF _Toc239342212 \h </w:instrText>
+              <w:instrText xml:space="preserve"> PAGEREF _Toc239344106 \h </w:instrText>
             </w:r>
             <w:r>
               <w:rPr>
@@ -3087,7 +3087,7 @@
               <w14:ligatures w14:val="standardContextual"/>
             </w:rPr>
           </w:pPr>
-          <w:hyperlink w:anchor="_Toc239342213" w:history="1">
+          <w:hyperlink w:anchor="_Toc239344107" w:history="1">
             <w:r>
               <w:rPr>
                 <w:rStyle w:val="Hyperlink"/>
@@ -3115,7 +3115,7 @@
                 <w:noProof/>
                 <w:webHidden/>
               </w:rPr>
-              <w:instrText xml:space="preserve"> PAGEREF _Toc239342213 \h </w:instrText>
+              <w:instrText xml:space="preserve"> PAGEREF _Toc239344107 \h </w:instrText>
             </w:r>
             <w:r>
               <w:rPr>
@@ -3160,7 +3160,7 @@
               <w14:ligatures w14:val="standardContextual"/>
             </w:rPr>
           </w:pPr>
-          <w:hyperlink w:anchor="_Toc239342214" w:history="1">
+          <w:hyperlink w:anchor="_Toc239344108" w:history="1">
             <w:r>
               <w:rPr>
                 <w:rStyle w:val="Hyperlink"/>
@@ -3188,7 +3188,7 @@
                 <w:noProof/>
                 <w:webHidden/>
               </w:rPr>
-              <w:instrText xml:space="preserve"> PAGEREF _Toc239342214 \h </w:instrText>
+              <w:instrText xml:space="preserve"> PAGEREF _Toc239344108 \h </w:instrText>
             </w:r>
             <w:r>
               <w:rPr>
@@ -3233,7 +3233,7 @@
               <w14:ligatures w14:val="standardContextual"/>
             </w:rPr>
           </w:pPr>
-          <w:hyperlink w:anchor="_Toc239342215" w:history="1">
+          <w:hyperlink w:anchor="_Toc239344109" w:history="1">
             <w:r>
               <w:rPr>
                 <w:rStyle w:val="Hyperlink"/>
@@ -3261,7 +3261,7 @@
                 <w:noProof/>
                 <w:webHidden/>
               </w:rPr>
-              <w:instrText xml:space="preserve"> PAGEREF _Toc239342215 \h </w:instrText>
+              <w:instrText xml:space="preserve"> PAGEREF _Toc239344109 \h </w:instrText>
             </w:r>
             <w:r>
               <w:rPr>
@@ -3306,7 +3306,7 @@
               <w14:ligatures w14:val="standardContextual"/>
             </w:rPr>
           </w:pPr>
-          <w:hyperlink w:anchor="_Toc239342216" w:history="1">
+          <w:hyperlink w:anchor="_Toc239344110" w:history="1">
             <w:r>
               <w:rPr>
                 <w:rStyle w:val="Hyperlink"/>
@@ -3334,7 +3334,7 @@
                 <w:noProof/>
                 <w:webHidden/>
               </w:rPr>
-              <w:instrText xml:space="preserve"> PAGEREF _Toc239342216 \h </w:instrText>
+              <w:instrText xml:space="preserve"> PAGEREF _Toc239344110 \h </w:instrText>
             </w:r>
             <w:r>
               <w:rPr>
@@ -3379,7 +3379,7 @@
               <w14:ligatures w14:val="standardContextual"/>
             </w:rPr>
           </w:pPr>
-          <w:hyperlink w:anchor="_Toc239342217" w:history="1">
+          <w:hyperlink w:anchor="_Toc239344111" w:history="1">
             <w:r>
               <w:rPr>
                 <w:rStyle w:val="Hyperlink"/>
@@ -3406,7 +3406,7 @@
                 <w:noProof/>
                 <w:webHidden/>
               </w:rPr>
-              <w:instrText xml:space="preserve"> PAGEREF _Toc239342217 \h </w:instrText>
+              <w:instrText xml:space="preserve"> PAGEREF _Toc239344111 \h </w:instrText>
             </w:r>
             <w:r>
               <w:rPr>
@@ -3451,7 +3451,7 @@
               <w14:ligatures w14:val="standardContextual"/>
             </w:rPr>
           </w:pPr>
-          <w:hyperlink w:anchor="_Toc239342218" w:history="1">
+          <w:hyperlink w:anchor="_Toc239344112" w:history="1">
             <w:r>
               <w:rPr>
                 <w:rStyle w:val="Hyperlink"/>
@@ -3478,7 +3478,7 @@
                 <w:noProof/>
                 <w:webHidden/>
               </w:rPr>
-              <w:instrText xml:space="preserve"> PAGEREF _Toc239342218 \h </w:instrText>
+              <w:instrText xml:space="preserve"> PAGEREF _Toc239344112 \h </w:instrText>
             </w:r>
             <w:r>
               <w:rPr>
@@ -3523,7 +3523,7 @@
               <w14:ligatures w14:val="standardContextual"/>
             </w:rPr>
           </w:pPr>
-          <w:hyperlink w:anchor="_Toc239342219" w:history="1">
+          <w:hyperlink w:anchor="_Toc239344113" w:history="1">
             <w:r>
               <w:rPr>
                 <w:rStyle w:val="Hyperlink"/>
@@ -3550,7 +3550,7 @@
                 <w:noProof/>
                 <w:webHidden/>
               </w:rPr>
-              <w:instrText xml:space="preserve"> PAGEREF _Toc239342219 \h </w:instrText>
+              <w:instrText xml:space="preserve"> PAGEREF _Toc239344113 \h </w:instrText>
             </w:r>
             <w:r>
               <w:rPr>
@@ -3595,7 +3595,7 @@
               <w14:ligatures w14:val="standardContextual"/>
             </w:rPr>
           </w:pPr>
-          <w:hyperlink w:anchor="_Toc239342220" w:history="1">
+          <w:hyperlink w:anchor="_Toc239344114" w:history="1">
             <w:r>
               <w:rPr>
                 <w:rStyle w:val="Hyperlink"/>
@@ -3622,7 +3622,7 @@
                 <w:noProof/>
                 <w:webHidden/>
               </w:rPr>
-              <w:instrText xml:space="preserve"> PAGEREF _Toc239342220 \h </w:instrText>
+              <w:instrText xml:space="preserve"> PAGEREF _Toc239344114 \h </w:instrText>
             </w:r>
             <w:r>
               <w:rPr>
@@ -3667,7 +3667,7 @@
               <w14:ligatures w14:val="standardContextual"/>
             </w:rPr>
           </w:pPr>
-          <w:hyperlink w:anchor="_Toc239342221" w:history="1">
+          <w:hyperlink w:anchor="_Toc239344115" w:history="1">
             <w:r>
               <w:rPr>
                 <w:rStyle w:val="Hyperlink"/>
@@ -3694,7 +3694,7 @@
                 <w:noProof/>
                 <w:webHidden/>
               </w:rPr>
-              <w:instrText xml:space="preserve"> PAGEREF _Toc239342221 \h </w:instrText>
+              <w:instrText xml:space="preserve"> PAGEREF _Toc239344115 \h </w:instrText>
             </w:r>
             <w:r>
               <w:rPr>
@@ -3739,7 +3739,7 @@
               <w14:ligatures w14:val="standardContextual"/>
             </w:rPr>
           </w:pPr>
-          <w:hyperlink w:anchor="_Toc239342222" w:history="1">
+          <w:hyperlink w:anchor="_Toc239344116" w:history="1">
             <w:r>
               <w:rPr>
                 <w:rStyle w:val="Hyperlink"/>
@@ -3766,7 +3766,7 @@
                 <w:noProof/>
                 <w:webHidden/>
               </w:rPr>
-              <w:instrText xml:space="preserve"> PAGEREF _Toc239342222 \h </w:instrText>
+              <w:instrText xml:space="preserve"> PAGEREF _Toc239344116 \h </w:instrText>
             </w:r>
             <w:r>
               <w:rPr>
@@ -3811,7 +3811,7 @@
               <w14:ligatures w14:val="standardContextual"/>
             </w:rPr>
           </w:pPr>
-          <w:hyperlink w:anchor="_Toc239342223" w:history="1">
+          <w:hyperlink w:anchor="_Toc239344117" w:history="1">
             <w:r>
               <w:rPr>
                 <w:rStyle w:val="Hyperlink"/>
@@ -3838,7 +3838,7 @@
                 <w:noProof/>
                 <w:webHidden/>
               </w:rPr>
-              <w:instrText xml:space="preserve"> PAGEREF _Toc239342223 \h </w:instrText>
+              <w:instrText xml:space="preserve"> PAGEREF _Toc239344117 \h </w:instrText>
             </w:r>
             <w:r>
               <w:rPr>
@@ -3883,7 +3883,7 @@
               <w14:ligatures w14:val="standardContextual"/>
             </w:rPr>
           </w:pPr>
-          <w:hyperlink w:anchor="_Toc239342224" w:history="1">
+          <w:hyperlink w:anchor="_Toc239344118" w:history="1">
             <w:r>
               <w:rPr>
                 <w:rStyle w:val="Hyperlink"/>
@@ -3910,7 +3910,7 @@
                 <w:noProof/>
                 <w:webHidden/>
               </w:rPr>
-              <w:instrText xml:space="preserve"> PAGEREF _Toc239342224 \h </w:instrText>
+              <w:instrText xml:space="preserve"> PAGEREF _Toc239344118 \h </w:instrText>
             </w:r>
             <w:r>
               <w:rPr>
@@ -3955,7 +3955,7 @@
               <w14:ligatures w14:val="standardContextual"/>
             </w:rPr>
           </w:pPr>
-          <w:hyperlink w:anchor="_Toc239342225" w:history="1">
+          <w:hyperlink w:anchor="_Toc239344119" w:history="1">
             <w:r>
               <w:rPr>
                 <w:rStyle w:val="Hyperlink"/>
@@ -3982,7 +3982,7 @@
                 <w:noProof/>
                 <w:webHidden/>
               </w:rPr>
-              <w:instrText xml:space="preserve"> PAGEREF _Toc239342225 \h </w:instrText>
+              <w:instrText xml:space="preserve"> PAGEREF _Toc239344119 \h </w:instrText>
             </w:r>
             <w:r>
               <w:rPr>
@@ -4027,7 +4027,7 @@
               <w14:ligatures w14:val="standardContextual"/>
             </w:rPr>
           </w:pPr>
-          <w:hyperlink w:anchor="_Toc239342226" w:history="1">
+          <w:hyperlink w:anchor="_Toc239344120" w:history="1">
             <w:r>
               <w:rPr>
                 <w:rStyle w:val="Hyperlink"/>
@@ -4054,7 +4054,7 @@
                 <w:noProof/>
                 <w:webHidden/>
               </w:rPr>
-              <w:instrText xml:space="preserve"> PAGEREF _Toc239342226 \h </w:instrText>
+              <w:instrText xml:space="preserve"> PAGEREF _Toc239344120 \h </w:instrText>
             </w:r>
             <w:r>
               <w:rPr>
@@ -4099,7 +4099,7 @@
               <w14:ligatures w14:val="standardContextual"/>
             </w:rPr>
           </w:pPr>
-          <w:hyperlink w:anchor="_Toc239342227" w:history="1">
+          <w:hyperlink w:anchor="_Toc239344121" w:history="1">
             <w:r>
               <w:rPr>
                 <w:rStyle w:val="Hyperlink"/>
@@ -4126,7 +4126,7 @@
                 <w:noProof/>
                 <w:webHidden/>
               </w:rPr>
-              <w:instrText xml:space="preserve"> PAGEREF _Toc239342227 \h </w:instrText>
+              <w:instrText xml:space="preserve"> PAGEREF _Toc239344121 \h </w:instrText>
             </w:r>
             <w:r>
               <w:rPr>
@@ -4171,7 +4171,7 @@
               <w14:ligatures w14:val="standardContextual"/>
             </w:rPr>
           </w:pPr>
-          <w:hyperlink w:anchor="_Toc239342228" w:history="1">
+          <w:hyperlink w:anchor="_Toc239344122" w:history="1">
             <w:r>
               <w:rPr>
                 <w:rStyle w:val="Hyperlink"/>
@@ -4198,7 +4198,7 @@
                 <w:noProof/>
                 <w:webHidden/>
               </w:rPr>
-              <w:instrText xml:space="preserve"> PAGEREF _Toc239342228 \h </w:instrText>
+              <w:instrText xml:space="preserve"> PAGEREF _Toc239344122 \h </w:instrText>
             </w:r>
             <w:r>
               <w:rPr>
@@ -4243,7 +4243,7 @@
               <w14:ligatures w14:val="standardContextual"/>
             </w:rPr>
           </w:pPr>
-          <w:hyperlink w:anchor="_Toc239342229" w:history="1">
+          <w:hyperlink w:anchor="_Toc239344123" w:history="1">
             <w:r>
               <w:rPr>
                 <w:rStyle w:val="Hyperlink"/>
@@ -4270,7 +4270,7 @@
                 <w:noProof/>
                 <w:webHidden/>
               </w:rPr>
-              <w:instrText xml:space="preserve"> PAGEREF _Toc239342229 \h </w:instrText>
+              <w:instrText xml:space="preserve"> PAGEREF _Toc239344123 \h </w:instrText>
             </w:r>
             <w:r>
               <w:rPr>
@@ -4315,7 +4315,7 @@
               <w14:ligatures w14:val="standardContextual"/>
             </w:rPr>
           </w:pPr>
-          <w:hyperlink w:anchor="_Toc239342230" w:history="1">
+          <w:hyperlink w:anchor="_Toc239344124" w:history="1">
             <w:r>
               <w:rPr>
                 <w:rStyle w:val="Hyperlink"/>
@@ -4342,7 +4342,7 @@
                 <w:noProof/>
                 <w:webHidden/>
               </w:rPr>
-              <w:instrText xml:space="preserve"> PAGEREF _Toc239342230 \h </w:instrText>
+              <w:instrText xml:space="preserve"> PAGEREF _Toc239344124 \h </w:instrText>
             </w:r>
             <w:r>
               <w:rPr>
@@ -4387,7 +4387,7 @@
               <w14:ligatures w14:val="standardContextual"/>
             </w:rPr>
           </w:pPr>
-          <w:hyperlink w:anchor="_Toc239342231" w:history="1">
+          <w:hyperlink w:anchor="_Toc239344125" w:history="1">
             <w:r>
               <w:rPr>
                 <w:rStyle w:val="Hyperlink"/>
@@ -4414,7 +4414,7 @@
                 <w:noProof/>
                 <w:webHidden/>
               </w:rPr>
-              <w:instrText xml:space="preserve"> PAGEREF _Toc239342231 \h </w:instrText>
+              <w:instrText xml:space="preserve"> PAGEREF _Toc239344125 \h </w:instrText>
             </w:r>
             <w:r>
               <w:rPr>
@@ -4459,7 +4459,7 @@
               <w14:ligatures w14:val="standardContextual"/>
             </w:rPr>
           </w:pPr>
-          <w:hyperlink w:anchor="_Toc239342232" w:history="1">
+          <w:hyperlink w:anchor="_Toc239344126" w:history="1">
             <w:r>
               <w:rPr>
                 <w:rStyle w:val="Hyperlink"/>
@@ -4486,7 +4486,7 @@
                 <w:noProof/>
                 <w:webHidden/>
               </w:rPr>
-              <w:instrText xml:space="preserve"> PAGEREF _Toc239342232 \h </w:instrText>
+              <w:instrText xml:space="preserve"> PAGEREF _Toc239344126 \h </w:instrText>
             </w:r>
             <w:r>
               <w:rPr>
@@ -4531,7 +4531,7 @@
               <w14:ligatures w14:val="standardContextual"/>
             </w:rPr>
           </w:pPr>
-          <w:hyperlink w:anchor="_Toc239342233" w:history="1">
+          <w:hyperlink w:anchor="_Toc239344127" w:history="1">
             <w:r>
               <w:rPr>
                 <w:rStyle w:val="Hyperlink"/>
@@ -4558,7 +4558,7 @@
                 <w:noProof/>
                 <w:webHidden/>
               </w:rPr>
-              <w:instrText xml:space="preserve"> PAGEREF _Toc239342233 \h </w:instrText>
+              <w:instrText xml:space="preserve"> PAGEREF _Toc239344127 \h </w:instrText>
             </w:r>
             <w:r>
               <w:rPr>
@@ -4603,7 +4603,7 @@
               <w14:ligatures w14:val="standardContextual"/>
             </w:rPr>
           </w:pPr>
-          <w:hyperlink w:anchor="_Toc239342234" w:history="1">
+          <w:hyperlink w:anchor="_Toc239344128" w:history="1">
             <w:r>
               <w:rPr>
                 <w:rStyle w:val="Hyperlink"/>
@@ -4630,7 +4630,7 @@
                 <w:noProof/>
                 <w:webHidden/>
               </w:rPr>
-              <w:instrText xml:space="preserve"> PAGEREF _Toc239342234 \h </w:instrText>
+              <w:instrText xml:space="preserve"> PAGEREF _Toc239344128 \h </w:instrText>
             </w:r>
             <w:r>
               <w:rPr>
@@ -4675,7 +4675,7 @@
               <w14:ligatures w14:val="standardContextual"/>
             </w:rPr>
           </w:pPr>
-          <w:hyperlink w:anchor="_Toc239342235" w:history="1">
+          <w:hyperlink w:anchor="_Toc239344129" w:history="1">
             <w:r>
               <w:rPr>
                 <w:rStyle w:val="Hyperlink"/>
@@ -4702,7 +4702,7 @@
                 <w:noProof/>
                 <w:webHidden/>
               </w:rPr>
-              <w:instrText xml:space="preserve"> PAGEREF _Toc239342235 \h </w:instrText>
+              <w:instrText xml:space="preserve"> PAGEREF _Toc239344129 \h </w:instrText>
             </w:r>
             <w:r>
               <w:rPr>
@@ -4747,7 +4747,7 @@
               <w14:ligatures w14:val="standardContextual"/>
             </w:rPr>
           </w:pPr>
-          <w:hyperlink w:anchor="_Toc239342236" w:history="1">
+          <w:hyperlink w:anchor="_Toc239344130" w:history="1">
             <w:r>
               <w:rPr>
                 <w:rStyle w:val="Hyperlink"/>
@@ -4774,7 +4774,7 @@
                 <w:noProof/>
                 <w:webHidden/>
               </w:rPr>
-              <w:instrText xml:space="preserve"> PAGEREF _Toc239342236 \h </w:instrText>
+              <w:instrText xml:space="preserve"> PAGEREF _Toc239344130 \h </w:instrText>
             </w:r>
             <w:r>
               <w:rPr>
@@ -4819,7 +4819,7 @@
               <w14:ligatures w14:val="standardContextual"/>
             </w:rPr>
           </w:pPr>
-          <w:hyperlink w:anchor="_Toc239342237" w:history="1">
+          <w:hyperlink w:anchor="_Toc239344131" w:history="1">
             <w:r>
               <w:rPr>
                 <w:rStyle w:val="Hyperlink"/>
@@ -4846,7 +4846,7 @@
                 <w:noProof/>
                 <w:webHidden/>
               </w:rPr>
-              <w:instrText xml:space="preserve"> PAGEREF _Toc239342237 \h </w:instrText>
+              <w:instrText xml:space="preserve"> PAGEREF _Toc239344131 \h </w:instrText>
             </w:r>
             <w:r>
               <w:rPr>
@@ -4891,7 +4891,7 @@
               <w14:ligatures w14:val="standardContextual"/>
             </w:rPr>
           </w:pPr>
-          <w:hyperlink w:anchor="_Toc239342238" w:history="1">
+          <w:hyperlink w:anchor="_Toc239344132" w:history="1">
             <w:r>
               <w:rPr>
                 <w:rStyle w:val="Hyperlink"/>
@@ -4918,7 +4918,7 @@
                 <w:noProof/>
                 <w:webHidden/>
               </w:rPr>
-              <w:instrText xml:space="preserve"> PAGEREF _Toc239342238 \h </w:instrText>
+              <w:instrText xml:space="preserve"> PAGEREF _Toc239344132 \h </w:instrText>
             </w:r>
             <w:r>
               <w:rPr>
@@ -4963,7 +4963,7 @@
               <w14:ligatures w14:val="standardContextual"/>
             </w:rPr>
           </w:pPr>
-          <w:hyperlink w:anchor="_Toc239342239" w:history="1">
+          <w:hyperlink w:anchor="_Toc239344133" w:history="1">
             <w:r>
               <w:rPr>
                 <w:rStyle w:val="Hyperlink"/>
@@ -4990,7 +4990,7 @@
                 <w:noProof/>
                 <w:webHidden/>
               </w:rPr>
-              <w:instrText xml:space="preserve"> PAGEREF _Toc239342239 \h </w:instrText>
+              <w:instrText xml:space="preserve"> PAGEREF _Toc239344133 \h </w:instrText>
             </w:r>
             <w:r>
               <w:rPr>
@@ -5035,7 +5035,7 @@
               <w14:ligatures w14:val="standardContextual"/>
             </w:rPr>
           </w:pPr>
-          <w:hyperlink w:anchor="_Toc239342240" w:history="1">
+          <w:hyperlink w:anchor="_Toc239344134" w:history="1">
             <w:r>
               <w:rPr>
                 <w:rStyle w:val="Hyperlink"/>
@@ -5062,7 +5062,7 @@
                 <w:noProof/>
                 <w:webHidden/>
               </w:rPr>
-              <w:instrText xml:space="preserve"> PAGEREF _Toc239342240 \h </w:instrText>
+              <w:instrText xml:space="preserve"> PAGEREF _Toc239344134 \h </w:instrText>
             </w:r>
             <w:r>
               <w:rPr>
@@ -5107,7 +5107,7 @@
               <w14:ligatures w14:val="standardContextual"/>
             </w:rPr>
           </w:pPr>
-          <w:hyperlink w:anchor="_Toc239342241" w:history="1">
+          <w:hyperlink w:anchor="_Toc239344135" w:history="1">
             <w:r>
               <w:rPr>
                 <w:rStyle w:val="Hyperlink"/>
@@ -5134,7 +5134,7 @@
                 <w:noProof/>
                 <w:webHidden/>
               </w:rPr>
-              <w:instrText xml:space="preserve"> PAGEREF _Toc239342241 \h </w:instrText>
+              <w:instrText xml:space="preserve"> PAGEREF _Toc239344135 \h </w:instrText>
             </w:r>
             <w:r>
               <w:rPr>
@@ -5179,7 +5179,7 @@
               <w14:ligatures w14:val="standardContextual"/>
             </w:rPr>
           </w:pPr>
-          <w:hyperlink w:anchor="_Toc239342242" w:history="1">
+          <w:hyperlink w:anchor="_Toc239344136" w:history="1">
             <w:r>
               <w:rPr>
                 <w:rStyle w:val="Hyperlink"/>
@@ -5206,7 +5206,7 @@
                 <w:noProof/>
                 <w:webHidden/>
               </w:rPr>
-              <w:instrText xml:space="preserve"> PAGEREF _Toc239342242 \h </w:instrText>
+              <w:instrText xml:space="preserve"> PAGEREF _Toc239344136 \h </w:instrText>
             </w:r>
             <w:r>
               <w:rPr>
@@ -5251,7 +5251,7 @@
               <w14:ligatures w14:val="standardContextual"/>
             </w:rPr>
           </w:pPr>
-          <w:hyperlink w:anchor="_Toc239342243" w:history="1">
+          <w:hyperlink w:anchor="_Toc239344137" w:history="1">
             <w:r>
               <w:rPr>
                 <w:rStyle w:val="Hyperlink"/>
@@ -5278,7 +5278,7 @@
                 <w:noProof/>
                 <w:webHidden/>
               </w:rPr>
-              <w:instrText xml:space="preserve"> PAGEREF _Toc239342243 \h </w:instrText>
+              <w:instrText xml:space="preserve"> PAGEREF _Toc239344137 \h </w:instrText>
             </w:r>
             <w:r>
               <w:rPr>
@@ -5323,7 +5323,7 @@
               <w14:ligatures w14:val="standardContextual"/>
             </w:rPr>
           </w:pPr>
-          <w:hyperlink w:anchor="_Toc239342244" w:history="1">
+          <w:hyperlink w:anchor="_Toc239344138" w:history="1">
             <w:r>
               <w:rPr>
                 <w:rStyle w:val="Hyperlink"/>
@@ -5350,7 +5350,7 @@
                 <w:noProof/>
                 <w:webHidden/>
               </w:rPr>
-              <w:instrText xml:space="preserve"> PAGEREF _Toc239342244 \h </w:instrText>
+              <w:instrText xml:space="preserve"> PAGEREF _Toc239344138 \h </w:instrText>
             </w:r>
             <w:r>
               <w:rPr>
@@ -5395,7 +5395,7 @@
               <w14:ligatures w14:val="standardContextual"/>
             </w:rPr>
           </w:pPr>
-          <w:hyperlink w:anchor="_Toc239342245" w:history="1">
+          <w:hyperlink w:anchor="_Toc239344139" w:history="1">
             <w:r>
               <w:rPr>
                 <w:rStyle w:val="Hyperlink"/>
@@ -5422,7 +5422,7 @@
                 <w:noProof/>
                 <w:webHidden/>
               </w:rPr>
-              <w:instrText xml:space="preserve"> PAGEREF _Toc239342245 \h </w:instrText>
+              <w:instrText xml:space="preserve"> PAGEREF _Toc239344139 \h </w:instrText>
             </w:r>
             <w:r>
               <w:rPr>
@@ -5467,7 +5467,7 @@
               <w14:ligatures w14:val="standardContextual"/>
             </w:rPr>
           </w:pPr>
-          <w:hyperlink w:anchor="_Toc239342246" w:history="1">
+          <w:hyperlink w:anchor="_Toc239344140" w:history="1">
             <w:r>
               <w:rPr>
                 <w:rStyle w:val="Hyperlink"/>
@@ -5509,7 +5509,7 @@
                 <w:noProof/>
                 <w:webHidden/>
               </w:rPr>
-              <w:instrText xml:space="preserve"> PAGEREF _Toc239342246 \h </w:instrText>
+              <w:instrText xml:space="preserve"> PAGEREF _Toc239344140 \h </w:instrText>
             </w:r>
             <w:r>
               <w:rPr>
@@ -5554,7 +5554,7 @@
               <w14:ligatures w14:val="standardContextual"/>
             </w:rPr>
           </w:pPr>
-          <w:hyperlink w:anchor="_Toc239342247" w:history="1">
+          <w:hyperlink w:anchor="_Toc239344141" w:history="1">
             <w:r>
               <w:rPr>
                 <w:rStyle w:val="Hyperlink"/>
@@ -5581,7 +5581,7 @@
                 <w:noProof/>
                 <w:webHidden/>
               </w:rPr>
-              <w:instrText xml:space="preserve"> PAGEREF _Toc239342247 \h </w:instrText>
+              <w:instrText xml:space="preserve"> PAGEREF _Toc239344141 \h </w:instrText>
             </w:r>
             <w:r>
               <w:rPr>
@@ -5626,7 +5626,7 @@
               <w14:ligatures w14:val="standardContextual"/>
             </w:rPr>
           </w:pPr>
-          <w:hyperlink w:anchor="_Toc239342248" w:history="1">
+          <w:hyperlink w:anchor="_Toc239344142" w:history="1">
             <w:r>
               <w:rPr>
                 <w:rStyle w:val="Hyperlink"/>
@@ -5653,7 +5653,7 @@
                 <w:noProof/>
                 <w:webHidden/>
               </w:rPr>
-              <w:instrText xml:space="preserve"> PAGEREF _Toc239342248 \h </w:instrText>
+              <w:instrText xml:space="preserve"> PAGEREF _Toc239344142 \h </w:instrText>
             </w:r>
             <w:r>
               <w:rPr>
@@ -5698,7 +5698,7 @@
               <w14:ligatures w14:val="standardContextual"/>
             </w:rPr>
           </w:pPr>
-          <w:hyperlink w:anchor="_Toc239342249" w:history="1">
+          <w:hyperlink w:anchor="_Toc239344143" w:history="1">
             <w:r>
               <w:rPr>
                 <w:rStyle w:val="Hyperlink"/>
@@ -5725,7 +5725,7 @@
                 <w:noProof/>
                 <w:webHidden/>
               </w:rPr>
-              <w:instrText xml:space="preserve"> PAGEREF _Toc239342249 \h </w:instrText>
+              <w:instrText xml:space="preserve"> PAGEREF _Toc239344143 \h </w:instrText>
             </w:r>
             <w:r>
               <w:rPr>
@@ -5770,7 +5770,7 @@
               <w14:ligatures w14:val="standardContextual"/>
             </w:rPr>
           </w:pPr>
-          <w:hyperlink w:anchor="_Toc239342250" w:history="1">
+          <w:hyperlink w:anchor="_Toc239344144" w:history="1">
             <w:r>
               <w:rPr>
                 <w:rStyle w:val="Hyperlink"/>
@@ -5797,7 +5797,7 @@
                 <w:noProof/>
                 <w:webHidden/>
               </w:rPr>
-              <w:instrText xml:space="preserve"> PAGEREF _Toc239342250 \h </w:instrText>
+              <w:instrText xml:space="preserve"> PAGEREF _Toc239344144 \h </w:instrText>
             </w:r>
             <w:r>
               <w:rPr>
@@ -5842,7 +5842,7 @@
               <w14:ligatures w14:val="standardContextual"/>
             </w:rPr>
           </w:pPr>
-          <w:hyperlink w:anchor="_Toc239342251" w:history="1">
+          <w:hyperlink w:anchor="_Toc239344145" w:history="1">
             <w:r>
               <w:rPr>
                 <w:rStyle w:val="Hyperlink"/>
@@ -5869,7 +5869,7 @@
                 <w:noProof/>
                 <w:webHidden/>
               </w:rPr>
-              <w:instrText xml:space="preserve"> PAGEREF _Toc239342251 \h </w:instrText>
+              <w:instrText xml:space="preserve"> PAGEREF _Toc239344145 \h </w:instrText>
             </w:r>
             <w:r>
               <w:rPr>
@@ -5914,7 +5914,7 @@
               <w14:ligatures w14:val="standardContextual"/>
             </w:rPr>
           </w:pPr>
-          <w:hyperlink w:anchor="_Toc239342252" w:history="1">
+          <w:hyperlink w:anchor="_Toc239344146" w:history="1">
             <w:r>
               <w:rPr>
                 <w:rStyle w:val="Hyperlink"/>
@@ -5949,7 +5949,7 @@
                 <w:noProof/>
                 <w:webHidden/>
               </w:rPr>
-              <w:instrText xml:space="preserve"> PAGEREF _Toc239342252 \h </w:instrText>
+              <w:instrText xml:space="preserve"> PAGEREF _Toc239344146 \h </w:instrText>
             </w:r>
             <w:r>
               <w:rPr>
@@ -5994,7 +5994,7 @@
               <w14:ligatures w14:val="standardContextual"/>
             </w:rPr>
           </w:pPr>
-          <w:hyperlink w:anchor="_Toc239342253" w:history="1">
+          <w:hyperlink w:anchor="_Toc239344147" w:history="1">
             <w:r>
               <w:rPr>
                 <w:rStyle w:val="Hyperlink"/>
@@ -6021,7 +6021,7 @@
                 <w:noProof/>
                 <w:webHidden/>
               </w:rPr>
-              <w:instrText xml:space="preserve"> PAGEREF _Toc239342253 \h </w:instrText>
+              <w:instrText xml:space="preserve"> PAGEREF _Toc239344147 \h </w:instrText>
             </w:r>
             <w:r>
               <w:rPr>
@@ -6066,7 +6066,7 @@
               <w14:ligatures w14:val="standardContextual"/>
             </w:rPr>
           </w:pPr>
-          <w:hyperlink w:anchor="_Toc239342254" w:history="1">
+          <w:hyperlink w:anchor="_Toc239344148" w:history="1">
             <w:r>
               <w:rPr>
                 <w:rStyle w:val="Hyperlink"/>
@@ -6093,7 +6093,7 @@
                 <w:noProof/>
                 <w:webHidden/>
               </w:rPr>
-              <w:instrText xml:space="preserve"> PAGEREF _Toc239342254 \h </w:instrText>
+              <w:instrText xml:space="preserve"> PAGEREF _Toc239344148 \h </w:instrText>
             </w:r>
             <w:r>
               <w:rPr>
@@ -6138,7 +6138,7 @@
               <w14:ligatures w14:val="standardContextual"/>
             </w:rPr>
           </w:pPr>
-          <w:hyperlink w:anchor="_Toc239342255" w:history="1">
+          <w:hyperlink w:anchor="_Toc239344149" w:history="1">
             <w:r>
               <w:rPr>
                 <w:rStyle w:val="Hyperlink"/>
@@ -6165,7 +6165,7 @@
                 <w:noProof/>
                 <w:webHidden/>
               </w:rPr>
-              <w:instrText xml:space="preserve"> PAGEREF _Toc239342255 \h </w:instrText>
+              <w:instrText xml:space="preserve"> PAGEREF _Toc239344149 \h </w:instrText>
             </w:r>
             <w:r>
               <w:rPr>
@@ -6210,7 +6210,7 @@
               <w14:ligatures w14:val="standardContextual"/>
             </w:rPr>
           </w:pPr>
-          <w:hyperlink w:anchor="_Toc239342256" w:history="1">
+          <w:hyperlink w:anchor="_Toc239344150" w:history="1">
             <w:r>
               <w:rPr>
                 <w:rStyle w:val="Hyperlink"/>
@@ -6237,7 +6237,7 @@
                 <w:noProof/>
                 <w:webHidden/>
               </w:rPr>
-              <w:instrText xml:space="preserve"> PAGEREF _Toc239342256 \h </w:instrText>
+              <w:instrText xml:space="preserve"> PAGEREF _Toc239344150 \h </w:instrText>
             </w:r>
             <w:r>
               <w:rPr>
@@ -6282,7 +6282,7 @@
               <w14:ligatures w14:val="standardContextual"/>
             </w:rPr>
           </w:pPr>
-          <w:hyperlink w:anchor="_Toc239342257" w:history="1">
+          <w:hyperlink w:anchor="_Toc239344151" w:history="1">
             <w:r>
               <w:rPr>
                 <w:rStyle w:val="Hyperlink"/>
@@ -6309,7 +6309,7 @@
                 <w:noProof/>
                 <w:webHidden/>
               </w:rPr>
-              <w:instrText xml:space="preserve"> PAGEREF _Toc239342257 \h </w:instrText>
+              <w:instrText xml:space="preserve"> PAGEREF _Toc239344151 \h </w:instrText>
             </w:r>
             <w:r>
               <w:rPr>
@@ -6354,7 +6354,7 @@
               <w14:ligatures w14:val="standardContextual"/>
             </w:rPr>
           </w:pPr>
-          <w:hyperlink w:anchor="_Toc239342258" w:history="1">
+          <w:hyperlink w:anchor="_Toc239344152" w:history="1">
             <w:r>
               <w:rPr>
                 <w:rStyle w:val="Hyperlink"/>
@@ -6381,7 +6381,7 @@
                 <w:noProof/>
                 <w:webHidden/>
               </w:rPr>
-              <w:instrText xml:space="preserve"> PAGEREF _Toc239342258 \h </w:instrText>
+              <w:instrText xml:space="preserve"> PAGEREF _Toc239344152 \h </w:instrText>
             </w:r>
             <w:r>
               <w:rPr>
@@ -6426,7 +6426,7 @@
               <w14:ligatures w14:val="standardContextual"/>
             </w:rPr>
           </w:pPr>
-          <w:hyperlink w:anchor="_Toc239342259" w:history="1">
+          <w:hyperlink w:anchor="_Toc239344153" w:history="1">
             <w:r>
               <w:rPr>
                 <w:rStyle w:val="Hyperlink"/>
@@ -6453,7 +6453,7 @@
                 <w:noProof/>
                 <w:webHidden/>
               </w:rPr>
-              <w:instrText xml:space="preserve"> PAGEREF _Toc239342259 \h </w:instrText>
+              <w:instrText xml:space="preserve"> PAGEREF _Toc239344153 \h </w:instrText>
             </w:r>
             <w:r>
               <w:rPr>
@@ -6496,7 +6496,7 @@
         <w:pStyle w:val="Heading1"/>
       </w:pPr>
       <w:bookmarkStart w:id="0" w:name="manual-teknis--sistem-ota"/>
-      <w:bookmarkStart w:id="1" w:name="_Toc239342171"/>
+      <w:bookmarkStart w:id="1" w:name="_Toc239344065"/>
       <w:r>
         <w:t>Manual Teknis — Sistem OTA</w:t>
       </w:r>
@@ -6583,7 +6583,7 @@
         <w:t>dikerjakan rekan peneliti</w:t>
       </w:r>
       <w:r>
-        <w:t xml:space="preserve">. Keduanya didokumentasikan di §15 dan §16 </w:t>
+        <w:t xml:space="preserve">. Keduanya didokumentasikan di bagian 15 dan 16 </w:t>
       </w:r>
       <w:r>
         <w:rPr>
@@ -6640,7 +6640,7 @@
         <w:pStyle w:val="Heading2"/>
       </w:pPr>
       <w:bookmarkStart w:id="2" w:name="X3a09ebe64b01ba08c487bbc3fa6201884073a5a"/>
-      <w:bookmarkStart w:id="3" w:name="_Toc239342172"/>
+      <w:bookmarkStart w:id="3" w:name="_Toc239344066"/>
       <w:r>
         <w:t>1. Ringkasan Arsitektur</w:t>
       </w:r>
@@ -6869,7 +6869,7 @@
         <w:t>kotak 1 (aplikasi web)</w:t>
       </w:r>
       <w:r>
-        <w:t xml:space="preserve"> beserta seluruh integrasinya ke Firebase, server kamera, dan stasiun sensor. Kotak 3 dan ESP32 dikerjakan rekan peneliti — lihat catatan di §15 dan §16.</w:t>
+        <w:t xml:space="preserve"> beserta seluruh integrasinya ke Firebase, server kamera, dan stasiun sensor. Kotak 3 dan ESP32 dikerjakan rekan peneliti — lihat catatan di bagian 15 dan 16.</w:t>
       </w:r>
     </w:p>
     <w:p>
@@ -6944,7 +6944,10 @@
         <w:t>Google Gemini</w:t>
       </w:r>
       <w:r>
-        <w:t xml:space="preserve"> — asisten chat, dipanggil lewat proxy di </w:t>
+        <w:t xml:space="preserve"> </w:t>
+      </w:r>
+      <w:r>
+        <w:t xml:space="preserve">— asisten chat, dipanggil lewat proxy di </w:t>
       </w:r>
       <w:r>
         <w:rPr>
@@ -6961,7 +6964,7 @@
         <w:pStyle w:val="Heading3"/>
       </w:pPr>
       <w:bookmarkStart w:id="4" w:name="kenapa-dua-basis-data-firebase"/>
-      <w:bookmarkStart w:id="5" w:name="_Toc239342173"/>
+      <w:bookmarkStart w:id="5" w:name="_Toc239344067"/>
       <w:r>
         <w:t>Kenapa dua basis data Firebase</w:t>
       </w:r>
@@ -7198,7 +7201,7 @@
         <w:pStyle w:val="Heading2"/>
       </w:pPr>
       <w:bookmarkStart w:id="6" w:name="Xa2d4e825a35eb483f46fac9ab31b160b5a305f8"/>
-      <w:bookmarkStart w:id="7" w:name="_Toc239342174"/>
+      <w:bookmarkStart w:id="7" w:name="_Toc239344068"/>
       <w:bookmarkEnd w:id="2"/>
       <w:bookmarkEnd w:id="4"/>
       <w:r>
@@ -8156,7 +8159,7 @@
         <w:pStyle w:val="Heading2"/>
       </w:pPr>
       <w:bookmarkStart w:id="8" w:name="X1ddefa9e6b2494e27ab53d21a9ddff79156ae81"/>
-      <w:bookmarkStart w:id="9" w:name="_Toc239342175"/>
+      <w:bookmarkStart w:id="9" w:name="_Toc239344069"/>
       <w:bookmarkEnd w:id="6"/>
       <w:r>
         <w:t>3. Prasyarat</w:t>
@@ -8168,7 +8171,7 @@
         <w:pStyle w:val="Heading3"/>
       </w:pPr>
       <w:bookmarkStart w:id="10" w:name="perangkat-lunak"/>
-      <w:bookmarkStart w:id="11" w:name="_Toc239342176"/>
+      <w:bookmarkStart w:id="11" w:name="_Toc239344070"/>
       <w:r>
         <w:t>Perangkat lunak</w:t>
       </w:r>
@@ -8501,7 +8504,7 @@
         <w:pStyle w:val="Heading3"/>
       </w:pPr>
       <w:bookmarkStart w:id="12" w:name="akun-dan-layanan"/>
-      <w:bookmarkStart w:id="13" w:name="_Toc239342177"/>
+      <w:bookmarkStart w:id="13" w:name="_Toc239344071"/>
       <w:bookmarkEnd w:id="10"/>
       <w:r>
         <w:t>Akun dan layanan</w:t>
@@ -8825,7 +8828,7 @@
         <w:pStyle w:val="Heading2"/>
       </w:pPr>
       <w:bookmarkStart w:id="14" w:name="X088e7b1d8d32ad7f43c87708f8e8a93790f2b7c"/>
-      <w:bookmarkStart w:id="15" w:name="_Toc239342178"/>
+      <w:bookmarkStart w:id="15" w:name="_Toc239344072"/>
       <w:bookmarkEnd w:id="8"/>
       <w:bookmarkEnd w:id="12"/>
       <w:r>
@@ -8987,7 +8990,7 @@
         <w:pStyle w:val="Heading3"/>
       </w:pPr>
       <w:bookmarkStart w:id="16" w:name="perintah-npm"/>
-      <w:bookmarkStart w:id="17" w:name="_Toc239342179"/>
+      <w:bookmarkStart w:id="17" w:name="_Toc239344073"/>
       <w:r>
         <w:t>Perintah npm</w:t>
       </w:r>
@@ -9218,7 +9221,7 @@
         <w:pStyle w:val="Heading3"/>
       </w:pPr>
       <w:bookmarkStart w:id="18" w:name="menyiapkan-kredensial-admin-sdk"/>
-      <w:bookmarkStart w:id="19" w:name="_Toc239342180"/>
+      <w:bookmarkStart w:id="19" w:name="_Toc239344074"/>
       <w:bookmarkEnd w:id="16"/>
       <w:r>
         <w:t>Menyiapkan kredensial Admin SDK</w:t>
@@ -9432,7 +9435,7 @@
         <w:pStyle w:val="Heading3"/>
       </w:pPr>
       <w:bookmarkStart w:id="20" w:name="menerapkan-security-rules"/>
-      <w:bookmarkStart w:id="21" w:name="_Toc239342181"/>
+      <w:bookmarkStart w:id="21" w:name="_Toc239344075"/>
       <w:bookmarkEnd w:id="18"/>
       <w:r>
         <w:t>Menerapkan security rules</w:t>
@@ -9598,7 +9601,7 @@
         <w:pStyle w:val="Heading2"/>
       </w:pPr>
       <w:bookmarkStart w:id="22" w:name="Xd165ed43bdbb62947ccc40dc38a28bab85421a8"/>
-      <w:bookmarkStart w:id="23" w:name="_Toc239342182"/>
+      <w:bookmarkStart w:id="23" w:name="_Toc239344076"/>
       <w:bookmarkEnd w:id="14"/>
       <w:bookmarkEnd w:id="20"/>
       <w:r>
@@ -9681,7 +9684,7 @@
         <w:pStyle w:val="Heading3"/>
       </w:pPr>
       <w:bookmarkStart w:id="24" w:name="firebase--klien-aman-terekspos"/>
-      <w:bookmarkStart w:id="25" w:name="_Toc239342183"/>
+      <w:bookmarkStart w:id="25" w:name="_Toc239344077"/>
       <w:r>
         <w:t>Firebase — klien (aman terekspos)</w:t>
       </w:r>
@@ -9952,7 +9955,7 @@
         <w:pStyle w:val="Heading3"/>
       </w:pPr>
       <w:bookmarkStart w:id="26" w:name="firebase--server-rahasia"/>
-      <w:bookmarkStart w:id="27" w:name="_Toc239342184"/>
+      <w:bookmarkStart w:id="27" w:name="_Toc239344078"/>
       <w:bookmarkEnd w:id="24"/>
       <w:r>
         <w:t>Firebase — server (rahasia)</w:t>
@@ -10136,7 +10139,7 @@
         <w:pStyle w:val="Heading3"/>
       </w:pPr>
       <w:bookmarkStart w:id="28" w:name="aplikasi"/>
-      <w:bookmarkStart w:id="29" w:name="_Toc239342185"/>
+      <w:bookmarkStart w:id="29" w:name="_Toc239344079"/>
       <w:bookmarkEnd w:id="26"/>
       <w:r>
         <w:t>Aplikasi</w:t>
@@ -10284,7 +10287,7 @@
         <w:pStyle w:val="Heading3"/>
       </w:pPr>
       <w:bookmarkStart w:id="30" w:name="email-smtp"/>
-      <w:bookmarkStart w:id="31" w:name="_Toc239342186"/>
+      <w:bookmarkStart w:id="31" w:name="_Toc239344080"/>
       <w:bookmarkEnd w:id="28"/>
       <w:r>
         <w:t>Email (SMTP)</w:t>
@@ -10530,7 +10533,7 @@
         <w:pStyle w:val="Heading3"/>
       </w:pPr>
       <w:bookmarkStart w:id="32" w:name="midtrans"/>
-      <w:bookmarkStart w:id="33" w:name="_Toc239342187"/>
+      <w:bookmarkStart w:id="33" w:name="_Toc239344081"/>
       <w:bookmarkEnd w:id="30"/>
       <w:r>
         <w:t>Midtrans</w:t>
@@ -10741,7 +10744,7 @@
         <w:pStyle w:val="Heading3"/>
       </w:pPr>
       <w:bookmarkStart w:id="34" w:name="gemini-asisten-chat"/>
-      <w:bookmarkStart w:id="35" w:name="_Toc239342188"/>
+      <w:bookmarkStart w:id="35" w:name="_Toc239344082"/>
       <w:bookmarkEnd w:id="32"/>
       <w:r>
         <w:t>Gemini (asisten chat)</w:t>
@@ -10921,7 +10924,7 @@
         <w:pStyle w:val="Heading3"/>
       </w:pPr>
       <w:bookmarkStart w:id="36" w:name="lain-lain"/>
-      <w:bookmarkStart w:id="37" w:name="_Toc239342189"/>
+      <w:bookmarkStart w:id="37" w:name="_Toc239344083"/>
       <w:bookmarkEnd w:id="34"/>
       <w:r>
         <w:t>Lain-lain</w:t>
@@ -11077,7 +11080,7 @@
         <w:pStyle w:val="Heading2"/>
       </w:pPr>
       <w:bookmarkStart w:id="38" w:name="X9d2a6848b77c629c093533a4ceb04936283eb42"/>
-      <w:bookmarkStart w:id="39" w:name="_Toc239342190"/>
+      <w:bookmarkStart w:id="39" w:name="_Toc239344084"/>
       <w:bookmarkEnd w:id="22"/>
       <w:bookmarkEnd w:id="36"/>
       <w:r>
@@ -12025,7 +12028,7 @@
         <w:pStyle w:val="Heading2"/>
       </w:pPr>
       <w:bookmarkStart w:id="40" w:name="Xaa1ef153e5a010555aa408d1cae4cd3c344ef51"/>
-      <w:bookmarkStart w:id="41" w:name="_Toc239342191"/>
+      <w:bookmarkStart w:id="41" w:name="_Toc239344085"/>
       <w:bookmarkEnd w:id="38"/>
       <w:r>
         <w:t>7. Pola Arsitektur</w:t>
@@ -12037,7 +12040,7 @@
         <w:pStyle w:val="Heading3"/>
       </w:pPr>
       <w:bookmarkStart w:id="42" w:name="pemisahan-lapisan"/>
-      <w:bookmarkStart w:id="43" w:name="_Toc239342192"/>
+      <w:bookmarkStart w:id="43" w:name="_Toc239344086"/>
       <w:r>
         <w:t>Pemisahan lapisan</w:t>
       </w:r>
@@ -12223,7 +12226,7 @@
         <w:pStyle w:val="Heading3"/>
       </w:pPr>
       <w:bookmarkStart w:id="44" w:name="penjagaan-di-server-bukan-di-layar"/>
-      <w:bookmarkStart w:id="45" w:name="_Toc239342193"/>
+      <w:bookmarkStart w:id="45" w:name="_Toc239344087"/>
       <w:bookmarkEnd w:id="42"/>
       <w:r>
         <w:t>Penjagaan di server, bukan di layar</w:t>
@@ -12586,7 +12589,7 @@
         <w:pStyle w:val="Heading3"/>
       </w:pPr>
       <w:bookmarkStart w:id="46" w:name="gambar-luar-lewat-nextimage"/>
-      <w:bookmarkStart w:id="47" w:name="_Toc239342194"/>
+      <w:bookmarkStart w:id="47" w:name="_Toc239344088"/>
       <w:bookmarkEnd w:id="44"/>
       <w:r>
         <w:t xml:space="preserve">Gambar luar lewat </w:t>
@@ -13021,7 +13024,7 @@
         <w:pStyle w:val="Heading2"/>
       </w:pPr>
       <w:bookmarkStart w:id="48" w:name="X0858fc14a801816d8b2a092547a5c3e229dee42"/>
-      <w:bookmarkStart w:id="49" w:name="_Toc239342195"/>
+      <w:bookmarkStart w:id="49" w:name="_Toc239344089"/>
       <w:bookmarkEnd w:id="40"/>
       <w:bookmarkEnd w:id="46"/>
       <w:r>
@@ -13034,7 +13037,7 @@
         <w:pStyle w:val="Heading3"/>
       </w:pPr>
       <w:bookmarkStart w:id="50" w:name="firestore"/>
-      <w:bookmarkStart w:id="51" w:name="_Toc239342196"/>
+      <w:bookmarkStart w:id="51" w:name="_Toc239344090"/>
       <w:r>
         <w:t>Firestore</w:t>
       </w:r>
@@ -13611,7 +13614,7 @@
         <w:pStyle w:val="Heading3"/>
       </w:pPr>
       <w:bookmarkStart w:id="52" w:name="status-booking"/>
-      <w:bookmarkStart w:id="53" w:name="_Toc239342197"/>
+      <w:bookmarkStart w:id="53" w:name="_Toc239344091"/>
       <w:bookmarkEnd w:id="50"/>
       <w:r>
         <w:t>Status booking</w:t>
@@ -13970,7 +13973,7 @@
         <w:pStyle w:val="Heading3"/>
       </w:pPr>
       <w:bookmarkStart w:id="54" w:name="realtime-database"/>
-      <w:bookmarkStart w:id="55" w:name="_Toc239342198"/>
+      <w:bookmarkStart w:id="55" w:name="_Toc239344092"/>
       <w:bookmarkEnd w:id="52"/>
       <w:r>
         <w:t>Realtime Database</w:t>
@@ -14073,7 +14076,7 @@
         <w:pStyle w:val="Heading3"/>
       </w:pPr>
       <w:bookmarkStart w:id="56" w:name="peran-pengguna"/>
-      <w:bookmarkStart w:id="57" w:name="_Toc239342199"/>
+      <w:bookmarkStart w:id="57" w:name="_Toc239344093"/>
       <w:bookmarkEnd w:id="54"/>
       <w:r>
         <w:t>Peran pengguna</w:t>
@@ -14321,7 +14324,7 @@
         <w:pStyle w:val="Heading2"/>
       </w:pPr>
       <w:bookmarkStart w:id="58" w:name="X5c3a339ef7e8ff68c912d2577e3f11acae8270c"/>
-      <w:bookmarkStart w:id="59" w:name="_Toc239342200"/>
+      <w:bookmarkStart w:id="59" w:name="_Toc239344094"/>
       <w:bookmarkEnd w:id="48"/>
       <w:bookmarkEnd w:id="56"/>
       <w:r>
@@ -14334,7 +14337,7 @@
         <w:pStyle w:val="Heading3"/>
       </w:pPr>
       <w:bookmarkStart w:id="60" w:name="aturan-firestore"/>
-      <w:bookmarkStart w:id="61" w:name="_Toc239342201"/>
+      <w:bookmarkStart w:id="61" w:name="_Toc239344095"/>
       <w:r>
         <w:t>Aturan Firestore</w:t>
       </w:r>
@@ -14575,7 +14578,7 @@
         <w:pStyle w:val="Heading3"/>
       </w:pPr>
       <w:bookmarkStart w:id="62" w:name="aturan-realtime-database"/>
-      <w:bookmarkStart w:id="63" w:name="_Toc239342202"/>
+      <w:bookmarkStart w:id="63" w:name="_Toc239344096"/>
       <w:bookmarkEnd w:id="60"/>
       <w:r>
         <w:t>Aturan Realtime Database</w:t>
@@ -14715,7 +14718,7 @@
         <w:pStyle w:val="Heading3"/>
       </w:pPr>
       <w:bookmarkStart w:id="64" w:name="aturan-cloud-storage"/>
-      <w:bookmarkStart w:id="65" w:name="_Toc239342203"/>
+      <w:bookmarkStart w:id="65" w:name="_Toc239344097"/>
       <w:bookmarkEnd w:id="62"/>
       <w:r>
         <w:t>Aturan Cloud Storage</w:t>
@@ -15235,7 +15238,7 @@
         <w:pStyle w:val="Heading3"/>
       </w:pPr>
       <w:bookmarkStart w:id="66" w:name="pemeriksaan-di-route-api"/>
-      <w:bookmarkStart w:id="67" w:name="_Toc239342204"/>
+      <w:bookmarkStart w:id="67" w:name="_Toc239344098"/>
       <w:bookmarkEnd w:id="64"/>
       <w:r>
         <w:t>Pemeriksaan di route API</w:t>
@@ -15602,7 +15605,7 @@
         <w:pStyle w:val="Heading3"/>
       </w:pPr>
       <w:bookmarkStart w:id="68" w:name="pengelolaan-rahasia"/>
-      <w:bookmarkStart w:id="69" w:name="_Toc239342205"/>
+      <w:bookmarkStart w:id="69" w:name="_Toc239344099"/>
       <w:bookmarkEnd w:id="66"/>
       <w:r>
         <w:t>Pengelolaan rahasia</w:t>
@@ -15786,7 +15789,7 @@
         <w:pStyle w:val="Heading2"/>
       </w:pPr>
       <w:bookmarkStart w:id="70" w:name="X909a3c2f6a792c06a5ee1c46bec482d8a905f88"/>
-      <w:bookmarkStart w:id="71" w:name="_Toc239342206"/>
+      <w:bookmarkStart w:id="71" w:name="_Toc239344100"/>
       <w:bookmarkEnd w:id="58"/>
       <w:bookmarkEnd w:id="68"/>
       <w:r>
@@ -15835,7 +15838,7 @@
         <w:pStyle w:val="Heading3"/>
       </w:pPr>
       <w:bookmarkStart w:id="72" w:name="get-apibookings"/>
-      <w:bookmarkStart w:id="73" w:name="_Toc239342207"/>
+      <w:bookmarkStart w:id="73" w:name="_Toc239344101"/>
       <w:r>
         <w:rPr>
           <w:rStyle w:val="VerbatimChar"/>
@@ -16186,7 +16189,7 @@
         <w:pStyle w:val="Heading3"/>
       </w:pPr>
       <w:bookmarkStart w:id="74" w:name="post-apibookings"/>
-      <w:bookmarkStart w:id="75" w:name="_Toc239342208"/>
+      <w:bookmarkStart w:id="75" w:name="_Toc239344102"/>
       <w:bookmarkEnd w:id="72"/>
       <w:r>
         <w:rPr>
@@ -17363,7 +17366,7 @@
         <w:pStyle w:val="Heading3"/>
       </w:pPr>
       <w:bookmarkStart w:id="76" w:name="post-apiauthrequest-code"/>
-      <w:bookmarkStart w:id="77" w:name="_Toc239342209"/>
+      <w:bookmarkStart w:id="77" w:name="_Toc239344103"/>
       <w:bookmarkEnd w:id="74"/>
       <w:r>
         <w:rPr>
@@ -17495,7 +17498,7 @@
         <w:pStyle w:val="Heading3"/>
       </w:pPr>
       <w:bookmarkStart w:id="78" w:name="post-apiauthverify-code"/>
-      <w:bookmarkStart w:id="79" w:name="_Toc239342210"/>
+      <w:bookmarkStart w:id="79" w:name="_Toc239344104"/>
       <w:bookmarkEnd w:id="76"/>
       <w:r>
         <w:rPr>
@@ -17648,7 +17651,7 @@
         <w:pStyle w:val="Heading3"/>
       </w:pPr>
       <w:bookmarkStart w:id="80" w:name="post-apipaymentsmidtrans"/>
-      <w:bookmarkStart w:id="81" w:name="_Toc239342211"/>
+      <w:bookmarkStart w:id="81" w:name="_Toc239344105"/>
       <w:bookmarkEnd w:id="78"/>
       <w:r>
         <w:rPr>
@@ -17882,7 +17885,7 @@
         <w:pStyle w:val="Heading3"/>
       </w:pPr>
       <w:bookmarkStart w:id="82" w:name="post-apirole-request"/>
-      <w:bookmarkStart w:id="83" w:name="_Toc239342212"/>
+      <w:bookmarkStart w:id="83" w:name="_Toc239344106"/>
       <w:bookmarkEnd w:id="80"/>
       <w:r>
         <w:rPr>
@@ -18107,7 +18110,7 @@
         <w:pStyle w:val="Heading3"/>
       </w:pPr>
       <w:bookmarkStart w:id="84" w:name="post-apinotify-approval"/>
-      <w:bookmarkStart w:id="85" w:name="_Toc239342213"/>
+      <w:bookmarkStart w:id="85" w:name="_Toc239344107"/>
       <w:bookmarkEnd w:id="82"/>
       <w:r>
         <w:rPr>
@@ -18216,7 +18219,7 @@
         <w:pStyle w:val="Heading3"/>
       </w:pPr>
       <w:bookmarkStart w:id="86" w:name="delete-apidelete-user"/>
-      <w:bookmarkStart w:id="87" w:name="_Toc239342214"/>
+      <w:bookmarkStart w:id="87" w:name="_Toc239344108"/>
       <w:bookmarkEnd w:id="84"/>
       <w:r>
         <w:rPr>
@@ -18354,7 +18357,7 @@
         <w:pStyle w:val="Heading3"/>
       </w:pPr>
       <w:bookmarkStart w:id="88" w:name="post-apisend-verification"/>
-      <w:bookmarkStart w:id="89" w:name="_Toc239342215"/>
+      <w:bookmarkStart w:id="89" w:name="_Toc239344109"/>
       <w:bookmarkEnd w:id="86"/>
       <w:r>
         <w:rPr>
@@ -18457,7 +18460,7 @@
         <w:pStyle w:val="Heading3"/>
       </w:pPr>
       <w:bookmarkStart w:id="90" w:name="post-apichat"/>
-      <w:bookmarkStart w:id="91" w:name="_Toc239342216"/>
+      <w:bookmarkStart w:id="91" w:name="_Toc239344110"/>
       <w:bookmarkEnd w:id="88"/>
       <w:r>
         <w:rPr>
@@ -18632,7 +18635,7 @@
         <w:pStyle w:val="Heading2"/>
       </w:pPr>
       <w:bookmarkStart w:id="92" w:name="Xed0e0f21df81124cb09d88430a848afb4ea7196"/>
-      <w:bookmarkStart w:id="93" w:name="_Toc239342217"/>
+      <w:bookmarkStart w:id="93" w:name="_Toc239344111"/>
       <w:bookmarkEnd w:id="70"/>
       <w:bookmarkEnd w:id="90"/>
       <w:r>
@@ -18645,7 +18648,7 @@
         <w:pStyle w:val="Heading3"/>
       </w:pPr>
       <w:bookmarkStart w:id="94" w:name="urutan-lengkap"/>
-      <w:bookmarkStart w:id="95" w:name="_Toc239342218"/>
+      <w:bookmarkStart w:id="95" w:name="_Toc239344112"/>
       <w:r>
         <w:t>Urutan lengkap</w:t>
       </w:r>
@@ -18865,7 +18868,7 @@
         <w:pStyle w:val="Heading3"/>
       </w:pPr>
       <w:bookmarkStart w:id="96" w:name="jalur-cadangan-menarik-status-sendiri"/>
-      <w:bookmarkStart w:id="97" w:name="_Toc239342219"/>
+      <w:bookmarkStart w:id="97" w:name="_Toc239344113"/>
       <w:bookmarkEnd w:id="94"/>
       <w:r>
         <w:t>Jalur cadangan: menarik status sendiri</w:t>
@@ -19048,7 +19051,7 @@
         <w:pStyle w:val="Heading3"/>
       </w:pPr>
       <w:bookmarkStart w:id="98" w:name="keputusan-desain-yang-penting"/>
-      <w:bookmarkStart w:id="99" w:name="_Toc239342220"/>
+      <w:bookmarkStart w:id="99" w:name="_Toc239344114"/>
       <w:bookmarkEnd w:id="96"/>
       <w:r>
         <w:t>Keputusan desain yang penting</w:t>
@@ -19285,7 +19288,7 @@
         <w:pStyle w:val="Heading3"/>
       </w:pPr>
       <w:bookmarkStart w:id="100" w:name="menguji-webhook-dari-mesin-lokal"/>
-      <w:bookmarkStart w:id="101" w:name="_Toc239342221"/>
+      <w:bookmarkStart w:id="101" w:name="_Toc239344115"/>
       <w:bookmarkEnd w:id="98"/>
       <w:r>
         <w:t>Menguji webhook dari mesin lokal</w:t>
@@ -19364,7 +19367,7 @@
         <w:pStyle w:val="Heading3"/>
       </w:pPr>
       <w:bookmarkStart w:id="102" w:name="beralih-ke-produksi"/>
-      <w:bookmarkStart w:id="103" w:name="_Toc239342222"/>
+      <w:bookmarkStart w:id="103" w:name="_Toc239344116"/>
       <w:bookmarkEnd w:id="100"/>
       <w:r>
         <w:t>Beralih ke produksi</w:t>
@@ -19506,7 +19509,7 @@
         <w:pStyle w:val="Heading2"/>
       </w:pPr>
       <w:bookmarkStart w:id="104" w:name="Xed4c688a08a9d1e4c948c15619f232127bf1cf0"/>
-      <w:bookmarkStart w:id="105" w:name="_Toc239342223"/>
+      <w:bookmarkStart w:id="105" w:name="_Toc239344117"/>
       <w:bookmarkEnd w:id="92"/>
       <w:bookmarkEnd w:id="102"/>
       <w:r>
@@ -19907,7 +19910,7 @@
         <w:pStyle w:val="Heading2"/>
       </w:pPr>
       <w:bookmarkStart w:id="106" w:name="X02441ca0a2bcbefc85180bb3966ed29aa761758"/>
-      <w:bookmarkStart w:id="107" w:name="_Toc239342224"/>
+      <w:bookmarkStart w:id="107" w:name="_Toc239344118"/>
       <w:bookmarkEnd w:id="104"/>
       <w:r>
         <w:t>13. Tema dan Token Desain</w:t>
@@ -20125,7 +20128,7 @@
         <w:pStyle w:val="Heading2"/>
       </w:pPr>
       <w:bookmarkStart w:id="108" w:name="Xaebd2ad4f56a90a9b2e16acf5b0a875409ca2ba"/>
-      <w:bookmarkStart w:id="109" w:name="_Toc239342225"/>
+      <w:bookmarkStart w:id="109" w:name="_Toc239344119"/>
       <w:bookmarkEnd w:id="106"/>
       <w:r>
         <w:t>14. PWA dan Service Worker</w:t>
@@ -20281,7 +20284,7 @@
         <w:pStyle w:val="Heading2"/>
       </w:pPr>
       <w:bookmarkStart w:id="110" w:name="X0968aca45ebf85715c3c566f95824d47801b434"/>
-      <w:bookmarkStart w:id="111" w:name="_Toc239342226"/>
+      <w:bookmarkStart w:id="111" w:name="_Toc239344120"/>
       <w:bookmarkEnd w:id="108"/>
       <w:r>
         <w:t>15. Server Kamera dan Deteksi Karang</w:t>
@@ -20345,7 +20348,7 @@
         <w:pStyle w:val="Heading3"/>
       </w:pPr>
       <w:bookmarkStart w:id="112" w:name="menjalankan"/>
-      <w:bookmarkStart w:id="113" w:name="_Toc239342227"/>
+      <w:bookmarkStart w:id="113" w:name="_Toc239344121"/>
       <w:r>
         <w:t>Menjalankan</w:t>
       </w:r>
@@ -20519,7 +20522,7 @@
         <w:pStyle w:val="Heading3"/>
       </w:pPr>
       <w:bookmarkStart w:id="114" w:name="endpoint-per-kamera"/>
-      <w:bookmarkStart w:id="115" w:name="_Toc239342228"/>
+      <w:bookmarkStart w:id="115" w:name="_Toc239344122"/>
       <w:bookmarkEnd w:id="112"/>
       <w:r>
         <w:t>Endpoint per kamera</w:t>
@@ -20698,7 +20701,7 @@
         <w:pStyle w:val="Heading3"/>
       </w:pPr>
       <w:bookmarkStart w:id="116" w:name="menghubungkan-ke-website"/>
-      <w:bookmarkStart w:id="117" w:name="_Toc239342229"/>
+      <w:bookmarkStart w:id="117" w:name="_Toc239344123"/>
       <w:bookmarkEnd w:id="114"/>
       <w:r>
         <w:t>Menghubungkan ke website</w:t>
@@ -20794,7 +20797,7 @@
         <w:pStyle w:val="Heading3"/>
       </w:pPr>
       <w:bookmarkStart w:id="118" w:name="perilaku-deteksi"/>
-      <w:bookmarkStart w:id="119" w:name="_Toc239342230"/>
+      <w:bookmarkStart w:id="119" w:name="_Toc239344124"/>
       <w:bookmarkEnd w:id="116"/>
       <w:r>
         <w:t>Perilaku deteksi</w:t>
@@ -20859,7 +20862,7 @@
         <w:pStyle w:val="Heading3"/>
       </w:pPr>
       <w:bookmarkStart w:id="120" w:name="berkas-lain"/>
-      <w:bookmarkStart w:id="121" w:name="_Toc239342231"/>
+      <w:bookmarkStart w:id="121" w:name="_Toc239344125"/>
       <w:bookmarkEnd w:id="118"/>
       <w:r>
         <w:t>Berkas lain</w:t>
@@ -21035,7 +21038,7 @@
         <w:pStyle w:val="Heading2"/>
       </w:pPr>
       <w:bookmarkStart w:id="122" w:name="X0954ca9ee37eb4ee80d5cbab7cfa3851fa1ac64"/>
-      <w:bookmarkStart w:id="123" w:name="_Toc239342232"/>
+      <w:bookmarkStart w:id="123" w:name="_Toc239344126"/>
       <w:bookmarkEnd w:id="110"/>
       <w:bookmarkEnd w:id="120"/>
       <w:r>
@@ -21119,7 +21122,7 @@
         <w:pStyle w:val="Heading3"/>
       </w:pPr>
       <w:bookmarkStart w:id="124" w:name="sensor-dan-pin"/>
-      <w:bookmarkStart w:id="125" w:name="_Toc239342233"/>
+      <w:bookmarkStart w:id="125" w:name="_Toc239344127"/>
       <w:r>
         <w:t>Sensor dan pin</w:t>
       </w:r>
@@ -21436,7 +21439,7 @@
         <w:pStyle w:val="Heading3"/>
       </w:pPr>
       <w:bookmarkStart w:id="126" w:name="pustaka-arduino-yang-dibutuhkan"/>
-      <w:bookmarkStart w:id="127" w:name="_Toc239342234"/>
+      <w:bookmarkStart w:id="127" w:name="_Toc239344128"/>
       <w:bookmarkEnd w:id="124"/>
       <w:r>
         <w:t>Pustaka Arduino yang dibutuhkan</w:t>
@@ -21531,7 +21534,7 @@
         <w:pStyle w:val="Heading3"/>
       </w:pPr>
       <w:bookmarkStart w:id="128" w:name="konfigurasi-sebelum-flash"/>
-      <w:bookmarkStart w:id="129" w:name="_Toc239342235"/>
+      <w:bookmarkStart w:id="129" w:name="_Toc239344129"/>
       <w:bookmarkEnd w:id="126"/>
       <w:r>
         <w:t>Konfigurasi sebelum flash</w:t>
@@ -21771,7 +21774,7 @@
         <w:pStyle w:val="Heading3"/>
       </w:pPr>
       <w:bookmarkStart w:id="130" w:name="faktor-kalibrasi"/>
-      <w:bookmarkStart w:id="131" w:name="_Toc239342236"/>
+      <w:bookmarkStart w:id="131" w:name="_Toc239344130"/>
       <w:bookmarkEnd w:id="128"/>
       <w:r>
         <w:t>Faktor kalibrasi</w:t>
@@ -21942,7 +21945,7 @@
         <w:pStyle w:val="Heading3"/>
       </w:pPr>
       <w:bookmarkStart w:id="132" w:name="cara-flash"/>
-      <w:bookmarkStart w:id="133" w:name="_Toc239342237"/>
+      <w:bookmarkStart w:id="133" w:name="_Toc239344131"/>
       <w:bookmarkEnd w:id="130"/>
       <w:r>
         <w:t>Cara flash</w:t>
@@ -22036,7 +22039,7 @@
         <w:pStyle w:val="Heading3"/>
       </w:pPr>
       <w:bookmarkStart w:id="134" w:name="jalur-data"/>
-      <w:bookmarkStart w:id="135" w:name="_Toc239342238"/>
+      <w:bookmarkStart w:id="135" w:name="_Toc239344132"/>
       <w:bookmarkEnd w:id="132"/>
       <w:r>
         <w:t>Jalur data</w:t>
@@ -22092,7 +22095,7 @@
         <w:pStyle w:val="Heading2"/>
       </w:pPr>
       <w:bookmarkStart w:id="136" w:name="X6b1341800221b6a65e554b876a7748e027e7ac5"/>
-      <w:bookmarkStart w:id="137" w:name="_Toc239342239"/>
+      <w:bookmarkStart w:id="137" w:name="_Toc239344133"/>
       <w:bookmarkEnd w:id="122"/>
       <w:bookmarkEnd w:id="134"/>
       <w:r>
@@ -22105,7 +22108,7 @@
         <w:pStyle w:val="Heading3"/>
       </w:pPr>
       <w:bookmarkStart w:id="138" w:name="aplikasi-web-ke-vercel"/>
-      <w:bookmarkStart w:id="139" w:name="_Toc239342240"/>
+      <w:bookmarkStart w:id="139" w:name="_Toc239344134"/>
       <w:r>
         <w:t>Aplikasi web ke Vercel</w:t>
       </w:r>
@@ -22409,7 +22412,7 @@
         <w:pStyle w:val="Heading3"/>
       </w:pPr>
       <w:bookmarkStart w:id="140" w:name="security-rules-ke-firebase"/>
-      <w:bookmarkStart w:id="141" w:name="_Toc239342241"/>
+      <w:bookmarkStart w:id="141" w:name="_Toc239344135"/>
       <w:bookmarkEnd w:id="138"/>
       <w:r>
         <w:t>Security rules ke Firebase</w:t>
@@ -22542,7 +22545,7 @@
         <w:pStyle w:val="Heading3"/>
       </w:pPr>
       <w:bookmarkStart w:id="142" w:name="lokasi-bucket-cloud-storage"/>
-      <w:bookmarkStart w:id="143" w:name="_Toc239342242"/>
+      <w:bookmarkStart w:id="143" w:name="_Toc239344136"/>
       <w:bookmarkEnd w:id="140"/>
       <w:r>
         <w:t>Lokasi bucket Cloud Storage</w:t>
@@ -22590,7 +22593,7 @@
         <w:pStyle w:val="Heading3"/>
       </w:pPr>
       <w:bookmarkStart w:id="144" w:name="server-kamera"/>
-      <w:bookmarkStart w:id="145" w:name="_Toc239342243"/>
+      <w:bookmarkStart w:id="145" w:name="_Toc239344137"/>
       <w:bookmarkEnd w:id="142"/>
       <w:r>
         <w:t>Server kamera</w:t>
@@ -22620,7 +22623,7 @@
         <w:pStyle w:val="Heading3"/>
       </w:pPr>
       <w:bookmarkStart w:id="146" w:name="urutan-penerapan-yang-disarankan"/>
-      <w:bookmarkStart w:id="147" w:name="_Toc239342244"/>
+      <w:bookmarkStart w:id="147" w:name="_Toc239344138"/>
       <w:bookmarkEnd w:id="144"/>
       <w:r>
         <w:t>Urutan penerapan yang disarankan</w:t>
@@ -22707,7 +22710,7 @@
         <w:pStyle w:val="Heading2"/>
       </w:pPr>
       <w:bookmarkStart w:id="148" w:name="Xf33546d4c6eaed7b8047c678138d07a2e4896f5"/>
-      <w:bookmarkStart w:id="149" w:name="_Toc239342245"/>
+      <w:bookmarkStart w:id="149" w:name="_Toc239344139"/>
       <w:bookmarkEnd w:id="136"/>
       <w:bookmarkEnd w:id="146"/>
       <w:r>
@@ -22720,7 +22723,7 @@
         <w:pStyle w:val="Heading3"/>
       </w:pPr>
       <w:bookmarkStart w:id="150" w:name="uji-mandiri-logika-checkts"/>
-      <w:bookmarkStart w:id="151" w:name="_Toc239342246"/>
+      <w:bookmarkStart w:id="151" w:name="_Toc239344140"/>
       <w:r>
         <w:t>Uji mandiri logika (</w:t>
       </w:r>
@@ -23364,7 +23367,7 @@
         <w:pStyle w:val="Heading3"/>
       </w:pPr>
       <w:bookmarkStart w:id="152" w:name="probe-rules-dan-api"/>
-      <w:bookmarkStart w:id="153" w:name="_Toc239342247"/>
+      <w:bookmarkStart w:id="153" w:name="_Toc239344141"/>
       <w:bookmarkEnd w:id="150"/>
       <w:r>
         <w:t>Probe rules dan API</w:t>
@@ -23594,7 +23597,7 @@
         <w:pStyle w:val="Heading3"/>
       </w:pPr>
       <w:bookmarkStart w:id="154" w:name="uji-server-kamera"/>
-      <w:bookmarkStart w:id="155" w:name="_Toc239342248"/>
+      <w:bookmarkStart w:id="155" w:name="_Toc239344142"/>
       <w:bookmarkEnd w:id="152"/>
       <w:r>
         <w:t>Uji server kamera</w:t>
@@ -23670,7 +23673,7 @@
         <w:pStyle w:val="Heading3"/>
       </w:pPr>
       <w:bookmarkStart w:id="156" w:name="lint-dan-build"/>
-      <w:bookmarkStart w:id="157" w:name="_Toc239342249"/>
+      <w:bookmarkStart w:id="157" w:name="_Toc239344143"/>
       <w:bookmarkEnd w:id="154"/>
       <w:r>
         <w:t>Lint dan build</w:t>
@@ -23729,7 +23732,7 @@
         <w:pStyle w:val="Heading2"/>
       </w:pPr>
       <w:bookmarkStart w:id="158" w:name="X90e1e40397aac8978d03d5f3c166df2601f6ec5"/>
-      <w:bookmarkStart w:id="159" w:name="_Toc239342250"/>
+      <w:bookmarkStart w:id="159" w:name="_Toc239344144"/>
       <w:bookmarkEnd w:id="148"/>
       <w:bookmarkEnd w:id="156"/>
       <w:r>
@@ -23742,7 +23745,7 @@
         <w:pStyle w:val="Heading3"/>
       </w:pPr>
       <w:bookmarkStart w:id="160" w:name="kode-masuk-tidak-terkirim-di-produksi"/>
-      <w:bookmarkStart w:id="161" w:name="_Toc239342251"/>
+      <w:bookmarkStart w:id="161" w:name="_Toc239344145"/>
       <w:r>
         <w:t>Kode masuk tidak terkirim di produksi</w:t>
       </w:r>
@@ -23817,7 +23820,7 @@
         <w:pStyle w:val="Heading3"/>
       </w:pPr>
       <w:bookmarkStart w:id="162" w:name="X79c3035c29e0a771aa3ca92e7b98d68ce4daa73"/>
-      <w:bookmarkStart w:id="163" w:name="_Toc239342252"/>
+      <w:bookmarkStart w:id="163" w:name="_Toc239344146"/>
       <w:bookmarkEnd w:id="160"/>
       <w:r>
         <w:rPr>
@@ -23873,7 +23876,7 @@
         <w:pStyle w:val="Heading3"/>
       </w:pPr>
       <w:bookmarkStart w:id="164" w:name="Xdf03278431fcbe27527f1b49972574cc6bc0d1d"/>
-      <w:bookmarkStart w:id="165" w:name="_Toc239342253"/>
+      <w:bookmarkStart w:id="165" w:name="_Toc239344147"/>
       <w:bookmarkEnd w:id="162"/>
       <w:r>
         <w:t>Booking macet di "Belum Dibayar" padahal sudah dibayar</w:t>
@@ -24000,7 +24003,7 @@
         <w:pStyle w:val="Heading3"/>
       </w:pPr>
       <w:bookmarkStart w:id="166" w:name="kamera-tidak-tampil"/>
-      <w:bookmarkStart w:id="167" w:name="_Toc239342254"/>
+      <w:bookmarkStart w:id="167" w:name="_Toc239344148"/>
       <w:bookmarkEnd w:id="164"/>
       <w:r>
         <w:t>Kamera tidak tampil</w:t>
@@ -24104,7 +24107,7 @@
         <w:pStyle w:val="Heading3"/>
       </w:pPr>
       <w:bookmarkStart w:id="168" w:name="Xbc2d8ec0820bc45f28e1abd4c11c8326c3a15a9"/>
-      <w:bookmarkStart w:id="169" w:name="_Toc239342255"/>
+      <w:bookmarkStart w:id="169" w:name="_Toc239344149"/>
       <w:bookmarkEnd w:id="166"/>
       <w:r>
         <w:t>Sensor menampilkan "--" atau berlabel "Offline"</w:t>
@@ -24198,7 +24201,7 @@
         <w:pStyle w:val="Heading3"/>
       </w:pPr>
       <w:bookmarkStart w:id="170" w:name="scanner-qr-melempar-galat-di-ios"/>
-      <w:bookmarkStart w:id="171" w:name="_Toc239342256"/>
+      <w:bookmarkStart w:id="171" w:name="_Toc239344150"/>
       <w:bookmarkEnd w:id="168"/>
       <w:r>
         <w:t>Scanner QR melempar galat di iOS</w:t>
@@ -24282,7 +24285,7 @@
         <w:pStyle w:val="Heading3"/>
       </w:pPr>
       <w:bookmarkStart w:id="172" w:name="unggah-foto-destinasi-ditolak"/>
-      <w:bookmarkStart w:id="173" w:name="_Toc239342257"/>
+      <w:bookmarkStart w:id="173" w:name="_Toc239344151"/>
       <w:bookmarkEnd w:id="170"/>
       <w:r>
         <w:t>Unggah foto destinasi ditolak</w:t>
@@ -24636,7 +24639,7 @@
         <w:pStyle w:val="Heading3"/>
       </w:pPr>
       <w:bookmarkStart w:id="174" w:name="pemeliharaan-berkala"/>
-      <w:bookmarkStart w:id="175" w:name="_Toc239342258"/>
+      <w:bookmarkStart w:id="175" w:name="_Toc239344152"/>
       <w:bookmarkEnd w:id="172"/>
       <w:r>
         <w:t>Pemeliharaan berkala</w:t>
@@ -24891,7 +24894,7 @@
         <w:pStyle w:val="Heading2"/>
       </w:pPr>
       <w:bookmarkStart w:id="176" w:name="dokumen-terkait"/>
-      <w:bookmarkStart w:id="177" w:name="_Toc239342259"/>
+      <w:bookmarkStart w:id="177" w:name="_Toc239344153"/>
       <w:bookmarkEnd w:id="158"/>
       <w:bookmarkEnd w:id="174"/>
       <w:r>
@@ -25223,7 +25226,7 @@
   <w:abstractNum w:abstractNumId="0" w15:restartNumberingAfterBreak="0">
     <w:nsid w:val="0000A990"/>
     <w:multiLevelType w:val="multilevel"/>
-    <w:tmpl w:val="73587858"/>
+    <w:tmpl w:val="75E69644"/>
     <w:lvl w:ilvl="0">
       <w:numFmt w:val="bullet"/>
       <w:lvlText w:val=" "/>
@@ -25300,7 +25303,7 @@
   <w:abstractNum w:abstractNumId="1" w15:restartNumberingAfterBreak="0">
     <w:nsid w:val="0000A991"/>
     <w:multiLevelType w:val="multilevel"/>
-    <w:tmpl w:val="A9E8B306"/>
+    <w:tmpl w:val="4AB6A026"/>
     <w:lvl w:ilvl="0">
       <w:numFmt w:val="bullet"/>
       <w:lvlText w:val=""/>
@@ -25404,7 +25407,7 @@
   <w:abstractNum w:abstractNumId="2" w15:restartNumberingAfterBreak="0">
     <w:nsid w:val="0000A992"/>
     <w:multiLevelType w:val="multilevel"/>
-    <w:tmpl w:val="47643FA4"/>
+    <w:tmpl w:val="624EDB60"/>
     <w:lvl w:ilvl="0">
       <w:numFmt w:val="bullet"/>
       <w:lvlText w:val="☐"/>
@@ -25481,7 +25484,7 @@
   <w:abstractNum w:abstractNumId="3" w15:restartNumberingAfterBreak="0">
     <w:nsid w:val="00A99411"/>
     <w:multiLevelType w:val="multilevel"/>
-    <w:tmpl w:val="CBFAD804"/>
+    <w:tmpl w:val="E90874E8"/>
     <w:lvl w:ilvl="0">
       <w:start w:val="1"/>
       <w:numFmt w:val="decimal"/>
@@ -25564,22 +25567,22 @@
       </w:pPr>
     </w:lvl>
   </w:abstractNum>
-  <w:num w:numId="1" w16cid:durableId="2114395368">
+  <w:num w:numId="1" w16cid:durableId="1701277752">
     <w:abstractNumId w:val="0"/>
   </w:num>
-  <w:num w:numId="2" w16cid:durableId="1285961349">
+  <w:num w:numId="2" w16cid:durableId="1920864178">
     <w:abstractNumId w:val="1"/>
   </w:num>
-  <w:num w:numId="3" w16cid:durableId="454638230">
+  <w:num w:numId="3" w16cid:durableId="647713012">
     <w:abstractNumId w:val="1"/>
   </w:num>
-  <w:num w:numId="4" w16cid:durableId="1700088033">
+  <w:num w:numId="4" w16cid:durableId="1875339957">
     <w:abstractNumId w:val="1"/>
   </w:num>
-  <w:num w:numId="5" w16cid:durableId="831945948">
+  <w:num w:numId="5" w16cid:durableId="1192455702">
     <w:abstractNumId w:val="1"/>
   </w:num>
-  <w:num w:numId="6" w16cid:durableId="274949672">
+  <w:num w:numId="6" w16cid:durableId="469714488">
     <w:abstractNumId w:val="3"/>
     <w:lvlOverride w:ilvl="0">
       <w:startOverride w:val="1"/>
@@ -25609,19 +25612,19 @@
       <w:startOverride w:val="1"/>
     </w:lvlOverride>
   </w:num>
-  <w:num w:numId="7" w16cid:durableId="1627463821">
+  <w:num w:numId="7" w16cid:durableId="607734968">
     <w:abstractNumId w:val="1"/>
   </w:num>
-  <w:num w:numId="8" w16cid:durableId="1920482514">
+  <w:num w:numId="8" w16cid:durableId="1199395253">
     <w:abstractNumId w:val="1"/>
   </w:num>
-  <w:num w:numId="9" w16cid:durableId="1848592427">
+  <w:num w:numId="9" w16cid:durableId="367687735">
     <w:abstractNumId w:val="1"/>
   </w:num>
-  <w:num w:numId="10" w16cid:durableId="1559320082">
+  <w:num w:numId="10" w16cid:durableId="2099594540">
     <w:abstractNumId w:val="1"/>
   </w:num>
-  <w:num w:numId="11" w16cid:durableId="894386980">
+  <w:num w:numId="11" w16cid:durableId="1190950569">
     <w:abstractNumId w:val="3"/>
     <w:lvlOverride w:ilvl="0">
       <w:startOverride w:val="1"/>
@@ -25651,7 +25654,7 @@
       <w:startOverride w:val="1"/>
     </w:lvlOverride>
   </w:num>
-  <w:num w:numId="12" w16cid:durableId="169372414">
+  <w:num w:numId="12" w16cid:durableId="1349405751">
     <w:abstractNumId w:val="3"/>
     <w:lvlOverride w:ilvl="0">
       <w:startOverride w:val="1"/>
@@ -25681,13 +25684,13 @@
       <w:startOverride w:val="1"/>
     </w:lvlOverride>
   </w:num>
-  <w:num w:numId="13" w16cid:durableId="1160385282">
+  <w:num w:numId="13" w16cid:durableId="558173507">
     <w:abstractNumId w:val="1"/>
   </w:num>
-  <w:num w:numId="14" w16cid:durableId="583996403">
+  <w:num w:numId="14" w16cid:durableId="342247186">
     <w:abstractNumId w:val="1"/>
   </w:num>
-  <w:num w:numId="15" w16cid:durableId="1138688546">
+  <w:num w:numId="15" w16cid:durableId="158890157">
     <w:abstractNumId w:val="3"/>
     <w:lvlOverride w:ilvl="0">
       <w:startOverride w:val="1"/>
@@ -25717,7 +25720,7 @@
       <w:startOverride w:val="1"/>
     </w:lvlOverride>
   </w:num>
-  <w:num w:numId="16" w16cid:durableId="2111392592">
+  <w:num w:numId="16" w16cid:durableId="1167553725">
     <w:abstractNumId w:val="3"/>
     <w:lvlOverride w:ilvl="0">
       <w:startOverride w:val="1"/>
@@ -25747,7 +25750,7 @@
       <w:startOverride w:val="1"/>
     </w:lvlOverride>
   </w:num>
-  <w:num w:numId="17" w16cid:durableId="995454903">
+  <w:num w:numId="17" w16cid:durableId="1751344882">
     <w:abstractNumId w:val="3"/>
     <w:lvlOverride w:ilvl="0">
       <w:startOverride w:val="1"/>
@@ -25777,25 +25780,25 @@
       <w:startOverride w:val="1"/>
     </w:lvlOverride>
   </w:num>
-  <w:num w:numId="18" w16cid:durableId="1537111093">
+  <w:num w:numId="18" w16cid:durableId="309600977">
     <w:abstractNumId w:val="2"/>
   </w:num>
-  <w:num w:numId="19" w16cid:durableId="351421269">
+  <w:num w:numId="19" w16cid:durableId="1574195538">
     <w:abstractNumId w:val="2"/>
   </w:num>
-  <w:num w:numId="20" w16cid:durableId="1510556718">
+  <w:num w:numId="20" w16cid:durableId="508059784">
     <w:abstractNumId w:val="2"/>
   </w:num>
-  <w:num w:numId="21" w16cid:durableId="742795162">
+  <w:num w:numId="21" w16cid:durableId="1230963350">
     <w:abstractNumId w:val="2"/>
   </w:num>
-  <w:num w:numId="22" w16cid:durableId="1678263391">
+  <w:num w:numId="22" w16cid:durableId="412438310">
     <w:abstractNumId w:val="2"/>
   </w:num>
-  <w:num w:numId="23" w16cid:durableId="1316031675">
+  <w:num w:numId="23" w16cid:durableId="1798646741">
     <w:abstractNumId w:val="2"/>
   </w:num>
-  <w:num w:numId="24" w16cid:durableId="300426157">
+  <w:num w:numId="24" w16cid:durableId="696083031">
     <w:abstractNumId w:val="3"/>
     <w:lvlOverride w:ilvl="0">
       <w:startOverride w:val="1"/>
@@ -25825,7 +25828,7 @@
       <w:startOverride w:val="1"/>
     </w:lvlOverride>
   </w:num>
-  <w:num w:numId="25" w16cid:durableId="1269003533">
+  <w:num w:numId="25" w16cid:durableId="1822694307">
     <w:abstractNumId w:val="3"/>
     <w:lvlOverride w:ilvl="0">
       <w:startOverride w:val="1"/>
@@ -25855,7 +25858,7 @@
       <w:startOverride w:val="1"/>
     </w:lvlOverride>
   </w:num>
-  <w:num w:numId="26" w16cid:durableId="110050944">
+  <w:num w:numId="26" w16cid:durableId="1063215843">
     <w:abstractNumId w:val="3"/>
     <w:lvlOverride w:ilvl="0">
       <w:startOverride w:val="1"/>
@@ -25885,7 +25888,7 @@
       <w:startOverride w:val="1"/>
     </w:lvlOverride>
   </w:num>
-  <w:num w:numId="27" w16cid:durableId="1823303140">
+  <w:num w:numId="27" w16cid:durableId="1641301661">
     <w:abstractNumId w:val="3"/>
     <w:lvlOverride w:ilvl="0">
       <w:startOverride w:val="1"/>
@@ -25915,7 +25918,7 @@
       <w:startOverride w:val="1"/>
     </w:lvlOverride>
   </w:num>
-  <w:num w:numId="28" w16cid:durableId="1334260514">
+  <w:num w:numId="28" w16cid:durableId="142820301">
     <w:abstractNumId w:val="3"/>
     <w:lvlOverride w:ilvl="0">
       <w:startOverride w:val="1"/>
@@ -25945,7 +25948,7 @@
       <w:startOverride w:val="1"/>
     </w:lvlOverride>
   </w:num>
-  <w:num w:numId="29" w16cid:durableId="1058164931">
+  <w:num w:numId="29" w16cid:durableId="1382247063">
     <w:abstractNumId w:val="3"/>
     <w:lvlOverride w:ilvl="0">
       <w:startOverride w:val="1"/>
@@ -27204,7 +27207,7 @@
     <w:next w:val="Normal"/>
     <w:autoRedefine/>
     <w:uiPriority w:val="39"/>
-    <w:rsid w:val="00081F1F"/>
+    <w:rsid w:val="001A2F35"/>
     <w:pPr>
       <w:spacing w:after="100"/>
     </w:pPr>
@@ -27215,7 +27218,7 @@
     <w:next w:val="Normal"/>
     <w:autoRedefine/>
     <w:uiPriority w:val="39"/>
-    <w:rsid w:val="00081F1F"/>
+    <w:rsid w:val="001A2F35"/>
     <w:pPr>
       <w:spacing w:after="100"/>
       <w:ind w:left="240"/>
@@ -27227,7 +27230,7 @@
     <w:next w:val="Normal"/>
     <w:autoRedefine/>
     <w:uiPriority w:val="39"/>
-    <w:rsid w:val="00081F1F"/>
+    <w:rsid w:val="001A2F35"/>
     <w:pPr>
       <w:spacing w:after="100"/>
       <w:ind w:left="480"/>
@@ -27240,7 +27243,7 @@
     <w:autoRedefine/>
     <w:uiPriority w:val="39"/>
     <w:unhideWhenUsed/>
-    <w:rsid w:val="00081F1F"/>
+    <w:rsid w:val="001A2F35"/>
     <w:pPr>
       <w:spacing w:after="100" w:line="278" w:lineRule="auto"/>
       <w:ind w:left="720"/>
@@ -27258,7 +27261,7 @@
     <w:autoRedefine/>
     <w:uiPriority w:val="39"/>
     <w:unhideWhenUsed/>
-    <w:rsid w:val="00081F1F"/>
+    <w:rsid w:val="001A2F35"/>
     <w:pPr>
       <w:spacing w:after="100" w:line="278" w:lineRule="auto"/>
       <w:ind w:left="960"/>
@@ -27276,7 +27279,7 @@
     <w:autoRedefine/>
     <w:uiPriority w:val="39"/>
     <w:unhideWhenUsed/>
-    <w:rsid w:val="00081F1F"/>
+    <w:rsid w:val="001A2F35"/>
     <w:pPr>
       <w:spacing w:after="100" w:line="278" w:lineRule="auto"/>
       <w:ind w:left="1200"/>
@@ -27294,7 +27297,7 @@
     <w:autoRedefine/>
     <w:uiPriority w:val="39"/>
     <w:unhideWhenUsed/>
-    <w:rsid w:val="00081F1F"/>
+    <w:rsid w:val="001A2F35"/>
     <w:pPr>
       <w:spacing w:after="100" w:line="278" w:lineRule="auto"/>
       <w:ind w:left="1440"/>
@@ -27312,7 +27315,7 @@
     <w:autoRedefine/>
     <w:uiPriority w:val="39"/>
     <w:unhideWhenUsed/>
-    <w:rsid w:val="00081F1F"/>
+    <w:rsid w:val="001A2F35"/>
     <w:pPr>
       <w:spacing w:after="100" w:line="278" w:lineRule="auto"/>
       <w:ind w:left="1680"/>
@@ -27330,7 +27333,7 @@
     <w:autoRedefine/>
     <w:uiPriority w:val="39"/>
     <w:unhideWhenUsed/>
-    <w:rsid w:val="00081F1F"/>
+    <w:rsid w:val="001A2F35"/>
     <w:pPr>
       <w:spacing w:after="100" w:line="278" w:lineRule="auto"/>
       <w:ind w:left="1920"/>
@@ -27347,7 +27350,7 @@
     <w:uiPriority w:val="99"/>
     <w:semiHidden/>
     <w:unhideWhenUsed/>
-    <w:rsid w:val="00081F1F"/>
+    <w:rsid w:val="001A2F35"/>
     <w:rPr>
       <w:color w:val="605E5C"/>
       <w:shd w:val="clear" w:color="auto" w:fill="E1DFDD"/>

</xml_diff>